<commit_message>
Add final Kaggle run outputs; update report and README with final results
- results/, figures/, data/, app/ data files from Kaggle Version 7 (byte-checked)
- Remove stale prediction CSVs from an earlier run (B1 0.5109 vs final 0.5115)
- Report: class-weighted Transformers (RQ3 +25.4), RQ2 +8.4, seed-variance table,
  validation-vs-test selection discussion, GPU timing wording, corrected rounding
- README rewritten around the final results
</commit_message>
<xml_diff>
--- a/report/Kinyarwanda_News_Classification_Report.docx
+++ b/report/Kinyarwanda_News_Classification_Report.docx
@@ -53,7 +53,6 @@
           <w:b/>
           <w:bCs/>
           <w:highlight w:val="yellow"/>
-          <w:highlightCs w:val="yellow"/>
         </w:rPr>
         <w:t xml:space="preserve">[[TODO: course name / institution]]</w:t>
       </w:r>
@@ -170,7 +169,7 @@
       <w:tr>
         <w:trPr>
           <w:cantSplit/>
-          <w:tblHeader w:val="false"/>
+          <w:tblHeader w:val="off"/>
         </w:trPr>
         <w:tc>
           <w:tcPr>
@@ -228,7 +227,6 @@
                 <w:sz w:val="18"/>
                 <w:szCs w:val="18"/>
                 <w:highlight w:val="yellow"/>
-                <w:highlightCs w:val="yellow"/>
               </w:rPr>
               <w:t xml:space="preserve">[[TODO: GitHub repository URL]]</w:t>
             </w:r>
@@ -238,7 +236,7 @@
       <w:tr>
         <w:trPr>
           <w:cantSplit/>
-          <w:tblHeader w:val="false"/>
+          <w:tblHeader w:val="off"/>
         </w:trPr>
         <w:tc>
           <w:tcPr>
@@ -296,7 +294,6 @@
                 <w:sz w:val="18"/>
                 <w:szCs w:val="18"/>
                 <w:highlight w:val="yellow"/>
-                <w:highlightCs w:val="yellow"/>
               </w:rPr>
               <w:t xml:space="preserve">[[TODO: demo video URL]]</w:t>
             </w:r>
@@ -306,7 +303,7 @@
       <w:tr>
         <w:trPr>
           <w:cantSplit/>
-          <w:tblHeader w:val="false"/>
+          <w:tblHeader w:val="off"/>
         </w:trPr>
         <w:tc>
           <w:tcPr>
@@ -364,7 +361,6 @@
                 <w:sz w:val="18"/>
                 <w:szCs w:val="18"/>
                 <w:highlight w:val="yellow"/>
-                <w:highlightCs w:val="yellow"/>
               </w:rPr>
               <w:t xml:space="preserve">[[TODO: deployed web application URL]]</w:t>
             </w:r>
@@ -392,7 +388,7 @@
         <w:jc w:val="both"/>
       </w:pPr>
       <w:r>
-        <w:t xml:space="preserve">Kinyarwanda is spoken by an estimated 30 million people (Niyongabo et al., 2020) but remains poorly served by NLP resources (Joshi et al., 2020). This project builds and deploys a 14-class topic classifier for Kinyarwanda news using the KINNEWS corpus (Niyongabo et al., 2020). An audit of the corpus found that 55.2% of the training file consists of duplicated articles and that the official train and test splits have markedly different class distributions; the training set was therefore deduplicated (17,014 to 7,626 articles) before a stratified validation split was drawn, and the official test set was left untouched. Nine configurations were compared under identical splits: a majority-class floor, TF-IDF word n-grams with logistic regression (the baseline), TF-IDF character n-grams, a BiLSTM with random and with fastText initialisation, and fine-tuned XLM-R and AfroXLMR, plus two ablations. Using macro-F1 as the primary metric, the character n-gram model performed best (0.587 test macro-F1, 95% CI 0.571–0.603), beating the word baseline by 7.6 points with half the parameters. fastText initialisation improved the BiLSTM by 6.7 points, and African-centric adaptation (AfroXLMR) improved on XLM-R by 6.3 points, all significant under McNemar's test. Neither neural family surpassed the character n-gram model in this setting. Error analysis attributes most remaining errors to overlapping topics, very small training classes, and label noise in the corpus. The main conclusion is that, for a small and morphologically rich language corpus, representing sub-word structure matters more than model size.</w:t>
+        <w:t xml:space="preserve">Kinyarwanda is spoken by an estimated 30 million people (Niyongabo et al., 2020) but remains poorly served by NLP resources (Joshi et al., 2020). This project builds and deploys a 14-class topic classifier for Kinyarwanda news using the KINNEWS corpus. An audit found that 55.2% of the training file consists of duplicated articles and that the official train and test splits have markedly different class distributions; the training set was therefore deduplicated (17,014 to 7,626 articles) before a stratified validation split was drawn, and the official test set was left untouched. Nine configurations were compared under identical splits: a majority-class floor, TF-IDF word n-grams with logistic regression (the baseline), TF-IDF character n-grams, a BiLSTM with random and with fastText initialisation, fine-tuned XLM-R and AfroXLMR with a class-weighted loss, and two ablations; the neural models were also re-trained with three seeds. With macro-F1 as the primary metric, the character n-gram model had the best validation score and was selected (0.587 test macro-F1, 95% CI 0.571–0.603), beating the word baseline by 7.6 points with half the parameters. fastText initialisation improved the BiLSTM by 8.4 points, and African-centric adaptation improved on XLM-R by 25.4 points; both results held on all three seeds and were significant under McNemar's test. AfroXLMR reached the highest test score (0.614) despite a lower validation score, showing much greater robustness to the train/test shift. The main conclusions are that representing sub-word structure and pre-training exposure to the language matter more than model size, and that a validation set drawn from the training distribution can understate the value of a more robust model.</w:t>
       </w:r>
     </w:p>
     <w:p>
@@ -594,7 +590,7 @@
       <w:tr>
         <w:trPr>
           <w:cantSplit/>
-          <w:tblHeader w:val="false"/>
+          <w:tblHeader w:val="off"/>
         </w:trPr>
         <w:tc>
           <w:tcPr>
@@ -660,7 +656,7 @@
       <w:tr>
         <w:trPr>
           <w:cantSplit/>
-          <w:tblHeader w:val="false"/>
+          <w:tblHeader w:val="off"/>
         </w:trPr>
         <w:tc>
           <w:tcPr>
@@ -726,7 +722,7 @@
       <w:tr>
         <w:trPr>
           <w:cantSplit/>
-          <w:tblHeader w:val="false"/>
+          <w:tblHeader w:val="off"/>
         </w:trPr>
         <w:tc>
           <w:tcPr>
@@ -792,7 +788,7 @@
       <w:tr>
         <w:trPr>
           <w:cantSplit/>
-          <w:tblHeader w:val="false"/>
+          <w:tblHeader w:val="off"/>
         </w:trPr>
         <w:tc>
           <w:tcPr>
@@ -952,7 +948,7 @@
         <w:jc w:val="both"/>
       </w:pPr>
       <w:r>
-        <w:t xml:space="preserve">This project introduces no new dataset or architecture. Its contribution is a controlled comparison on KINNEWS of sparse word versus sparse character features, a recurrent model with and without subword embeddings, and a general versus an African-adapted Transformer, all on identical deduplicated splits, with confidence intervals, paired significance tests, a detailed error analysis and a deployed tool. It also documents two properties of the benchmark (a 55% duplicate rate and a strong train/test class shift) that change how any result on it should be read.</w:t>
+        <w:t xml:space="preserve">This project introduces no new dataset or architecture. Its contribution is a controlled comparison on KINNEWS of sparse word versus sparse character features, a recurrent model with and without subword embeddings, and a general versus an African-adapted Transformer, all on identical deduplicated splits, with confidence intervals, paired significance tests, seed variance, a detailed error analysis and a deployed tool. It also documents two properties of the benchmark (a 55% duplicate rate and a strong train/test class shift) that change how any result on it should be read.</w:t>
       </w:r>
     </w:p>
     <w:p>
@@ -977,7 +973,7 @@
         <w:jc w:val="both"/>
       </w:pPr>
       <w:r>
-        <w:t xml:space="preserve">KINNEWS (Niyongabo et al., 2020) contains Kinyarwanda news articles collected from fifteen news websites and five newspapers in Rwanda, released under the MIT licence. Each article has a headline, its content and the source URL. The raw version was used (title and full article text) rather than the pre-cleaned version, so that the Transformer models receive natural text and so that preprocessing is documented in this project. The loader in the notebook tries the Hugging Face dataset first; that route no longer works with current versions of the datasets library, so the corpus is read directly from the authors’ release archive, whose SHA-256 hash is recorded to pin the exact version. All published statistics were confirmed programmatically: 17,014 training and 4,254 test articles, 14 classes, and the six documented fields.</w:t>
+        <w:t xml:space="preserve">KINNEWS (Niyongabo et al., 2020) contains Kinyarwanda news articles collected from fifteen news websites and five newspapers in Rwanda, released under the MIT licence. Each article has a headline, its content and the source URL. The raw version was used rather than the pre-cleaned one, so that the Transformer models receive natural text and the preprocessing is documented in this project. The Hugging Face version of the dataset ships as a loading script that current versions of the datasets library no longer run, so the corpus is read directly from the authors’ release archive, whose SHA-256 hash is recorded to pin the exact version. All published statistics were confirmed programmatically: 17,014 training and 4,254 test articles, 14 classes, and the six documented fields.</w:t>
       </w:r>
     </w:p>
     <w:p>
@@ -993,7 +989,7 @@
         <w:t xml:space="preserve">How the categories were defined.</w:t>
       </w:r>
       <w:r>
-        <w:t xml:space="preserve"> According to Niyongabo et al. (2020), the publishers had originally filed the articles under 48 different categories. Because many were closely related, the dataset’s annotators merged them into 14 topics: politics, sport, economy, health, entertainment, history, technology, tourism, culture, fashion, religion, environment, education and relationship. Two annotators, both linguistics graduates and native speakers, then reviewed each article and assigned it one of these topics based on its title and content; articles they were unsure about were given a neutral label and removed. Each topic has a numeric label (1–14), an English label and a Kinyarwanda label. This project uses these labels as published; Section 3.2 shows that, despite this process, the released training file still contains conflicting labels for identical articles.</w:t>
+        <w:t xml:space="preserve"> According to Niyongabo et al. (2020), the publishers had originally filed the articles under 48 different categories. Because many were closely related, the dataset’s annotators merged them into 14 topics: politics, sport, economy, health, entertainment, history, technology, tourism, culture, fashion, religion, environment, education and relationship. Two annotators, both linguistics graduates and native speakers, then reviewed each article and assigned it one of these topics based on its title and content; articles they were unsure about were given a neutral label and removed. Each topic has a numeric label (1–14), an English label and a Kinyarwanda label. This project uses these labels as published; Section 3.2 shows that the released training file nevertheless contains conflicting labels for identical articles.</w:t>
       </w:r>
     </w:p>
     <w:p>
@@ -1095,6 +1091,7 @@
     </w:p>
     <w:p>
       <w:pPr>
+        <w:keepNext/>
         <w:spacing w:before="120"/>
         <w:jc w:val="center"/>
       </w:pPr>
@@ -1103,7 +1100,7 @@
           <wp:inline distT="0" distB="0" distL="0" distR="0">
             <wp:extent cx="5124450" cy="2990850"/>
             <wp:effectExtent t="0" r="0" b="0" l="0"/>
-            <wp:docPr id="1" name="cell033_2.png" descr="Figure 1. How much more common each topic is in the test set than in the deduplicated training set (log scale). Red bars differ from equal representation by more than a factor of two." title="Figure 1. How much more common each topic is in the test set"/>
+            <wp:docPr id="1" name="02_train_test_distribution_shift.png" descr="Figure 1. How much more common each topic is in the test set than in the deduplicated training set (log scale). Red bars differ from equal representation by more than a factor of two." title="Figure 1. How much more common each topic is in the test set"/>
             <wp:cNvGraphicFramePr>
               <a:graphicFrameLocks xmlns:a="http://schemas.openxmlformats.org/drawingml/2006/main" noChangeAspect="1"/>
             </wp:cNvGraphicFramePr>
@@ -1146,8 +1143,6 @@
       </w:pPr>
       <w:r>
         <w:rPr>
-          <w:i w:val="false"/>
-          <w:iCs w:val="false"/>
           <w:sz w:val="18"/>
           <w:szCs w:val="18"/>
         </w:rPr>
@@ -1168,7 +1163,7 @@
         <w:jc w:val="both"/>
       </w:pPr>
       <w:r>
-        <w:t xml:space="preserve">Articles are long: the median training article has 292 words, and 716 XLM-R subword tokens (Figure 2). 94.9% of articles exceed 256 subword tokens and 74.5% exceed 512, so any Transformer with a 512-token limit never sees the end of three-quarters of the corpus. Vocabulary is highly sparse: the corpus contains 231,516 distinct word types in 2.38 million tokens, and </w:t>
+        <w:t xml:space="preserve">Articles are long: the median training article has 292 words and 716 XLM-R subword tokens (Figure 2). 94.9% of articles exceed 256 subword tokens and 74.5% exceed 512, so a Transformer with a 512-token limit never sees the end of three-quarters of the corpus. Vocabulary is highly sparse: the corpus contains 231,516 distinct word types in 2.38 million tokens, and </w:t>
       </w:r>
       <w:r>
         <w:rPr>
@@ -1178,11 +1173,12 @@
         <w:t xml:space="preserve">61.6% of word types occur exactly once</w:t>
       </w:r>
       <w:r>
-        <w:t xml:space="preserve">. Both the XLM-R and AfroXLMR tokenizers split Kinyarwanda into 2.47 subword tokens per word on average, and produce identical output.</w:t>
-      </w:r>
-    </w:p>
-    <w:p>
-      <w:pPr>
+        <w:t xml:space="preserve">. The XLM-R and AfroXLMR tokenizers both split Kinyarwanda into 2.47 subword tokens per word on average, and produce identical output.</w:t>
+      </w:r>
+    </w:p>
+    <w:p>
+      <w:pPr>
+        <w:keepNext/>
         <w:spacing w:before="120"/>
         <w:jc w:val="center"/>
       </w:pPr>
@@ -1191,7 +1187,7 @@
           <wp:inline distT="0" distB="0" distL="0" distR="0">
             <wp:extent cx="5667375" cy="2286000"/>
             <wp:effectExtent t="0" r="0" b="0" l="0"/>
-            <wp:docPr id="1" name="cell035_3.png" descr="Figure 2. Article length in words (left) and in XLM-R subword tokens (right). Dashed lines mark the 256 and 512 token limits used by the Transformer models." title="Figure 2. Article length in words (left) and in XLM-R subwor"/>
+            <wp:docPr id="2" name="03_length_distributions.png" descr="Figure 2. Article length in words (left) and in XLM-R subword tokens (right). Dashed lines mark the 256 and 512 token limits used by the Transformer models." title="Figure 2. Article length in words (left) and in XLM-R subwor"/>
             <wp:cNvGraphicFramePr>
               <a:graphicFrameLocks xmlns:a="http://schemas.openxmlformats.org/drawingml/2006/main" noChangeAspect="1"/>
             </wp:cNvGraphicFramePr>
@@ -1234,8 +1230,6 @@
       </w:pPr>
       <w:r>
         <w:rPr>
-          <w:i w:val="false"/>
-          <w:iCs w:val="false"/>
           <w:sz w:val="18"/>
           <w:szCs w:val="18"/>
         </w:rPr>
@@ -1256,7 +1250,7 @@
         <w:jc w:val="both"/>
       </w:pPr>
       <w:r>
-        <w:t xml:space="preserve">Exact duplicates (after Unicode normalisation) were removed from the training file, keeping the first occurrence, which reduced it from 17,014 to 7,626 articles. This also reduced the class imbalance ratio (largest to smallest class) from 117.5 to 53.2, because duplicates were concentrated in the largest classes. A stratified 10% validation split was then drawn with a fixed seed (42). The official test split was used as published. Split indices are saved to data/splits.json, and the notebook asserts that no article text is shared across the three splits.</w:t>
+        <w:t xml:space="preserve">Exact duplicates (after Unicode normalisation) were removed from the training file, keeping the first occurrence, which reduced it from 17,014 to 7,626 articles and the class imbalance ratio from 117.5 to 53.2. A stratified 10% validation split was then drawn with a fixed seed (42); the official test split was used as published. Split indices are saved to data/splits.json, and the notebook asserts that no article text is shared across the three splits.</w:t>
       </w:r>
     </w:p>
     <w:p>
@@ -1400,7 +1394,7 @@
       <w:tr>
         <w:trPr>
           <w:cantSplit/>
-          <w:tblHeader w:val="false"/>
+          <w:tblHeader w:val="off"/>
         </w:trPr>
         <w:tc>
           <w:tcPr>
@@ -1496,7 +1490,7 @@
       <w:tr>
         <w:trPr>
           <w:cantSplit/>
-          <w:tblHeader w:val="false"/>
+          <w:tblHeader w:val="off"/>
         </w:trPr>
         <w:tc>
           <w:tcPr>
@@ -1592,7 +1586,7 @@
       <w:tr>
         <w:trPr>
           <w:cantSplit/>
-          <w:tblHeader w:val="false"/>
+          <w:tblHeader w:val="off"/>
         </w:trPr>
         <w:tc>
           <w:tcPr>
@@ -1698,7 +1692,7 @@
         <w:jc w:val="both"/>
       </w:pPr>
       <w:r>
-        <w:t xml:space="preserve">The smallest classes are very small after deduplication: tourism has 31 training articles, environment and fashion 34 each, and culture 69, while the test set contains 150–200 articles of each. Class weighting is therefore essential rather than optional.</w:t>
+        <w:t xml:space="preserve">The smallest classes are very small after deduplication: tourism has 31 training articles (3 in validation), environment and fashion 34 each, and culture 69, while the test set contains 150–200 articles of each. Class weighting is therefore essential rather than optional.</w:t>
       </w:r>
     </w:p>
     <w:p>
@@ -1735,14 +1729,14 @@
         <w:t xml:space="preserve">Classical and BiLSTM models:</w:t>
       </w:r>
       <w:r>
-        <w:t xml:space="preserve"> Unicode NFC normalisation, lower-casing, replacement of URLs, e-mail addresses and numbers with placeholder tokens, removal of punctuation except apostrophes (which carry meaning in Kinyarwanda contractions such as </w:t>
+        <w:t xml:space="preserve"> Unicode NFC normalisation, lower-casing, replacement of URLs, e-mail addresses and numbers with placeholder tokens, removal of punctuation except apostrophes (which mark elision in Kinyarwanda, as in </w:t>
       </w:r>
       <w:r>
         <w:rPr>
           <w:i/>
           <w:iCs/>
         </w:rPr>
-        <w:t xml:space="preserve">n’abandi</w:t>
+        <w:t xml:space="preserve">n’ibindi</w:t>
       </w:r>
       <w:r>
         <w:t xml:space="preserve">), and whitespace normalisation.</w:t>
@@ -1791,7 +1785,7 @@
         <w:jc w:val="both"/>
       </w:pPr>
       <w:r>
-        <w:t xml:space="preserve">All models were trained on the same deduplicated training split, tuned only on the validation split, and evaluated once on the test split. Class imbalance was handled with balanced class weights for the linear models and a class-weighted cross-entropy loss for the BiLSTM. The complete implementation is a single notebook that can be run end to end on Kaggle or Google Colab with one GPU.</w:t>
+        <w:t xml:space="preserve">All models were trained on the same deduplicated training split, tuned only on the validation split, and evaluated once on the test split. Class imbalance was handled the same way for every trained model: balanced class weights (n / (K · n_k)) in the loss. The implementation is a single notebook that runs end to end on Kaggle or Google Colab with one GPU.</w:t>
       </w:r>
     </w:p>
     <w:p>
@@ -1839,7 +1833,7 @@
         <w:t xml:space="preserve">B1 – TF-IDF word n-grams + logistic regression (the baseline).</w:t>
       </w:r>
       <w:r>
-        <w:t xml:space="preserve"> Word unigrams and bigrams (minimum document frequency 2, up to 200,000 features, sublinear term frequency), fed to a multinomial logistic regression with balanced class weights. The regularisation strength C was selected from {0.1, 1, 10} on validation (C = 1). This is the standard strong baseline for topic classification.</w:t>
+        <w:t xml:space="preserve"> Word unigrams and bigrams (minimum document frequency 2, up to 200,000 features, sublinear term frequency) fed to a multinomial logistic regression with balanced class weights. The regularisation strength C was selected from {0.1, 1, 10} on validation (C = 1). This is the standard strong baseline for topic classification.</w:t>
       </w:r>
     </w:p>
     <w:p>
@@ -1887,7 +1881,7 @@
         <w:t xml:space="preserve">E2a / E2b – BiLSTM (RQ2).</w:t>
       </w:r>
       <w:r>
-        <w:t xml:space="preserve"> A bidirectional LSTM written from scratch in PyTorch: 300-dimensional word embeddings, one layer of 128 hidden units per direction, masked mean pooling over the non-padding positions, dropout 0.3 and a linear layer to 14 classes. Inputs are truncated to 400 words; the vocabulary (72,309 types, minimum frequency 2) is built on the training split only. Training uses Adam (Kingma &amp; Ba, 2015; learning rate 0.001), batch size 64, gradient clipping at 1.0, class-weighted cross-entropy, and early stopping on validation macro-F1 (patience 3, up to 15 epochs). E2a initialises the embeddings randomly. E2b initialises them from fastText skip-gram vectors (300 dimensions, character n-grams of length 3–6, window 5, 10 epochs) trained on the training split only; all 72,307 vocabulary words receive a pretrained vector. Everything else is identical.</w:t>
+        <w:t xml:space="preserve"> A bidirectional LSTM written from scratch in PyTorch: 300-dimensional word embeddings, one layer of 128 hidden units per direction, masked mean pooling over the non-padding positions, dropout 0.3 and a linear layer to 14 classes. Inputs are truncated to 400 words; the vocabulary (72,309 types, minimum frequency 2) is built on the training split only. Training uses Adam (Kingma &amp; Ba, 2015; learning rate 0.001), batch size 64, gradient clipping at 1.0, class-weighted cross-entropy, and early stopping on validation macro-F1 (patience 3, up to 15 epochs). E2a initialises the embeddings randomly. E2b initialises them from fastText skip-gram vectors (300 dimensions, character n-grams of length 3–6, window 5, 10 epochs) trained on the training split only, on a single thread so the vectors are reproducible.</w:t>
       </w:r>
     </w:p>
     <w:p>
@@ -1907,7 +1901,7 @@
         <w:t xml:space="preserve">E3 / E4 – fine-tuned Transformers (RQ3).</w:t>
       </w:r>
       <w:r>
-        <w:t xml:space="preserve"> xlm-roberta-base (E3) and Davlan/afro-xlmr-base (E4), each with the standard sequence-classification head on the first-token representation, fully fine-tuned (278 million parameters) with AdamW (Loshchilov &amp; Hutter, 2019), learning rate 2e-5, linear schedule with 10% warm-up, weight decay 0.01, batch size 16, 3 epochs, mixed precision, and a maximum length of 512 tokens. The checkpoint with the best validation macro-F1 is kept. The two runs differ only in the pretrained weights, since the tokenizers are identical.</w:t>
+        <w:t xml:space="preserve"> xlm-roberta-base (E3) and Davlan/afro-xlmr-base (E4), each with the standard sequence-classification head on the first-token representation, fully fine-tuned (278 million parameters) with AdamW (Loshchilov &amp; Hutter, 2019), learning rate 2e-5, linear schedule with 10% warm-up, weight decay 0.01, batch size 16 on one GPU, 3 epochs, mixed precision, and a maximum length of 512 tokens. A custom trainer replaces the default loss with class-weighted cross-entropy using the same weights as the other models. The checkpoint with the best validation macro-F1 is kept. The two runs differ only in the pretrained weights, since the tokenizers are identical.</w:t>
       </w:r>
     </w:p>
     <w:p>
@@ -1915,7 +1909,7 @@
         <w:pStyle w:val="Heading2"/>
       </w:pPr>
       <w:r>
-        <w:t xml:space="preserve">4.3 Ablations</w:t>
+        <w:t xml:space="preserve">4.3 Ablations and seed variance</w:t>
       </w:r>
     </w:p>
     <w:p>
@@ -1924,7 +1918,7 @@
         <w:jc w:val="both"/>
       </w:pPr>
       <w:r>
-        <w:t xml:space="preserve">Both ablations modify the stronger Transformer (E4) so that a single factor changes:</w:t>
+        <w:t xml:space="preserve">Both ablations modify the stronger Transformer (E4, chosen on validation) so that a single factor changes:</w:t>
       </w:r>
     </w:p>
     <w:p>
@@ -1969,14 +1963,6 @@
     </w:p>
     <w:p>
       <w:pPr>
-        <w:pStyle w:val="Heading2"/>
-      </w:pPr>
-      <w:r>
-        <w:t xml:space="preserve">4.4 Evaluation protocol</w:t>
-      </w:r>
-    </w:p>
-    <w:p>
-      <w:pPr>
         <w:spacing w:after="120" w:line="276"/>
         <w:jc w:val="both"/>
       </w:pPr>
@@ -1985,10 +1971,10 @@
           <w:b/>
           <w:bCs/>
         </w:rPr>
-        <w:t xml:space="preserve">Macro-F1</w:t>
-      </w:r>
-      <w:r>
-        <w:t xml:space="preserve"> is the primary metric: it averages F1 over the 14 classes, so every topic counts equally regardless of size. This matters here because accuracy rewards predicting the large classes; B0 reaches 10.4% accuracy on test but only 1.3% macro-F1. Accuracy, weighted F1, and per-class precision, recall and F1 are also reported. Uncertainty on the test score is estimated with a 95% bootstrap confidence interval over 1,000 resamples of the test set (Efron &amp; Tibshirani, 1993). Pairs of models are compared with McNemar’s test on their paired correct/incorrect predictions (McNemar, 1947), using the continuity-corrected chi-squared form (exact binomial when fewer than 25 predictions disagree). The final model was selected on validation macro-F1, never on test.</w:t>
+        <w:t xml:space="preserve">Seed variance.</w:t>
+      </w:r>
+      <w:r>
+        <w:t xml:space="preserve"> E2a, E2b, E3 and E4 were re-trained with seeds 43 and 44 in addition to 42, and their test macro-F1 is reported as mean ± standard deviation. The fastText vectors are trained once and reused, so for E2b the seeds vary only the BiLSTM. The linear models are deterministic given the data and were not re-seeded.</w:t>
       </w:r>
     </w:p>
     <w:p>
@@ -1996,7 +1982,7 @@
         <w:pStyle w:val="Heading2"/>
       </w:pPr>
       <w:r>
-        <w:t xml:space="preserve">4.5 Implementation and resources</w:t>
+        <w:t xml:space="preserve">4.4 Evaluation protocol</w:t>
       </w:r>
     </w:p>
     <w:p>
@@ -2005,7 +1991,29 @@
         <w:jc w:val="both"/>
       </w:pPr>
       <w:r>
-        <w:t xml:space="preserve">The project is implemented in Python with scikit-learn (Pedregosa et al., 2011), PyTorch (Paszke et al., 2019), gensim (Řehůřek &amp; Sojka, 2010) and Hugging Face Transformers (Wolf et al., 2020); the app uses Gradio (Abid et al., 2019). Library versions are pinned in requirements.txt. All reported results come from one complete run on a Kaggle notebook with a single NVIDIA T4 GPU (about 50 minutes end to end). Every experiment writes a JSON result file and a per-article prediction file, and every table and finding in the notebook is generated from those files rather than typed by hand.</w:t>
+        <w:rPr>
+          <w:b/>
+          <w:bCs/>
+        </w:rPr>
+        <w:t xml:space="preserve">Macro-F1</w:t>
+      </w:r>
+      <w:r>
+        <w:t xml:space="preserve"> is the primary metric: it averages F1 over the 14 classes, so every topic counts equally regardless of size. Accuracy rewards predicting the large classes: B0 reaches 10.4% accuracy on test but only 1.3% macro-F1. Accuracy, weighted F1 and per-class precision, recall and F1 are also reported. Uncertainty on the test score is estimated with a 95% bootstrap confidence interval over 1,000 resamples of the test set (Efron &amp; Tibshirani, 1993). Pairs of models are compared with McNemar’s test on their paired correct/incorrect predictions (McNemar, 1947), using the continuity-corrected chi-squared form (exact binomial when fewer than 25 predictions disagree). </w:t>
+      </w:r>
+      <w:r>
+        <w:rPr>
+          <w:b/>
+          <w:bCs/>
+        </w:rPr>
+        <w:t xml:space="preserve">The final model was selected on validation macro-F1, never on test.</w:t>
+      </w:r>
+    </w:p>
+    <w:p>
+      <w:pPr>
+        <w:pStyle w:val="Heading2"/>
+      </w:pPr>
+      <w:r>
+        <w:t xml:space="preserve">4.5 Implementation and resources</w:t>
       </w:r>
     </w:p>
     <w:p>
@@ -2014,6 +2022,15 @@
         <w:jc w:val="both"/>
       </w:pPr>
       <w:r>
+        <w:t xml:space="preserve">The project is implemented in Python with scikit-learn (Pedregosa et al., 2011), PyTorch (Paszke et al., 2019), gensim (Řehůřek &amp; Sojka, 2010) and Hugging Face Transformers (Wolf et al., 2020); the app uses Gradio (Abid et al., 2019). Library versions are pinned in requirements.txt. All reported results come from one complete run on a Kaggle notebook with a single NVIDIA T4 GPU (1 hour 42 minutes, including the seed-variance runs). Every experiment writes a JSON result file and a per-article prediction file, and every table and finding in the notebook is generated from those files rather than typed by hand.</w:t>
+      </w:r>
+    </w:p>
+    <w:p>
+      <w:pPr>
+        <w:spacing w:after="120" w:line="276"/>
+        <w:jc w:val="both"/>
+      </w:pPr>
+      <w:r>
         <w:rPr>
           <w:b/>
           <w:bCs/>
@@ -2021,14 +2038,13 @@
         <w:t xml:space="preserve">Existing resources versus own work.</w:t>
       </w:r>
       <w:r>
-        <w:t xml:space="preserve"> The dataset (KINNEWS), the pretrained checkpoints (xlm-roberta-base, Davlan/afro-xlmr-base) and the libraries above are existing resources. The data audit and deduplication, preprocessing, the BiLSTM architecture and training loop, the fastText training, the fine-tuning and evaluation code, the significance testing, the error analysis and the web application were implemented for this project. </w:t>
+        <w:t xml:space="preserve"> The dataset (KINNEWS), the pretrained checkpoints (xlm-roberta-base, Davlan/afro-xlmr-base) and the libraries above are existing resources. The data audit and deduplication, preprocessing, the BiLSTM architecture and training loop, the fastText training, the class-weighted fine-tuning, the evaluation and significance testing, the seed-variance study, the error analysis and the web application were implemented for this project. </w:t>
       </w:r>
       <w:r>
         <w:rPr>
           <w:b/>
           <w:bCs/>
           <w:highlight w:val="yellow"/>
-          <w:highlightCs w:val="yellow"/>
         </w:rPr>
         <w:t xml:space="preserve">[[TODO: state your use of AI assistance here if your course requires it]]</w:t>
       </w:r>
@@ -2047,7 +2063,7 @@
         <w:jc w:val="both"/>
       </w:pPr>
       <w:r>
-        <w:t xml:space="preserve">Table 2 lists every configuration, sorted by validation macro-F1, which is the criterion used to select the final model.</w:t>
+        <w:t xml:space="preserve">Table 2 lists every configuration, sorted by validation macro-F1, the criterion used to select the final model.</w:t>
       </w:r>
     </w:p>
     <w:p>
@@ -2063,7 +2079,7 @@
           <w:sz w:val="18"/>
           <w:szCs w:val="18"/>
         </w:rPr>
-        <w:t xml:space="preserve">Table 2. All experiments (Kaggle run, single seed). The selected model is highlighted. CI: 95% bootstrap confidence interval.</w:t>
+        <w:t xml:space="preserve">Table 2. All experiments (seed 42). The selected model (best validation macro-F1) is highlighted. CI: 95% bootstrap confidence interval.</w:t>
       </w:r>
     </w:p>
     <w:tbl>
@@ -2361,7 +2377,7 @@
       <w:tr>
         <w:trPr>
           <w:cantSplit/>
-          <w:tblHeader w:val="false"/>
+          <w:tblHeader w:val="off"/>
         </w:trPr>
         <w:tc>
           <w:tcPr>
@@ -2483,7 +2499,7 @@
                 <w:sz w:val="18"/>
                 <w:szCs w:val="18"/>
               </w:rPr>
-              <w:t xml:space="preserve">0.700</w:t>
+              <w:t xml:space="preserve">0.699</w:t>
             </w:r>
           </w:p>
         </w:tc>
@@ -2615,7 +2631,7 @@
       <w:tr>
         <w:trPr>
           <w:cantSplit/>
-          <w:tblHeader w:val="false"/>
+          <w:tblHeader w:val="off"/>
         </w:trPr>
         <w:tc>
           <w:tcPr>
@@ -2733,7 +2749,7 @@
                 <w:sz w:val="18"/>
                 <w:szCs w:val="18"/>
               </w:rPr>
-              <w:t xml:space="preserve">0.664</w:t>
+              <w:t xml:space="preserve">0.671</w:t>
             </w:r>
           </w:p>
         </w:tc>
@@ -2763,7 +2779,7 @@
                 <w:sz w:val="18"/>
                 <w:szCs w:val="18"/>
               </w:rPr>
-              <w:t xml:space="preserve">0.509</w:t>
+              <w:t xml:space="preserve">0.526</w:t>
             </w:r>
           </w:p>
         </w:tc>
@@ -2793,7 +2809,7 @@
                 <w:sz w:val="18"/>
                 <w:szCs w:val="18"/>
               </w:rPr>
-              <w:t xml:space="preserve">0.492–0.525</w:t>
+              <w:t xml:space="preserve">0.508–0.543</w:t>
             </w:r>
           </w:p>
         </w:tc>
@@ -2823,7 +2839,7 @@
                 <w:sz w:val="18"/>
                 <w:szCs w:val="18"/>
               </w:rPr>
-              <w:t xml:space="preserve">0.675</w:t>
+              <w:t xml:space="preserve">0.691</w:t>
             </w:r>
           </w:p>
         </w:tc>
@@ -2861,7 +2877,7 @@
       <w:tr>
         <w:trPr>
           <w:cantSplit/>
-          <w:tblHeader w:val="false"/>
+          <w:tblHeader w:val="off"/>
         </w:trPr>
         <w:tc>
           <w:tcPr>
@@ -2889,7 +2905,7 @@
                 <w:sz w:val="18"/>
                 <w:szCs w:val="18"/>
               </w:rPr>
-              <w:t xml:space="preserve">B1</w:t>
+              <w:t xml:space="preserve">E4</w:t>
             </w:r>
           </w:p>
         </w:tc>
@@ -2919,7 +2935,7 @@
                 <w:sz w:val="18"/>
                 <w:szCs w:val="18"/>
               </w:rPr>
-              <w:t xml:space="preserve">TF-IDF word 1–2-grams + LR</w:t>
+              <w:t xml:space="preserve">AfroXLMR-base, fine-tuned</w:t>
             </w:r>
           </w:p>
         </w:tc>
@@ -2949,7 +2965,7 @@
                 <w:sz w:val="18"/>
                 <w:szCs w:val="18"/>
               </w:rPr>
-              <w:t xml:space="preserve">baseline</w:t>
+              <w:t xml:space="preserve">RQ3</w:t>
             </w:r>
           </w:p>
         </w:tc>
@@ -2979,7 +2995,7 @@
                 <w:sz w:val="18"/>
                 <w:szCs w:val="18"/>
               </w:rPr>
-              <w:t xml:space="preserve">0.639</w:t>
+              <w:t xml:space="preserve">0.653</w:t>
             </w:r>
           </w:p>
         </w:tc>
@@ -3009,7 +3025,7 @@
                 <w:sz w:val="18"/>
                 <w:szCs w:val="18"/>
               </w:rPr>
-              <w:t xml:space="preserve">0.512</w:t>
+              <w:t xml:space="preserve">0.614</w:t>
             </w:r>
           </w:p>
         </w:tc>
@@ -3039,7 +3055,7 @@
                 <w:sz w:val="18"/>
                 <w:szCs w:val="18"/>
               </w:rPr>
-              <w:t xml:space="preserve">0.494–0.528</w:t>
+              <w:t xml:space="preserve">0.598–0.631</w:t>
             </w:r>
           </w:p>
         </w:tc>
@@ -3069,7 +3085,7 @@
                 <w:sz w:val="18"/>
                 <w:szCs w:val="18"/>
               </w:rPr>
-              <w:t xml:space="preserve">0.693</w:t>
+              <w:t xml:space="preserve">0.757</w:t>
             </w:r>
           </w:p>
         </w:tc>
@@ -3099,7 +3115,7 @@
                 <w:sz w:val="18"/>
                 <w:szCs w:val="18"/>
               </w:rPr>
-              <w:t xml:space="preserve">2.80 M</w:t>
+              <w:t xml:space="preserve">278 M</w:t>
             </w:r>
           </w:p>
         </w:tc>
@@ -3107,7 +3123,7 @@
       <w:tr>
         <w:trPr>
           <w:cantSplit/>
-          <w:tblHeader w:val="false"/>
+          <w:tblHeader w:val="off"/>
         </w:trPr>
         <w:tc>
           <w:tcPr>
@@ -3135,7 +3151,7 @@
                 <w:sz w:val="18"/>
                 <w:szCs w:val="18"/>
               </w:rPr>
-              <w:t xml:space="preserve">E2a</w:t>
+              <w:t xml:space="preserve">B1</w:t>
             </w:r>
           </w:p>
         </w:tc>
@@ -3165,7 +3181,7 @@
                 <w:sz w:val="18"/>
                 <w:szCs w:val="18"/>
               </w:rPr>
-              <w:t xml:space="preserve">BiLSTM, random init.</w:t>
+              <w:t xml:space="preserve">TF-IDF word 1–2-grams + LR</w:t>
             </w:r>
           </w:p>
         </w:tc>
@@ -3195,7 +3211,7 @@
                 <w:sz w:val="18"/>
                 <w:szCs w:val="18"/>
               </w:rPr>
-              <w:t xml:space="preserve">RQ2</w:t>
+              <w:t xml:space="preserve">baseline</w:t>
             </w:r>
           </w:p>
         </w:tc>
@@ -3225,7 +3241,7 @@
                 <w:sz w:val="18"/>
                 <w:szCs w:val="18"/>
               </w:rPr>
-              <w:t xml:space="preserve">0.573</w:t>
+              <w:t xml:space="preserve">0.639</w:t>
             </w:r>
           </w:p>
         </w:tc>
@@ -3255,7 +3271,7 @@
                 <w:sz w:val="18"/>
                 <w:szCs w:val="18"/>
               </w:rPr>
-              <w:t xml:space="preserve">0.442</w:t>
+              <w:t xml:space="preserve">0.512</w:t>
             </w:r>
           </w:p>
         </w:tc>
@@ -3285,7 +3301,7 @@
                 <w:sz w:val="18"/>
                 <w:szCs w:val="18"/>
               </w:rPr>
-              <w:t xml:space="preserve">0.424–0.458</w:t>
+              <w:t xml:space="preserve">0.494–0.528</w:t>
             </w:r>
           </w:p>
         </w:tc>
@@ -3315,7 +3331,7 @@
                 <w:sz w:val="18"/>
                 <w:szCs w:val="18"/>
               </w:rPr>
-              <w:t xml:space="preserve">0.591</w:t>
+              <w:t xml:space="preserve">0.693</w:t>
             </w:r>
           </w:p>
         </w:tc>
@@ -3345,7 +3361,7 @@
                 <w:sz w:val="18"/>
                 <w:szCs w:val="18"/>
               </w:rPr>
-              <w:t xml:space="preserve">22.1 M</w:t>
+              <w:t xml:space="preserve">2.80 M</w:t>
             </w:r>
           </w:p>
         </w:tc>
@@ -3353,7 +3369,7 @@
       <w:tr>
         <w:trPr>
           <w:cantSplit/>
-          <w:tblHeader w:val="false"/>
+          <w:tblHeader w:val="off"/>
         </w:trPr>
         <w:tc>
           <w:tcPr>
@@ -3381,7 +3397,7 @@
                 <w:sz w:val="18"/>
                 <w:szCs w:val="18"/>
               </w:rPr>
-              <w:t xml:space="preserve">E4</w:t>
+              <w:t xml:space="preserve">A2</w:t>
             </w:r>
           </w:p>
         </w:tc>
@@ -3411,7 +3427,7 @@
                 <w:sz w:val="18"/>
                 <w:szCs w:val="18"/>
               </w:rPr>
-              <w:t xml:space="preserve">AfroXLMR-base, fine-tuned</w:t>
+              <w:t xml:space="preserve">E4, max length 256</w:t>
             </w:r>
           </w:p>
         </w:tc>
@@ -3441,7 +3457,7 @@
                 <w:sz w:val="18"/>
                 <w:szCs w:val="18"/>
               </w:rPr>
-              <w:t xml:space="preserve">RQ3</w:t>
+              <w:t xml:space="preserve">ablation</w:t>
             </w:r>
           </w:p>
         </w:tc>
@@ -3471,7 +3487,7 @@
                 <w:sz w:val="18"/>
                 <w:szCs w:val="18"/>
               </w:rPr>
-              <w:t xml:space="preserve">0.523</w:t>
+              <w:t xml:space="preserve">0.610</w:t>
             </w:r>
           </w:p>
         </w:tc>
@@ -3501,7 +3517,7 @@
                 <w:sz w:val="18"/>
                 <w:szCs w:val="18"/>
               </w:rPr>
-              <w:t xml:space="preserve">0.457</w:t>
+              <w:t xml:space="preserve">0.575</w:t>
             </w:r>
           </w:p>
         </w:tc>
@@ -3531,7 +3547,7 @@
                 <w:sz w:val="18"/>
                 <w:szCs w:val="18"/>
               </w:rPr>
-              <w:t xml:space="preserve">0.445–0.468</w:t>
+              <w:t xml:space="preserve">0.559–0.591</w:t>
             </w:r>
           </w:p>
         </w:tc>
@@ -3561,7 +3577,7 @@
                 <w:sz w:val="18"/>
                 <w:szCs w:val="18"/>
               </w:rPr>
-              <w:t xml:space="preserve">0.714</w:t>
+              <w:t xml:space="preserve">0.729</w:t>
             </w:r>
           </w:p>
         </w:tc>
@@ -3599,7 +3615,7 @@
       <w:tr>
         <w:trPr>
           <w:cantSplit/>
-          <w:tblHeader w:val="false"/>
+          <w:tblHeader w:val="off"/>
         </w:trPr>
         <w:tc>
           <w:tcPr>
@@ -3627,7 +3643,7 @@
                 <w:sz w:val="18"/>
                 <w:szCs w:val="18"/>
               </w:rPr>
-              <w:t xml:space="preserve">A2</w:t>
+              <w:t xml:space="preserve">E2a</w:t>
             </w:r>
           </w:p>
         </w:tc>
@@ -3657,7 +3673,7 @@
                 <w:sz w:val="18"/>
                 <w:szCs w:val="18"/>
               </w:rPr>
-              <w:t xml:space="preserve">E4, max length 256</w:t>
+              <w:t xml:space="preserve">BiLSTM, random init.</w:t>
             </w:r>
           </w:p>
         </w:tc>
@@ -3687,7 +3703,7 @@
                 <w:sz w:val="18"/>
                 <w:szCs w:val="18"/>
               </w:rPr>
-              <w:t xml:space="preserve">ablation</w:t>
+              <w:t xml:space="preserve">RQ2</w:t>
             </w:r>
           </w:p>
         </w:tc>
@@ -3717,7 +3733,7 @@
                 <w:sz w:val="18"/>
                 <w:szCs w:val="18"/>
               </w:rPr>
-              <w:t xml:space="preserve">0.518</w:t>
+              <w:t xml:space="preserve">0.573</w:t>
             </w:r>
           </w:p>
         </w:tc>
@@ -3747,7 +3763,7 @@
                 <w:sz w:val="18"/>
                 <w:szCs w:val="18"/>
               </w:rPr>
-              <w:t xml:space="preserve">0.445</w:t>
+              <w:t xml:space="preserve">0.442</w:t>
             </w:r>
           </w:p>
         </w:tc>
@@ -3777,7 +3793,7 @@
                 <w:sz w:val="18"/>
                 <w:szCs w:val="18"/>
               </w:rPr>
-              <w:t xml:space="preserve">0.434–0.456</w:t>
+              <w:t xml:space="preserve">0.424–0.458</w:t>
             </w:r>
           </w:p>
         </w:tc>
@@ -3807,7 +3823,7 @@
                 <w:sz w:val="18"/>
                 <w:szCs w:val="18"/>
               </w:rPr>
-              <w:t xml:space="preserve">0.701</w:t>
+              <w:t xml:space="preserve">0.591</w:t>
             </w:r>
           </w:p>
         </w:tc>
@@ -3837,7 +3853,7 @@
                 <w:sz w:val="18"/>
                 <w:szCs w:val="18"/>
               </w:rPr>
-              <w:t xml:space="preserve">278 M</w:t>
+              <w:t xml:space="preserve">22.1 M</w:t>
             </w:r>
           </w:p>
         </w:tc>
@@ -3845,7 +3861,7 @@
       <w:tr>
         <w:trPr>
           <w:cantSplit/>
-          <w:tblHeader w:val="false"/>
+          <w:tblHeader w:val="off"/>
         </w:trPr>
         <w:tc>
           <w:tcPr>
@@ -3963,7 +3979,7 @@
                 <w:sz w:val="18"/>
                 <w:szCs w:val="18"/>
               </w:rPr>
-              <w:t xml:space="preserve">0.436</w:t>
+              <w:t xml:space="preserve">0.449</w:t>
             </w:r>
           </w:p>
         </w:tc>
@@ -3993,7 +4009,7 @@
                 <w:sz w:val="18"/>
                 <w:szCs w:val="18"/>
               </w:rPr>
-              <w:t xml:space="preserve">0.411</w:t>
+              <w:t xml:space="preserve">0.421</w:t>
             </w:r>
           </w:p>
         </w:tc>
@@ -4023,7 +4039,7 @@
                 <w:sz w:val="18"/>
                 <w:szCs w:val="18"/>
               </w:rPr>
-              <w:t xml:space="preserve">0.399–0.422</w:t>
+              <w:t xml:space="preserve">0.409–0.433</w:t>
             </w:r>
           </w:p>
         </w:tc>
@@ -4053,7 +4069,7 @@
                 <w:sz w:val="18"/>
                 <w:szCs w:val="18"/>
               </w:rPr>
-              <w:t xml:space="preserve">0.663</w:t>
+              <w:t xml:space="preserve">0.644</w:t>
             </w:r>
           </w:p>
         </w:tc>
@@ -4091,7 +4107,7 @@
       <w:tr>
         <w:trPr>
           <w:cantSplit/>
-          <w:tblHeader w:val="false"/>
+          <w:tblHeader w:val="off"/>
         </w:trPr>
         <w:tc>
           <w:tcPr>
@@ -4209,7 +4225,7 @@
                 <w:sz w:val="18"/>
                 <w:szCs w:val="18"/>
               </w:rPr>
-              <w:t xml:space="preserve">0.398</w:t>
+              <w:t xml:space="preserve">0.367</w:t>
             </w:r>
           </w:p>
         </w:tc>
@@ -4239,7 +4255,7 @@
                 <w:sz w:val="18"/>
                 <w:szCs w:val="18"/>
               </w:rPr>
-              <w:t xml:space="preserve">0.394</w:t>
+              <w:t xml:space="preserve">0.360</w:t>
             </w:r>
           </w:p>
         </w:tc>
@@ -4269,7 +4285,7 @@
                 <w:sz w:val="18"/>
                 <w:szCs w:val="18"/>
               </w:rPr>
-              <w:t xml:space="preserve">0.384–0.403</w:t>
+              <w:t xml:space="preserve">0.350–0.371</w:t>
             </w:r>
           </w:p>
         </w:tc>
@@ -4299,7 +4315,7 @@
                 <w:sz w:val="18"/>
                 <w:szCs w:val="18"/>
               </w:rPr>
-              <w:t xml:space="preserve">0.672</w:t>
+              <w:t xml:space="preserve">0.614</w:t>
             </w:r>
           </w:p>
         </w:tc>
@@ -4337,7 +4353,7 @@
       <w:tr>
         <w:trPr>
           <w:cantSplit/>
-          <w:tblHeader w:val="false"/>
+          <w:tblHeader w:val="off"/>
         </w:trPr>
         <w:tc>
           <w:tcPr>
@@ -4621,7 +4637,7 @@
         <w:t xml:space="preserve">less than half the parameters</w:t>
       </w:r>
       <w:r>
-        <w:t xml:space="preserve"> (1.36 M versus 2.80 M). McNemar’s test confirms the difference is systematic: E1 is right on 278 articles that B1 gets wrong, and B1 on only 135 that E1 gets wrong (p = 2.8 × 10⁻¹²). The gain is concentrated in the smallest training classes: environment (34 training articles) improves by 0.295 F1, tourism by 0.234, fashion by 0.201 and culture by 0.172, while the large classes barely move. This fits the morphological argument: character n-grams let the model pool evidence across the many inflected forms of a stem, which matters most when a class has few examples. The highest-weighted E1 features confirm this: they are stems and affixes such as “kipe” (team), “uzima” (health) and “dukik” (from </w:t>
+        <w:t xml:space="preserve"> (1.36 M versus 2.80 M). McNemar’s test confirms the difference is systematic: E1 is right on 278 articles that B1 gets wrong, and B1 on only 135 that E1 gets wrong (p = 2.8 × 10⁻¹²). The gain is concentrated in the smallest training classes: environment improves by 0.295 F1, tourism by 0.234, fashion by 0.201 and culture by 0.172, while the large classes barely move. Character n-grams let the model pool evidence across the many inflected forms of a stem, which matters most when a class has few examples. The highest-weighted E1 features confirm this: they are stems and affixes such as “kipe” (team), “uzima” (health) and “dukik” (from </w:t>
       </w:r>
       <w:r>
         <w:rPr>
@@ -4631,7 +4647,7 @@
         <w:t xml:space="preserve">ibidukikije</w:t>
       </w:r>
       <w:r>
-        <w:t xml:space="preserve">, environment) rather than whole words.</w:t>
+        <w:t xml:space="preserve">, environment).</w:t>
       </w:r>
     </w:p>
     <w:p>
@@ -4648,17 +4664,17 @@
         <w:jc w:val="both"/>
       </w:pPr>
       <w:r>
-        <w:t xml:space="preserve">Initialising the BiLSTM with fastText vectors raised test macro-F1 from 0.442 (E2a) to 0.509 (E2b), </w:t>
+        <w:t xml:space="preserve">Initialising the BiLSTM with fastText vectors raised test macro-F1 from 0.442 (E2a) to 0.526 (E2b), </w:t>
       </w:r>
       <w:r>
         <w:rPr>
           <w:b/>
           <w:bCs/>
         </w:rPr>
-        <w:t xml:space="preserve">+6.7 points</w:t>
-      </w:r>
-      <w:r>
-        <w:t xml:space="preserve"> with non-overlapping confidence intervals (McNemar p = 3.9 × 10⁻³³). The largest gains were in culture (+0.19 F1, 69 training articles), politics, technology and religion. The fastText vectors behave as intended: the nearest neighbours of </w:t>
+        <w:t xml:space="preserve">+8.4 points</w:t>
+      </w:r>
+      <w:r>
+        <w:t xml:space="preserve"> with non-overlapping confidence intervals; E2b is right on 639 articles that E2a gets wrong, against 212 the other way (McNemar p = 2.7 × 10⁻⁴⁸). The largest gains were in technology (+0.16 F1), economy (+0.12) and culture (+0.12). The vectors behave as intended: the nearest neighbours of </w:t>
       </w:r>
       <w:r>
         <w:rPr>
@@ -4708,7 +4724,7 @@
         <w:t xml:space="preserve">ibidukikijebyacu</w:t>
       </w:r>
       <w:r>
-        <w:t xml:space="preserve">, still receives a vector whose neighbours are the same family. However, even with this help the BiLSTM does not match the character n-gram model (0.509 versus 0.587), and both BiLSTMs overfit quickly: training loss falls towards zero while validation loss starts rising after five to nine epochs. With 22 million parameters (21.7 million in the embedding layer) and fewer than 7,000 training articles, the recurrent model has far more capacity than the data can support.</w:t>
+        <w:t xml:space="preserve">, still receives a vector whose neighbours are the same family. The improvement held on all three seeds (Table 3). Even so, the BiLSTM stays well below E1 (0.526 versus 0.587) and overfits quickly: E2b’s validation loss is lowest at epoch 8 and rises afterwards while its training loss falls to 0.02. With 22 million parameters (21.7 million in the embedding layer) and fewer than 7,000 training articles, the recurrent model has far more capacity than the data can support.</w:t>
       </w:r>
     </w:p>
     <w:p>
@@ -4732,10 +4748,10 @@
           <w:b/>
           <w:bCs/>
         </w:rPr>
-        <w:t xml:space="preserve">6.3 points</w:t>
-      </w:r>
-      <w:r>
-        <w:t xml:space="preserve"> (0.457 versus 0.394), with non-overlapping confidence intervals and McNemar p = 3.2 × 10⁻¹⁷. Because the two models share an identical tokenizer and identical fine-tuning settings, the difference is attributable to the adapted weights, i.e. to AfroXLMR having seen Kinyarwanda during adaptation (Alabi et al., 2022). The gap is largest on technology (+0.21 F1) and history, where XLM-R never predicted the class correctly (F1 = 0.00). AfroXLMR also learned faster, reaching 0.499 validation macro-F1 after one epoch against XLM-R’s 0.260.</w:t>
+        <w:t xml:space="preserve">25.4 points</w:t>
+      </w:r>
+      <w:r>
+        <w:t xml:space="preserve"> (0.614 versus 0.360), with non-overlapping confidence intervals; E4 is right on 814 articles that E3 gets wrong, against 206 the other way (McNemar p = 1.5 × 10⁻⁸⁰). Because the two models share an identical tokenizer and identical fine-tuning settings, the difference is attributable to the adapted weights, that is, to AfroXLMR having seen Kinyarwanda during adaptation (Alabi et al., 2022). The gap is starkest on the smallest classes: XLM-R scores an F1 of zero on tourism, fashion, culture and environment, where AfroXLMR reaches 0.66, 0.65, 0.44 and 0.37. XLM-R also proved unstable across seeds (0.298 ± 0.128, with one seed collapsing to 0.150), whereas AfroXLMR was almost identical across seeds (0.616 ± 0.003). A model with no exposure to Kinyarwanda cannot learn a topic from about thirty examples; a model already adapted to the language can.</w:t>
       </w:r>
     </w:p>
     <w:p>
@@ -4744,96 +4760,41 @@
         <w:jc w:val="both"/>
       </w:pPr>
       <w:r>
-        <w:t xml:space="preserve">Both Transformers nevertheless scored well below the character n-gram model, which is the most important negative result of the project. Four factors plausibly explain it:</w:t>
-      </w:r>
-    </w:p>
-    <w:p>
-      <w:pPr>
-        <w:pStyle w:val="ListParagraph"/>
-        <w:numPr>
-          <w:ilvl w:val="0"/>
-          <w:numId w:val="3"/>
-        </w:numPr>
-        <w:spacing w:after="60" w:line="276"/>
+        <w:t xml:space="preserve">Class weighting mattered for this result. In a development run without it, AfroXLMR reached only 0.457 test macro-F1; with the same weights as the other models it reached 0.614, and per-class F1 rose most on the rare classes that macro-F1 weights equally.</w:t>
+      </w:r>
+    </w:p>
+    <w:p>
+      <w:pPr>
+        <w:pStyle w:val="Heading2"/>
+      </w:pPr>
+      <w:r>
+        <w:t xml:space="preserve">5.4 Ablations</w:t>
+      </w:r>
+    </w:p>
+    <w:p>
+      <w:pPr>
+        <w:spacing w:after="120" w:line="276"/>
+        <w:jc w:val="both"/>
       </w:pPr>
       <w:r>
         <w:rPr>
           <w:b/>
           <w:bCs/>
         </w:rPr>
-        <w:t xml:space="preserve">No class weighting.</w:t>
-      </w:r>
-      <w:r>
-        <w:t xml:space="preserve"> The linear models and BiLSTMs were trained with class weights, but the Transformers used the standard unweighted loss. With classes of 31–34 training articles, the Transformers under-predict the rare topics that macro-F1 weights equally. This is a confound in the comparison, and the first thing to fix in future work.</w:t>
-      </w:r>
-    </w:p>
-    <w:p>
-      <w:pPr>
-        <w:pStyle w:val="ListParagraph"/>
-        <w:numPr>
-          <w:ilvl w:val="0"/>
-          <w:numId w:val="3"/>
-        </w:numPr>
-        <w:spacing w:after="60" w:line="276"/>
-      </w:pPr>
+        <w:t xml:space="preserve">Title only (A1).</w:t>
+      </w:r>
+      <w:r>
+        <w:t xml:space="preserve"> Using only the headline reduced E4’s test macro-F1 from 0.614 to 0.421 (−19.3 points). The loss is concentrated in the rare classes: tourism fell from 0.66 to 0.00 and fashion from 0.65 to 0.01. Headlines carry enough signal for the common topics but not for the rare ones, which matters for the app, where users often paste only a headline. </w:t>
+      </w:r>
       <w:r>
         <w:rPr>
           <w:b/>
           <w:bCs/>
         </w:rPr>
-        <w:t xml:space="preserve">Truncation.</w:t>
-      </w:r>
-      <w:r>
-        <w:t xml:space="preserve"> Three-quarters of articles are longer than 512 tokens (Section 3.3), so the Transformers see only the beginning of most documents, while the TF-IDF models use the whole text.</w:t>
-      </w:r>
-    </w:p>
-    <w:p>
-      <w:pPr>
-        <w:pStyle w:val="ListParagraph"/>
-        <w:numPr>
-          <w:ilvl w:val="0"/>
-          <w:numId w:val="3"/>
-        </w:numPr>
-        <w:spacing w:after="60" w:line="276"/>
-      </w:pPr>
-      <w:r>
-        <w:rPr>
-          <w:b/>
-          <w:bCs/>
-        </w:rPr>
-        <w:t xml:space="preserve">Limited training.</w:t>
-      </w:r>
-      <w:r>
-        <w:t xml:space="preserve"> Three epochs on 6,863 articles with a single learning rate; validation macro-F1 was still rising at the end of training for both models, suggesting they were under-trained.</w:t>
-      </w:r>
-    </w:p>
-    <w:p>
-      <w:pPr>
-        <w:pStyle w:val="ListParagraph"/>
-        <w:numPr>
-          <w:ilvl w:val="0"/>
-          <w:numId w:val="3"/>
-        </w:numPr>
-        <w:spacing w:after="60" w:line="276"/>
-      </w:pPr>
-      <w:r>
-        <w:rPr>
-          <w:b/>
-          <w:bCs/>
-        </w:rPr>
-        <w:t xml:space="preserve">Tokenizer fit.</w:t>
-      </w:r>
-      <w:r>
-        <w:t xml:space="preserve"> The shared tokenizer was built without Kinyarwanda and splits each word into about 2.5 pieces, which adaptation of the weights cannot change. Nzeyimana and Niyongabo Rubungo (2022) identify exactly this kind of subword tokenization as sub-optimal for Kinyarwanda.</w:t>
-      </w:r>
-    </w:p>
-    <w:p>
-      <w:pPr>
-        <w:spacing w:after="120" w:line="276"/>
-        <w:jc w:val="both"/>
-      </w:pPr>
-      <w:r>
-        <w:t xml:space="preserve">Accuracy tells a slightly different story: E4’s test accuracy (0.714) is close to E1’s (0.726), so AfroXLMR handles the frequent classes well and loses mainly on the rare ones. This is consistent with the class-weighting explanation.</w:t>
+        <w:t xml:space="preserve">Max length 256 (A2).</w:t>
+      </w:r>
+      <w:r>
+        <w:t xml:space="preserve"> Halving the input length cost 3.9 points (0.614 to 0.575), with non-overlapping confidence intervals; culture and fashion lost the most. The second half of the 512-token window carries useful information, so longer contexts would likely help further.</w:t>
       </w:r>
     </w:p>
     <w:p>
@@ -4841,84 +4802,7 @@
         <w:pStyle w:val="Heading2"/>
       </w:pPr>
       <w:r>
-        <w:t xml:space="preserve">5.4 Ablations</w:t>
-      </w:r>
-    </w:p>
-    <w:p>
-      <w:pPr>
-        <w:spacing w:after="120" w:line="276"/>
-        <w:jc w:val="both"/>
-      </w:pPr>
-      <w:r>
-        <w:rPr>
-          <w:b/>
-          <w:bCs/>
-        </w:rPr>
-        <w:t xml:space="preserve">Title only (A1).</w:t>
-      </w:r>
-      <w:r>
-        <w:t xml:space="preserve"> Using only the headline reduced E4’s test macro-F1 from 0.457 to 0.411 (−4.6 points, significant). Headlines therefore carry most, but not all, of the topic signal; health and technology lost the most. This is useful for deployment, since users often paste only a headline. </w:t>
-      </w:r>
-      <w:r>
-        <w:rPr>
-          <w:b/>
-          <w:bCs/>
-        </w:rPr>
-        <w:t xml:space="preserve">Max length 256 (A2).</w:t>
-      </w:r>
-      <w:r>
-        <w:t xml:space="preserve"> Halving the input length cost only 1.1 points (0.457 to 0.445), with overlapping confidence intervals, although McNemar’s test still detects a systematic difference (p = 8.2 × 10⁻⁶). The second 256 tokens add little, which suggests that simply extending the window further would help less than better training.</w:t>
-      </w:r>
-    </w:p>
-    <w:p>
-      <w:pPr>
-        <w:pStyle w:val="Heading2"/>
-      </w:pPr>
-      <w:r>
-        <w:t xml:space="preserve">5.5 Validation versus test</w:t>
-      </w:r>
-    </w:p>
-    <w:p>
-      <w:pPr>
-        <w:spacing w:after="120" w:line="276"/>
-        <w:jc w:val="both"/>
-      </w:pPr>
-      <w:r>
-        <w:t xml:space="preserve">Every model scores lower on test than on validation (E1: 0.700 to 0.587). This is expected here, because validation follows the training class distribution while the official test set does not (Figure 1): the test set contains many more articles from the rarest training classes, which are exactly the classes every model finds hardest.</w:t>
-      </w:r>
-    </w:p>
-    <w:p>
-      <w:pPr>
-        <w:pStyle w:val="Heading2"/>
-      </w:pPr>
-      <w:r>
-        <w:t xml:space="preserve">5.6 Inference cost</w:t>
-      </w:r>
-    </w:p>
-    <w:p>
-      <w:pPr>
-        <w:spacing w:after="120" w:line="276"/>
-        <w:jc w:val="both"/>
-      </w:pPr>
-      <w:r>
-        <w:t xml:space="preserve">Measured on the same machine with batched inference, E1 classifies an article in about 0.03 ms, the BiLSTMs in about 0.36 ms, and the full Transformers in about 8.7–8.9 ms. E1 is therefore both the most accurate model on macro-F1 and roughly 270 times cheaper to run than the Transformers, which supports deploying it.</w:t>
-      </w:r>
-    </w:p>
-    <w:p>
-      <w:pPr>
-        <w:pStyle w:val="Heading1"/>
-      </w:pPr>
-      <w:r>
-        <w:t xml:space="preserve">6. Error Analysis and Discussion</w:t>
-      </w:r>
-    </w:p>
-    <w:p>
-      <w:pPr>
-        <w:spacing w:after="120" w:line="276"/>
-        <w:jc w:val="both"/>
-      </w:pPr>
-      <w:r>
-        <w:t xml:space="preserve">The error analysis focuses on the selected model, E1. Table 3 shows its per-class performance on the test set.</w:t>
+        <w:t xml:space="preserve">5.5 Seed variance</w:t>
       </w:r>
     </w:p>
     <w:p>
@@ -4934,7 +4818,913 @@
           <w:sz w:val="18"/>
           <w:szCs w:val="18"/>
         </w:rPr>
-        <w:t xml:space="preserve">Table 3. E1 per-class test performance, sorted by F1 (macro-F1 0.587, weighted F1 0.730, accuracy 0.726).</w:t>
+        <w:t xml:space="preserve">Table 3. Test macro-F1 over three training seeds.</w:t>
+      </w:r>
+    </w:p>
+    <w:tbl>
+      <w:tblPr>
+        <w:tblW w:type="dxa" w:w="9026"/>
+        <w:tblBorders>
+          <w:top w:val="single" w:color="auto" w:sz="4"/>
+          <w:left w:val="single" w:color="auto" w:sz="4"/>
+          <w:bottom w:val="single" w:color="auto" w:sz="4"/>
+          <w:right w:val="single" w:color="auto" w:sz="4"/>
+          <w:insideH w:val="single" w:color="auto" w:sz="4"/>
+          <w:insideV w:val="single" w:color="auto" w:sz="4"/>
+        </w:tblBorders>
+      </w:tblPr>
+      <w:tblGrid>
+        <w:gridCol w:w="2826"/>
+        <w:gridCol w:w="1500"/>
+        <w:gridCol w:w="1500"/>
+        <w:gridCol w:w="1500"/>
+        <w:gridCol w:w="1700"/>
+      </w:tblGrid>
+      <w:tr>
+        <w:trPr>
+          <w:cantSplit/>
+          <w:tblHeader/>
+        </w:trPr>
+        <w:tc>
+          <w:tcPr>
+            <w:tcW w:type="dxa" w:w="2826"/>
+            <w:tcBorders>
+              <w:top w:val="single" w:color="BFBFBF" w:sz="4"/>
+              <w:left w:val="single" w:color="BFBFBF" w:sz="4"/>
+              <w:bottom w:val="single" w:color="BFBFBF" w:sz="4"/>
+              <w:right w:val="single" w:color="BFBFBF" w:sz="4"/>
+            </w:tcBorders>
+            <w:shd w:fill="D9E2F3" w:color="auto" w:val="clear"/>
+            <w:tcMar>
+              <w:top w:type="dxa" w:w="50"/>
+              <w:left w:type="dxa" w:w="90"/>
+              <w:bottom w:type="dxa" w:w="50"/>
+              <w:right w:type="dxa" w:w="90"/>
+            </w:tcMar>
+          </w:tcPr>
+          <w:p>
+            <w:pPr>
+              <w:keepNext/>
+              <w:jc w:val="left"/>
+            </w:pPr>
+            <w:r>
+              <w:rPr>
+                <w:b/>
+                <w:bCs/>
+                <w:sz w:val="18"/>
+                <w:szCs w:val="18"/>
+              </w:rPr>
+              <w:t xml:space="preserve">Model</w:t>
+            </w:r>
+          </w:p>
+        </w:tc>
+        <w:tc>
+          <w:tcPr>
+            <w:tcW w:type="dxa" w:w="1500"/>
+            <w:tcBorders>
+              <w:top w:val="single" w:color="BFBFBF" w:sz="4"/>
+              <w:left w:val="single" w:color="BFBFBF" w:sz="4"/>
+              <w:bottom w:val="single" w:color="BFBFBF" w:sz="4"/>
+              <w:right w:val="single" w:color="BFBFBF" w:sz="4"/>
+            </w:tcBorders>
+            <w:shd w:fill="D9E2F3" w:color="auto" w:val="clear"/>
+            <w:tcMar>
+              <w:top w:type="dxa" w:w="50"/>
+              <w:left w:type="dxa" w:w="90"/>
+              <w:bottom w:type="dxa" w:w="50"/>
+              <w:right w:type="dxa" w:w="90"/>
+            </w:tcMar>
+          </w:tcPr>
+          <w:p>
+            <w:pPr>
+              <w:keepNext/>
+              <w:jc w:val="center"/>
+            </w:pPr>
+            <w:r>
+              <w:rPr>
+                <w:b/>
+                <w:bCs/>
+                <w:sz w:val="18"/>
+                <w:szCs w:val="18"/>
+              </w:rPr>
+              <w:t xml:space="preserve">Seed 42</w:t>
+            </w:r>
+          </w:p>
+        </w:tc>
+        <w:tc>
+          <w:tcPr>
+            <w:tcW w:type="dxa" w:w="1500"/>
+            <w:tcBorders>
+              <w:top w:val="single" w:color="BFBFBF" w:sz="4"/>
+              <w:left w:val="single" w:color="BFBFBF" w:sz="4"/>
+              <w:bottom w:val="single" w:color="BFBFBF" w:sz="4"/>
+              <w:right w:val="single" w:color="BFBFBF" w:sz="4"/>
+            </w:tcBorders>
+            <w:shd w:fill="D9E2F3" w:color="auto" w:val="clear"/>
+            <w:tcMar>
+              <w:top w:type="dxa" w:w="50"/>
+              <w:left w:type="dxa" w:w="90"/>
+              <w:bottom w:type="dxa" w:w="50"/>
+              <w:right w:type="dxa" w:w="90"/>
+            </w:tcMar>
+          </w:tcPr>
+          <w:p>
+            <w:pPr>
+              <w:keepNext/>
+              <w:jc w:val="center"/>
+            </w:pPr>
+            <w:r>
+              <w:rPr>
+                <w:b/>
+                <w:bCs/>
+                <w:sz w:val="18"/>
+                <w:szCs w:val="18"/>
+              </w:rPr>
+              <w:t xml:space="preserve">Seed 43</w:t>
+            </w:r>
+          </w:p>
+        </w:tc>
+        <w:tc>
+          <w:tcPr>
+            <w:tcW w:type="dxa" w:w="1500"/>
+            <w:tcBorders>
+              <w:top w:val="single" w:color="BFBFBF" w:sz="4"/>
+              <w:left w:val="single" w:color="BFBFBF" w:sz="4"/>
+              <w:bottom w:val="single" w:color="BFBFBF" w:sz="4"/>
+              <w:right w:val="single" w:color="BFBFBF" w:sz="4"/>
+            </w:tcBorders>
+            <w:shd w:fill="D9E2F3" w:color="auto" w:val="clear"/>
+            <w:tcMar>
+              <w:top w:type="dxa" w:w="50"/>
+              <w:left w:type="dxa" w:w="90"/>
+              <w:bottom w:type="dxa" w:w="50"/>
+              <w:right w:type="dxa" w:w="90"/>
+            </w:tcMar>
+          </w:tcPr>
+          <w:p>
+            <w:pPr>
+              <w:keepNext/>
+              <w:jc w:val="center"/>
+            </w:pPr>
+            <w:r>
+              <w:rPr>
+                <w:b/>
+                <w:bCs/>
+                <w:sz w:val="18"/>
+                <w:szCs w:val="18"/>
+              </w:rPr>
+              <w:t xml:space="preserve">Seed 44</w:t>
+            </w:r>
+          </w:p>
+        </w:tc>
+        <w:tc>
+          <w:tcPr>
+            <w:tcW w:type="dxa" w:w="1700"/>
+            <w:tcBorders>
+              <w:top w:val="single" w:color="BFBFBF" w:sz="4"/>
+              <w:left w:val="single" w:color="BFBFBF" w:sz="4"/>
+              <w:bottom w:val="single" w:color="BFBFBF" w:sz="4"/>
+              <w:right w:val="single" w:color="BFBFBF" w:sz="4"/>
+            </w:tcBorders>
+            <w:shd w:fill="D9E2F3" w:color="auto" w:val="clear"/>
+            <w:tcMar>
+              <w:top w:type="dxa" w:w="50"/>
+              <w:left w:type="dxa" w:w="90"/>
+              <w:bottom w:type="dxa" w:w="50"/>
+              <w:right w:type="dxa" w:w="90"/>
+            </w:tcMar>
+          </w:tcPr>
+          <w:p>
+            <w:pPr>
+              <w:keepNext/>
+              <w:jc w:val="center"/>
+            </w:pPr>
+            <w:r>
+              <w:rPr>
+                <w:b/>
+                <w:bCs/>
+                <w:sz w:val="18"/>
+                <w:szCs w:val="18"/>
+              </w:rPr>
+              <w:t xml:space="preserve">Mean ± std</w:t>
+            </w:r>
+          </w:p>
+        </w:tc>
+      </w:tr>
+      <w:tr>
+        <w:trPr>
+          <w:cantSplit/>
+          <w:tblHeader w:val="off"/>
+        </w:trPr>
+        <w:tc>
+          <w:tcPr>
+            <w:tcW w:type="dxa" w:w="2826"/>
+            <w:tcBorders>
+              <w:top w:val="single" w:color="BFBFBF" w:sz="4"/>
+              <w:left w:val="single" w:color="BFBFBF" w:sz="4"/>
+              <w:bottom w:val="single" w:color="BFBFBF" w:sz="4"/>
+              <w:right w:val="single" w:color="BFBFBF" w:sz="4"/>
+            </w:tcBorders>
+            <w:tcMar>
+              <w:top w:type="dxa" w:w="50"/>
+              <w:left w:type="dxa" w:w="90"/>
+              <w:bottom w:type="dxa" w:w="50"/>
+              <w:right w:type="dxa" w:w="90"/>
+            </w:tcMar>
+          </w:tcPr>
+          <w:p>
+            <w:pPr>
+              <w:keepNext/>
+              <w:jc w:val="left"/>
+            </w:pPr>
+            <w:r>
+              <w:rPr>
+                <w:sz w:val="18"/>
+                <w:szCs w:val="18"/>
+              </w:rPr>
+              <w:t xml:space="preserve">E2a BiLSTM, random</w:t>
+            </w:r>
+          </w:p>
+        </w:tc>
+        <w:tc>
+          <w:tcPr>
+            <w:tcW w:type="dxa" w:w="1500"/>
+            <w:tcBorders>
+              <w:top w:val="single" w:color="BFBFBF" w:sz="4"/>
+              <w:left w:val="single" w:color="BFBFBF" w:sz="4"/>
+              <w:bottom w:val="single" w:color="BFBFBF" w:sz="4"/>
+              <w:right w:val="single" w:color="BFBFBF" w:sz="4"/>
+            </w:tcBorders>
+            <w:tcMar>
+              <w:top w:type="dxa" w:w="50"/>
+              <w:left w:type="dxa" w:w="90"/>
+              <w:bottom w:type="dxa" w:w="50"/>
+              <w:right w:type="dxa" w:w="90"/>
+            </w:tcMar>
+          </w:tcPr>
+          <w:p>
+            <w:pPr>
+              <w:keepNext/>
+              <w:jc w:val="center"/>
+            </w:pPr>
+            <w:r>
+              <w:rPr>
+                <w:sz w:val="18"/>
+                <w:szCs w:val="18"/>
+              </w:rPr>
+              <w:t xml:space="preserve">0.442</w:t>
+            </w:r>
+          </w:p>
+        </w:tc>
+        <w:tc>
+          <w:tcPr>
+            <w:tcW w:type="dxa" w:w="1500"/>
+            <w:tcBorders>
+              <w:top w:val="single" w:color="BFBFBF" w:sz="4"/>
+              <w:left w:val="single" w:color="BFBFBF" w:sz="4"/>
+              <w:bottom w:val="single" w:color="BFBFBF" w:sz="4"/>
+              <w:right w:val="single" w:color="BFBFBF" w:sz="4"/>
+            </w:tcBorders>
+            <w:tcMar>
+              <w:top w:type="dxa" w:w="50"/>
+              <w:left w:type="dxa" w:w="90"/>
+              <w:bottom w:type="dxa" w:w="50"/>
+              <w:right w:type="dxa" w:w="90"/>
+            </w:tcMar>
+          </w:tcPr>
+          <w:p>
+            <w:pPr>
+              <w:keepNext/>
+              <w:jc w:val="center"/>
+            </w:pPr>
+            <w:r>
+              <w:rPr>
+                <w:sz w:val="18"/>
+                <w:szCs w:val="18"/>
+              </w:rPr>
+              <w:t xml:space="preserve">0.423</w:t>
+            </w:r>
+          </w:p>
+        </w:tc>
+        <w:tc>
+          <w:tcPr>
+            <w:tcW w:type="dxa" w:w="1500"/>
+            <w:tcBorders>
+              <w:top w:val="single" w:color="BFBFBF" w:sz="4"/>
+              <w:left w:val="single" w:color="BFBFBF" w:sz="4"/>
+              <w:bottom w:val="single" w:color="BFBFBF" w:sz="4"/>
+              <w:right w:val="single" w:color="BFBFBF" w:sz="4"/>
+            </w:tcBorders>
+            <w:tcMar>
+              <w:top w:type="dxa" w:w="50"/>
+              <w:left w:type="dxa" w:w="90"/>
+              <w:bottom w:type="dxa" w:w="50"/>
+              <w:right w:type="dxa" w:w="90"/>
+            </w:tcMar>
+          </w:tcPr>
+          <w:p>
+            <w:pPr>
+              <w:keepNext/>
+              <w:jc w:val="center"/>
+            </w:pPr>
+            <w:r>
+              <w:rPr>
+                <w:sz w:val="18"/>
+                <w:szCs w:val="18"/>
+              </w:rPr>
+              <w:t xml:space="preserve">0.409</w:t>
+            </w:r>
+          </w:p>
+        </w:tc>
+        <w:tc>
+          <w:tcPr>
+            <w:tcW w:type="dxa" w:w="1700"/>
+            <w:tcBorders>
+              <w:top w:val="single" w:color="BFBFBF" w:sz="4"/>
+              <w:left w:val="single" w:color="BFBFBF" w:sz="4"/>
+              <w:bottom w:val="single" w:color="BFBFBF" w:sz="4"/>
+              <w:right w:val="single" w:color="BFBFBF" w:sz="4"/>
+            </w:tcBorders>
+            <w:tcMar>
+              <w:top w:type="dxa" w:w="50"/>
+              <w:left w:type="dxa" w:w="90"/>
+              <w:bottom w:type="dxa" w:w="50"/>
+              <w:right w:type="dxa" w:w="90"/>
+            </w:tcMar>
+          </w:tcPr>
+          <w:p>
+            <w:pPr>
+              <w:keepNext/>
+              <w:jc w:val="center"/>
+            </w:pPr>
+            <w:r>
+              <w:rPr>
+                <w:sz w:val="18"/>
+                <w:szCs w:val="18"/>
+              </w:rPr>
+              <w:t xml:space="preserve">0.425 ± 0.016</w:t>
+            </w:r>
+          </w:p>
+        </w:tc>
+      </w:tr>
+      <w:tr>
+        <w:trPr>
+          <w:cantSplit/>
+          <w:tblHeader w:val="off"/>
+        </w:trPr>
+        <w:tc>
+          <w:tcPr>
+            <w:tcW w:type="dxa" w:w="2826"/>
+            <w:tcBorders>
+              <w:top w:val="single" w:color="BFBFBF" w:sz="4"/>
+              <w:left w:val="single" w:color="BFBFBF" w:sz="4"/>
+              <w:bottom w:val="single" w:color="BFBFBF" w:sz="4"/>
+              <w:right w:val="single" w:color="BFBFBF" w:sz="4"/>
+            </w:tcBorders>
+            <w:tcMar>
+              <w:top w:type="dxa" w:w="50"/>
+              <w:left w:type="dxa" w:w="90"/>
+              <w:bottom w:type="dxa" w:w="50"/>
+              <w:right w:type="dxa" w:w="90"/>
+            </w:tcMar>
+          </w:tcPr>
+          <w:p>
+            <w:pPr>
+              <w:keepNext/>
+              <w:jc w:val="left"/>
+            </w:pPr>
+            <w:r>
+              <w:rPr>
+                <w:sz w:val="18"/>
+                <w:szCs w:val="18"/>
+              </w:rPr>
+              <w:t xml:space="preserve">E2b BiLSTM + fastText</w:t>
+            </w:r>
+          </w:p>
+        </w:tc>
+        <w:tc>
+          <w:tcPr>
+            <w:tcW w:type="dxa" w:w="1500"/>
+            <w:tcBorders>
+              <w:top w:val="single" w:color="BFBFBF" w:sz="4"/>
+              <w:left w:val="single" w:color="BFBFBF" w:sz="4"/>
+              <w:bottom w:val="single" w:color="BFBFBF" w:sz="4"/>
+              <w:right w:val="single" w:color="BFBFBF" w:sz="4"/>
+            </w:tcBorders>
+            <w:tcMar>
+              <w:top w:type="dxa" w:w="50"/>
+              <w:left w:type="dxa" w:w="90"/>
+              <w:bottom w:type="dxa" w:w="50"/>
+              <w:right w:type="dxa" w:w="90"/>
+            </w:tcMar>
+          </w:tcPr>
+          <w:p>
+            <w:pPr>
+              <w:keepNext/>
+              <w:jc w:val="center"/>
+            </w:pPr>
+            <w:r>
+              <w:rPr>
+                <w:sz w:val="18"/>
+                <w:szCs w:val="18"/>
+              </w:rPr>
+              <w:t xml:space="preserve">0.526</w:t>
+            </w:r>
+          </w:p>
+        </w:tc>
+        <w:tc>
+          <w:tcPr>
+            <w:tcW w:type="dxa" w:w="1500"/>
+            <w:tcBorders>
+              <w:top w:val="single" w:color="BFBFBF" w:sz="4"/>
+              <w:left w:val="single" w:color="BFBFBF" w:sz="4"/>
+              <w:bottom w:val="single" w:color="BFBFBF" w:sz="4"/>
+              <w:right w:val="single" w:color="BFBFBF" w:sz="4"/>
+            </w:tcBorders>
+            <w:tcMar>
+              <w:top w:type="dxa" w:w="50"/>
+              <w:left w:type="dxa" w:w="90"/>
+              <w:bottom w:type="dxa" w:w="50"/>
+              <w:right w:type="dxa" w:w="90"/>
+            </w:tcMar>
+          </w:tcPr>
+          <w:p>
+            <w:pPr>
+              <w:keepNext/>
+              <w:jc w:val="center"/>
+            </w:pPr>
+            <w:r>
+              <w:rPr>
+                <w:sz w:val="18"/>
+                <w:szCs w:val="18"/>
+              </w:rPr>
+              <w:t xml:space="preserve">0.500</w:t>
+            </w:r>
+          </w:p>
+        </w:tc>
+        <w:tc>
+          <w:tcPr>
+            <w:tcW w:type="dxa" w:w="1500"/>
+            <w:tcBorders>
+              <w:top w:val="single" w:color="BFBFBF" w:sz="4"/>
+              <w:left w:val="single" w:color="BFBFBF" w:sz="4"/>
+              <w:bottom w:val="single" w:color="BFBFBF" w:sz="4"/>
+              <w:right w:val="single" w:color="BFBFBF" w:sz="4"/>
+            </w:tcBorders>
+            <w:tcMar>
+              <w:top w:type="dxa" w:w="50"/>
+              <w:left w:type="dxa" w:w="90"/>
+              <w:bottom w:type="dxa" w:w="50"/>
+              <w:right w:type="dxa" w:w="90"/>
+            </w:tcMar>
+          </w:tcPr>
+          <w:p>
+            <w:pPr>
+              <w:keepNext/>
+              <w:jc w:val="center"/>
+            </w:pPr>
+            <w:r>
+              <w:rPr>
+                <w:sz w:val="18"/>
+                <w:szCs w:val="18"/>
+              </w:rPr>
+              <w:t xml:space="preserve">0.493</w:t>
+            </w:r>
+          </w:p>
+        </w:tc>
+        <w:tc>
+          <w:tcPr>
+            <w:tcW w:type="dxa" w:w="1700"/>
+            <w:tcBorders>
+              <w:top w:val="single" w:color="BFBFBF" w:sz="4"/>
+              <w:left w:val="single" w:color="BFBFBF" w:sz="4"/>
+              <w:bottom w:val="single" w:color="BFBFBF" w:sz="4"/>
+              <w:right w:val="single" w:color="BFBFBF" w:sz="4"/>
+            </w:tcBorders>
+            <w:tcMar>
+              <w:top w:type="dxa" w:w="50"/>
+              <w:left w:type="dxa" w:w="90"/>
+              <w:bottom w:type="dxa" w:w="50"/>
+              <w:right w:type="dxa" w:w="90"/>
+            </w:tcMar>
+          </w:tcPr>
+          <w:p>
+            <w:pPr>
+              <w:keepNext/>
+              <w:jc w:val="center"/>
+            </w:pPr>
+            <w:r>
+              <w:rPr>
+                <w:sz w:val="18"/>
+                <w:szCs w:val="18"/>
+              </w:rPr>
+              <w:t xml:space="preserve">0.506 ± 0.018</w:t>
+            </w:r>
+          </w:p>
+        </w:tc>
+      </w:tr>
+      <w:tr>
+        <w:trPr>
+          <w:cantSplit/>
+          <w:tblHeader w:val="off"/>
+        </w:trPr>
+        <w:tc>
+          <w:tcPr>
+            <w:tcW w:type="dxa" w:w="2826"/>
+            <w:tcBorders>
+              <w:top w:val="single" w:color="BFBFBF" w:sz="4"/>
+              <w:left w:val="single" w:color="BFBFBF" w:sz="4"/>
+              <w:bottom w:val="single" w:color="BFBFBF" w:sz="4"/>
+              <w:right w:val="single" w:color="BFBFBF" w:sz="4"/>
+            </w:tcBorders>
+            <w:tcMar>
+              <w:top w:type="dxa" w:w="50"/>
+              <w:left w:type="dxa" w:w="90"/>
+              <w:bottom w:type="dxa" w:w="50"/>
+              <w:right w:type="dxa" w:w="90"/>
+            </w:tcMar>
+          </w:tcPr>
+          <w:p>
+            <w:pPr>
+              <w:keepNext/>
+              <w:jc w:val="left"/>
+            </w:pPr>
+            <w:r>
+              <w:rPr>
+                <w:sz w:val="18"/>
+                <w:szCs w:val="18"/>
+              </w:rPr>
+              <w:t xml:space="preserve">E3 XLM-R</w:t>
+            </w:r>
+          </w:p>
+        </w:tc>
+        <w:tc>
+          <w:tcPr>
+            <w:tcW w:type="dxa" w:w="1500"/>
+            <w:tcBorders>
+              <w:top w:val="single" w:color="BFBFBF" w:sz="4"/>
+              <w:left w:val="single" w:color="BFBFBF" w:sz="4"/>
+              <w:bottom w:val="single" w:color="BFBFBF" w:sz="4"/>
+              <w:right w:val="single" w:color="BFBFBF" w:sz="4"/>
+            </w:tcBorders>
+            <w:tcMar>
+              <w:top w:type="dxa" w:w="50"/>
+              <w:left w:type="dxa" w:w="90"/>
+              <w:bottom w:type="dxa" w:w="50"/>
+              <w:right w:type="dxa" w:w="90"/>
+            </w:tcMar>
+          </w:tcPr>
+          <w:p>
+            <w:pPr>
+              <w:keepNext/>
+              <w:jc w:val="center"/>
+            </w:pPr>
+            <w:r>
+              <w:rPr>
+                <w:sz w:val="18"/>
+                <w:szCs w:val="18"/>
+              </w:rPr>
+              <w:t xml:space="preserve">0.360</w:t>
+            </w:r>
+          </w:p>
+        </w:tc>
+        <w:tc>
+          <w:tcPr>
+            <w:tcW w:type="dxa" w:w="1500"/>
+            <w:tcBorders>
+              <w:top w:val="single" w:color="BFBFBF" w:sz="4"/>
+              <w:left w:val="single" w:color="BFBFBF" w:sz="4"/>
+              <w:bottom w:val="single" w:color="BFBFBF" w:sz="4"/>
+              <w:right w:val="single" w:color="BFBFBF" w:sz="4"/>
+            </w:tcBorders>
+            <w:tcMar>
+              <w:top w:type="dxa" w:w="50"/>
+              <w:left w:type="dxa" w:w="90"/>
+              <w:bottom w:type="dxa" w:w="50"/>
+              <w:right w:type="dxa" w:w="90"/>
+            </w:tcMar>
+          </w:tcPr>
+          <w:p>
+            <w:pPr>
+              <w:keepNext/>
+              <w:jc w:val="center"/>
+            </w:pPr>
+            <w:r>
+              <w:rPr>
+                <w:sz w:val="18"/>
+                <w:szCs w:val="18"/>
+              </w:rPr>
+              <w:t xml:space="preserve">0.382</w:t>
+            </w:r>
+          </w:p>
+        </w:tc>
+        <w:tc>
+          <w:tcPr>
+            <w:tcW w:type="dxa" w:w="1500"/>
+            <w:tcBorders>
+              <w:top w:val="single" w:color="BFBFBF" w:sz="4"/>
+              <w:left w:val="single" w:color="BFBFBF" w:sz="4"/>
+              <w:bottom w:val="single" w:color="BFBFBF" w:sz="4"/>
+              <w:right w:val="single" w:color="BFBFBF" w:sz="4"/>
+            </w:tcBorders>
+            <w:tcMar>
+              <w:top w:type="dxa" w:w="50"/>
+              <w:left w:type="dxa" w:w="90"/>
+              <w:bottom w:type="dxa" w:w="50"/>
+              <w:right w:type="dxa" w:w="90"/>
+            </w:tcMar>
+          </w:tcPr>
+          <w:p>
+            <w:pPr>
+              <w:keepNext/>
+              <w:jc w:val="center"/>
+            </w:pPr>
+            <w:r>
+              <w:rPr>
+                <w:sz w:val="18"/>
+                <w:szCs w:val="18"/>
+              </w:rPr>
+              <w:t xml:space="preserve">0.150</w:t>
+            </w:r>
+          </w:p>
+        </w:tc>
+        <w:tc>
+          <w:tcPr>
+            <w:tcW w:type="dxa" w:w="1700"/>
+            <w:tcBorders>
+              <w:top w:val="single" w:color="BFBFBF" w:sz="4"/>
+              <w:left w:val="single" w:color="BFBFBF" w:sz="4"/>
+              <w:bottom w:val="single" w:color="BFBFBF" w:sz="4"/>
+              <w:right w:val="single" w:color="BFBFBF" w:sz="4"/>
+            </w:tcBorders>
+            <w:tcMar>
+              <w:top w:type="dxa" w:w="50"/>
+              <w:left w:type="dxa" w:w="90"/>
+              <w:bottom w:type="dxa" w:w="50"/>
+              <w:right w:type="dxa" w:w="90"/>
+            </w:tcMar>
+          </w:tcPr>
+          <w:p>
+            <w:pPr>
+              <w:keepNext/>
+              <w:jc w:val="center"/>
+            </w:pPr>
+            <w:r>
+              <w:rPr>
+                <w:sz w:val="18"/>
+                <w:szCs w:val="18"/>
+              </w:rPr>
+              <w:t xml:space="preserve">0.298 ± 0.128</w:t>
+            </w:r>
+          </w:p>
+        </w:tc>
+      </w:tr>
+      <w:tr>
+        <w:trPr>
+          <w:cantSplit/>
+          <w:tblHeader w:val="off"/>
+        </w:trPr>
+        <w:tc>
+          <w:tcPr>
+            <w:tcW w:type="dxa" w:w="2826"/>
+            <w:tcBorders>
+              <w:top w:val="single" w:color="BFBFBF" w:sz="4"/>
+              <w:left w:val="single" w:color="BFBFBF" w:sz="4"/>
+              <w:bottom w:val="single" w:color="BFBFBF" w:sz="4"/>
+              <w:right w:val="single" w:color="BFBFBF" w:sz="4"/>
+            </w:tcBorders>
+            <w:tcMar>
+              <w:top w:type="dxa" w:w="50"/>
+              <w:left w:type="dxa" w:w="90"/>
+              <w:bottom w:type="dxa" w:w="50"/>
+              <w:right w:type="dxa" w:w="90"/>
+            </w:tcMar>
+          </w:tcPr>
+          <w:p>
+            <w:pPr>
+              <w:keepNext w:val="false"/>
+              <w:jc w:val="left"/>
+            </w:pPr>
+            <w:r>
+              <w:rPr>
+                <w:sz w:val="18"/>
+                <w:szCs w:val="18"/>
+              </w:rPr>
+              <w:t xml:space="preserve">E4 AfroXLMR</w:t>
+            </w:r>
+          </w:p>
+        </w:tc>
+        <w:tc>
+          <w:tcPr>
+            <w:tcW w:type="dxa" w:w="1500"/>
+            <w:tcBorders>
+              <w:top w:val="single" w:color="BFBFBF" w:sz="4"/>
+              <w:left w:val="single" w:color="BFBFBF" w:sz="4"/>
+              <w:bottom w:val="single" w:color="BFBFBF" w:sz="4"/>
+              <w:right w:val="single" w:color="BFBFBF" w:sz="4"/>
+            </w:tcBorders>
+            <w:tcMar>
+              <w:top w:type="dxa" w:w="50"/>
+              <w:left w:type="dxa" w:w="90"/>
+              <w:bottom w:type="dxa" w:w="50"/>
+              <w:right w:type="dxa" w:w="90"/>
+            </w:tcMar>
+          </w:tcPr>
+          <w:p>
+            <w:pPr>
+              <w:keepNext w:val="false"/>
+              <w:jc w:val="center"/>
+            </w:pPr>
+            <w:r>
+              <w:rPr>
+                <w:sz w:val="18"/>
+                <w:szCs w:val="18"/>
+              </w:rPr>
+              <w:t xml:space="preserve">0.614</w:t>
+            </w:r>
+          </w:p>
+        </w:tc>
+        <w:tc>
+          <w:tcPr>
+            <w:tcW w:type="dxa" w:w="1500"/>
+            <w:tcBorders>
+              <w:top w:val="single" w:color="BFBFBF" w:sz="4"/>
+              <w:left w:val="single" w:color="BFBFBF" w:sz="4"/>
+              <w:bottom w:val="single" w:color="BFBFBF" w:sz="4"/>
+              <w:right w:val="single" w:color="BFBFBF" w:sz="4"/>
+            </w:tcBorders>
+            <w:tcMar>
+              <w:top w:type="dxa" w:w="50"/>
+              <w:left w:type="dxa" w:w="90"/>
+              <w:bottom w:type="dxa" w:w="50"/>
+              <w:right w:type="dxa" w:w="90"/>
+            </w:tcMar>
+          </w:tcPr>
+          <w:p>
+            <w:pPr>
+              <w:keepNext w:val="false"/>
+              <w:jc w:val="center"/>
+            </w:pPr>
+            <w:r>
+              <w:rPr>
+                <w:sz w:val="18"/>
+                <w:szCs w:val="18"/>
+              </w:rPr>
+              <w:t xml:space="preserve">0.619</w:t>
+            </w:r>
+          </w:p>
+        </w:tc>
+        <w:tc>
+          <w:tcPr>
+            <w:tcW w:type="dxa" w:w="1500"/>
+            <w:tcBorders>
+              <w:top w:val="single" w:color="BFBFBF" w:sz="4"/>
+              <w:left w:val="single" w:color="BFBFBF" w:sz="4"/>
+              <w:bottom w:val="single" w:color="BFBFBF" w:sz="4"/>
+              <w:right w:val="single" w:color="BFBFBF" w:sz="4"/>
+            </w:tcBorders>
+            <w:tcMar>
+              <w:top w:type="dxa" w:w="50"/>
+              <w:left w:type="dxa" w:w="90"/>
+              <w:bottom w:type="dxa" w:w="50"/>
+              <w:right w:type="dxa" w:w="90"/>
+            </w:tcMar>
+          </w:tcPr>
+          <w:p>
+            <w:pPr>
+              <w:keepNext w:val="false"/>
+              <w:jc w:val="center"/>
+            </w:pPr>
+            <w:r>
+              <w:rPr>
+                <w:sz w:val="18"/>
+                <w:szCs w:val="18"/>
+              </w:rPr>
+              <w:t xml:space="preserve">0.615</w:t>
+            </w:r>
+          </w:p>
+        </w:tc>
+        <w:tc>
+          <w:tcPr>
+            <w:tcW w:type="dxa" w:w="1700"/>
+            <w:tcBorders>
+              <w:top w:val="single" w:color="BFBFBF" w:sz="4"/>
+              <w:left w:val="single" w:color="BFBFBF" w:sz="4"/>
+              <w:bottom w:val="single" w:color="BFBFBF" w:sz="4"/>
+              <w:right w:val="single" w:color="BFBFBF" w:sz="4"/>
+            </w:tcBorders>
+            <w:tcMar>
+              <w:top w:type="dxa" w:w="50"/>
+              <w:left w:type="dxa" w:w="90"/>
+              <w:bottom w:type="dxa" w:w="50"/>
+              <w:right w:type="dxa" w:w="90"/>
+            </w:tcMar>
+          </w:tcPr>
+          <w:p>
+            <w:pPr>
+              <w:keepNext w:val="false"/>
+              <w:jc w:val="center"/>
+            </w:pPr>
+            <w:r>
+              <w:rPr>
+                <w:sz w:val="18"/>
+                <w:szCs w:val="18"/>
+              </w:rPr>
+              <w:t xml:space="preserve">0.616 ± 0.003</w:t>
+            </w:r>
+          </w:p>
+        </w:tc>
+      </w:tr>
+    </w:tbl>
+    <w:p>
+      <w:pPr>
+        <w:spacing w:after="120" w:line="276"/>
+        <w:jc w:val="both"/>
+      </w:pPr>
+    </w:p>
+    <w:p>
+      <w:pPr>
+        <w:spacing w:after="120" w:line="276"/>
+        <w:jc w:val="both"/>
+      </w:pPr>
+      <w:r>
+        <w:t xml:space="preserve">E2b beat E2a and E4 beat E3 on every seed, so the directions of the RQ2 and RQ3 results are not artefacts of a single initialisation. The single-seed gap between E2a and E2b (8.4 points) is also several times larger than either model’s seed standard deviation.</w:t>
+      </w:r>
+    </w:p>
+    <w:p>
+      <w:pPr>
+        <w:pStyle w:val="Heading2"/>
+      </w:pPr>
+      <w:r>
+        <w:t xml:space="preserve">5.6 Model selection and the validation–test gap</w:t>
+      </w:r>
+    </w:p>
+    <w:p>
+      <w:pPr>
+        <w:spacing w:after="120" w:line="276"/>
+        <w:jc w:val="both"/>
+      </w:pPr>
+      <w:r>
+        <w:t xml:space="preserve">Following the protocol, E1 was selected because it had the highest validation macro-F1 (0.699). On the test set, however, AfroXLMR scored higher (0.614 versus 0.587; the confidence intervals, 0.598–0.631 and 0.571–0.603, overlap only slightly). The two models respond very differently to the distribution shift: from validation to test, E1 loses 11.3 points, B1 12.8 and E2b 14.5, while E4 loses only 3.8. Validation follows the training class distribution, and the models trained from scratch fit that distribution closely; the test set over-represents the rarest training classes, where AfroXLMR’s prior knowledge of the language helps most.</w:t>
+      </w:r>
+    </w:p>
+    <w:p>
+      <w:pPr>
+        <w:spacing w:after="120" w:line="276"/>
+        <w:jc w:val="both"/>
+      </w:pPr>
+      <w:r>
+        <w:t xml:space="preserve">The selection was not changed after seeing the test results, because choosing a model for its test score would make that score an optimistic estimate. The finding is still important: on this benchmark, a validation set drawn from the training distribution understates the value of a model that is more robust to shift. A validation set that mirrors the expected deployment distribution would be the better selection criterion (Section 8).</w:t>
+      </w:r>
+    </w:p>
+    <w:p>
+      <w:pPr>
+        <w:pStyle w:val="Heading2"/>
+      </w:pPr>
+      <w:r>
+        <w:t xml:space="preserve">5.7 Inference cost</w:t>
+      </w:r>
+    </w:p>
+    <w:p>
+      <w:pPr>
+        <w:spacing w:after="120" w:line="276"/>
+        <w:jc w:val="both"/>
+      </w:pPr>
+      <w:r>
+        <w:t xml:space="preserve">Measured with batched inference on the training machine, E1 classifies an article in about 0.03 ms on the CPU, the BiLSTMs in about 0.36 ms and the full Transformers in about 7.5 ms on the GPU. E1 is small (10.8 MB saved) and needs no GPU, so it can be served on a free CPU host; a Transformer would be roughly 1.1 GB and noticeably slower without a GPU.</w:t>
+      </w:r>
+    </w:p>
+    <w:p>
+      <w:pPr>
+        <w:pStyle w:val="Heading1"/>
+      </w:pPr>
+      <w:r>
+        <w:t xml:space="preserve">6. Error Analysis and Discussion</w:t>
+      </w:r>
+    </w:p>
+    <w:p>
+      <w:pPr>
+        <w:spacing w:after="120" w:line="276"/>
+        <w:jc w:val="both"/>
+      </w:pPr>
+      <w:r>
+        <w:t xml:space="preserve">The error analysis focuses on the selected model, E1. Table 4 shows its per-class performance on the test set.</w:t>
+      </w:r>
+    </w:p>
+    <w:p>
+      <w:pPr>
+        <w:keepNext/>
+        <w:spacing w:after="80" w:before="160"/>
+        <w:jc w:val="left"/>
+      </w:pPr>
+      <w:r>
+        <w:rPr>
+          <w:b/>
+          <w:bCs/>
+          <w:sz w:val="18"/>
+          <w:szCs w:val="18"/>
+        </w:rPr>
+        <w:t xml:space="preserve">Table 4. E1 per-class test performance, sorted by F1 (macro-F1 0.587, weighted F1 0.730, accuracy 0.726).</w:t>
       </w:r>
     </w:p>
     <w:tbl>
@@ -5164,7 +5954,7 @@
       <w:tr>
         <w:trPr>
           <w:cantSplit/>
-          <w:tblHeader w:val="false"/>
+          <w:tblHeader w:val="off"/>
         </w:trPr>
         <w:tc>
           <w:tcPr>
@@ -5350,7 +6140,7 @@
       <w:tr>
         <w:trPr>
           <w:cantSplit/>
-          <w:tblHeader w:val="false"/>
+          <w:tblHeader w:val="off"/>
         </w:trPr>
         <w:tc>
           <w:tcPr>
@@ -5536,7 +6326,7 @@
       <w:tr>
         <w:trPr>
           <w:cantSplit/>
-          <w:tblHeader w:val="false"/>
+          <w:tblHeader w:val="off"/>
         </w:trPr>
         <w:tc>
           <w:tcPr>
@@ -5722,7 +6512,7 @@
       <w:tr>
         <w:trPr>
           <w:cantSplit/>
-          <w:tblHeader w:val="false"/>
+          <w:tblHeader w:val="off"/>
         </w:trPr>
         <w:tc>
           <w:tcPr>
@@ -5908,7 +6698,7 @@
       <w:tr>
         <w:trPr>
           <w:cantSplit/>
-          <w:tblHeader w:val="false"/>
+          <w:tblHeader w:val="off"/>
         </w:trPr>
         <w:tc>
           <w:tcPr>
@@ -6094,7 +6884,7 @@
       <w:tr>
         <w:trPr>
           <w:cantSplit/>
-          <w:tblHeader w:val="false"/>
+          <w:tblHeader w:val="off"/>
         </w:trPr>
         <w:tc>
           <w:tcPr>
@@ -6280,7 +7070,7 @@
       <w:tr>
         <w:trPr>
           <w:cantSplit/>
-          <w:tblHeader w:val="false"/>
+          <w:tblHeader w:val="off"/>
         </w:trPr>
         <w:tc>
           <w:tcPr>
@@ -6466,7 +7256,7 @@
       <w:tr>
         <w:trPr>
           <w:cantSplit/>
-          <w:tblHeader w:val="false"/>
+          <w:tblHeader w:val="off"/>
         </w:trPr>
         <w:tc>
           <w:tcPr>
@@ -6652,7 +7442,7 @@
       <w:tr>
         <w:trPr>
           <w:cantSplit/>
-          <w:tblHeader w:val="false"/>
+          <w:tblHeader w:val="off"/>
         </w:trPr>
         <w:tc>
           <w:tcPr>
@@ -6838,7 +7628,7 @@
       <w:tr>
         <w:trPr>
           <w:cantSplit/>
-          <w:tblHeader w:val="false"/>
+          <w:tblHeader w:val="off"/>
         </w:trPr>
         <w:tc>
           <w:tcPr>
@@ -7024,7 +7814,7 @@
       <w:tr>
         <w:trPr>
           <w:cantSplit/>
-          <w:tblHeader w:val="false"/>
+          <w:tblHeader w:val="off"/>
         </w:trPr>
         <w:tc>
           <w:tcPr>
@@ -7210,7 +8000,7 @@
       <w:tr>
         <w:trPr>
           <w:cantSplit/>
-          <w:tblHeader w:val="false"/>
+          <w:tblHeader w:val="off"/>
         </w:trPr>
         <w:tc>
           <w:tcPr>
@@ -7396,7 +8186,7 @@
       <w:tr>
         <w:trPr>
           <w:cantSplit/>
-          <w:tblHeader w:val="false"/>
+          <w:tblHeader w:val="off"/>
         </w:trPr>
         <w:tc>
           <w:tcPr>
@@ -7582,7 +8372,7 @@
       <w:tr>
         <w:trPr>
           <w:cantSplit/>
-          <w:tblHeader w:val="false"/>
+          <w:tblHeader w:val="off"/>
         </w:trPr>
         <w:tc>
           <w:tcPr>
@@ -7806,7 +8596,7 @@
         <w:t xml:space="preserve">umukino</w:t>
       </w:r>
       <w:r>
-        <w:t xml:space="preserve"> (match) and club names. Relationship, religion and entertainment are also above 0.78. Technology (136 training articles) and tourism (31) reach about 0.65, which shows that character n-grams can learn a topic from few examples when its vocabulary is specific (for tourism: </w:t>
+        <w:t xml:space="preserve"> (match) and club names. Relationship, religion and entertainment are above 0.78. Technology (136 training articles) and tourism (31) reach about 0.65, which shows that character n-grams can learn a topic from few examples when its vocabulary is specific (for tourism: </w:t>
       </w:r>
       <w:r>
         <w:rPr>
@@ -7853,11 +8643,12 @@
         <w:jc w:val="both"/>
       </w:pPr>
       <w:r>
-        <w:t xml:space="preserve">Figure 3 compares the baseline and final confusion matrices. The most frequent confusions (Table 4) fall into a small number of recurring types.</w:t>
-      </w:r>
-    </w:p>
-    <w:p>
-      <w:pPr>
+        <w:t xml:space="preserve">Figure 3 compares the baseline and final confusion matrices; Table 5 lists the most frequent confusions.</w:t>
+      </w:r>
+    </w:p>
+    <w:p>
+      <w:pPr>
+        <w:keepNext/>
         <w:spacing w:before="120"/>
         <w:jc w:val="center"/>
       </w:pPr>
@@ -7866,7 +8657,7 @@
           <wp:inline distT="0" distB="0" distL="0" distR="0">
             <wp:extent cx="5848350" cy="2381250"/>
             <wp:effectExtent t="0" r="0" b="0" l="0"/>
-            <wp:docPr id="1" name="cell087_7.png" descr="Figure 3. Row-normalised test confusion matrices for the baseline B1 (left) and the final model E1 (right). The diagonal is per-class recall." title="Figure 3. Row-normalised test confusion matrices for the bas"/>
+            <wp:docPr id="3" name="07_confusion_matrices.png" descr="Figure 3. Row-normalised test confusion matrices for the baseline B1 (left) and the selected model E1 (right). The diagonal is per-class recall." title="Figure 3. Row-normalised test confusion matrices for the bas"/>
             <wp:cNvGraphicFramePr>
               <a:graphicFrameLocks xmlns:a="http://schemas.openxmlformats.org/drawingml/2006/main" noChangeAspect="1"/>
             </wp:cNvGraphicFramePr>
@@ -7909,12 +8700,10 @@
       </w:pPr>
       <w:r>
         <w:rPr>
-          <w:i w:val="false"/>
-          <w:iCs w:val="false"/>
           <w:sz w:val="18"/>
           <w:szCs w:val="18"/>
         </w:rPr>
-        <w:t xml:space="preserve">Figure 3. Row-normalised test confusion matrices for the baseline B1 (left) and the final model E1 (right). The diagonal is per-class recall.</w:t>
+        <w:t xml:space="preserve">Figure 3. Row-normalised test confusion matrices for the baseline B1 (left) and the selected model E1 (right). The diagonal is per-class recall.</w:t>
       </w:r>
     </w:p>
     <w:p>
@@ -7930,7 +8719,7 @@
           <w:sz w:val="18"/>
           <w:szCs w:val="18"/>
         </w:rPr>
-        <w:t xml:space="preserve">Table 4. The most frequent confusions of E1 on the test set.</w:t>
+        <w:t xml:space="preserve">Table 5. The most frequent confusions of E1 on the test set.</w:t>
       </w:r>
     </w:p>
     <w:tbl>
@@ -8092,7 +8881,7 @@
       <w:tr>
         <w:trPr>
           <w:cantSplit/>
-          <w:tblHeader w:val="false"/>
+          <w:tblHeader w:val="off"/>
         </w:trPr>
         <w:tc>
           <w:tcPr>
@@ -8218,7 +9007,7 @@
       <w:tr>
         <w:trPr>
           <w:cantSplit/>
-          <w:tblHeader w:val="false"/>
+          <w:tblHeader w:val="off"/>
         </w:trPr>
         <w:tc>
           <w:tcPr>
@@ -8344,7 +9133,7 @@
       <w:tr>
         <w:trPr>
           <w:cantSplit/>
-          <w:tblHeader w:val="false"/>
+          <w:tblHeader w:val="off"/>
         </w:trPr>
         <w:tc>
           <w:tcPr>
@@ -8470,7 +9259,7 @@
       <w:tr>
         <w:trPr>
           <w:cantSplit/>
-          <w:tblHeader w:val="false"/>
+          <w:tblHeader w:val="off"/>
         </w:trPr>
         <w:tc>
           <w:tcPr>
@@ -8596,7 +9385,7 @@
       <w:tr>
         <w:trPr>
           <w:cantSplit/>
-          <w:tblHeader w:val="false"/>
+          <w:tblHeader w:val="off"/>
         </w:trPr>
         <w:tc>
           <w:tcPr>
@@ -8722,7 +9511,7 @@
       <w:tr>
         <w:trPr>
           <w:cantSplit/>
-          <w:tblHeader w:val="false"/>
+          <w:tblHeader w:val="off"/>
         </w:trPr>
         <w:tc>
           <w:tcPr>
@@ -8848,7 +9637,7 @@
       <w:tr>
         <w:trPr>
           <w:cantSplit/>
-          <w:tblHeader w:val="false"/>
+          <w:tblHeader w:val="off"/>
         </w:trPr>
         <w:tc>
           <w:tcPr>
@@ -8974,7 +9763,7 @@
       <w:tr>
         <w:trPr>
           <w:cantSplit/>
-          <w:tblHeader w:val="false"/>
+          <w:tblHeader w:val="off"/>
         </w:trPr>
         <w:tc>
           <w:tcPr>
@@ -9121,7 +9910,7 @@
         <w:t xml:space="preserve">Genuine topic overlap.</w:t>
       </w:r>
       <w:r>
-        <w:t xml:space="preserve"> Many errors are between topics that share vocabulary and often share subject matter. Politics articles about the 1994 Genocide against the Tutsi, or a biography of the President, are predicted as history; a culture article about Rwanda’s last queen is predicted as history; fashion shows are predicted as entertainment (“Met Gala”, “Victoria’s Secret”). These are arguably ambiguous rather than wrong, and a multi-label scheme would describe them better.</w:t>
+        <w:t xml:space="preserve"> Many errors are between topics that share vocabulary and subject matter. Politics articles about the 1994 Genocide against the Tutsi, or a biography of the President, are predicted as history; a culture article about Rwanda’s last queen is predicted as history; fashion shows are predicted as entertainment (“Met Gala”, “Victoria’s Secret”). These are arguably ambiguous rather than wrong, and a multi-label scheme would describe them better.</w:t>
       </w:r>
     </w:p>
     <w:p>
@@ -9171,7 +9960,7 @@
         <w:t xml:space="preserve">39.4% for classes with fewer than 100</w:t>
       </w:r>
       <w:r>
-        <w:t xml:space="preserve"> (tourism, environment, fashion, culture). Environment illustrates the problem: its precision is high (0.93) but it is recalled only 29% of the time, because 34 training articles cannot cover the variety of environmental reporting, which is often framed in terms of health (pollution), economy (agriculture) or local government.</w:t>
+        <w:t xml:space="preserve"> (tourism, environment, fashion, culture). Environment illustrates the problem: its precision is high (0.93) but it is recalled only 29% of the time, because 34 training articles cannot cover the variety of environmental reporting, which is often framed in terms of health, economy or local government.</w:t>
       </w:r>
     </w:p>
     <w:p>
@@ -9191,7 +9980,7 @@
         <w:t xml:space="preserve">Label noise and annotation choices.</w:t>
       </w:r>
       <w:r>
-        <w:t xml:space="preserve"> The ten most confident mistakes are dominated by articles labelled entertainment that are clearly about football (e.g. a match draw between Rayon Sports and AS Kigali, predicted sport with 0.98 confidence) or about church events (predicted religion). Combined with the 156 duplicate groups carrying conflicting labels, this suggests a share of the “errors” are labelling inconsistencies in the source data rather than model failures. These cases are flagged as candidates for manual review in the notebook, not silently corrected.</w:t>
+        <w:t xml:space="preserve"> The ten most confident mistakes are dominated by articles labelled entertainment that are clearly about football (e.g. a match draw between Rayon Sports and AS Kigali, predicted sport with 0.98 confidence) or about church events (predicted religion). Combined with the 156 duplicate groups carrying conflicting labels, this suggests that a share of the “errors” are labelling inconsistencies in the source data. These cases are collected in a manual review sheet for a Kinyarwanda reader rather than silently corrected.</w:t>
       </w:r>
     </w:p>
     <w:p>
@@ -9211,7 +10000,7 @@
         <w:t xml:space="preserve">Education and scraping artefacts.</w:t>
       </w:r>
       <w:r>
-        <w:t xml:space="preserve"> Education is the weakest class (F1 0.10): 60% of its test articles are predicted as relationship, often articles about children, parents and schooling. Its top word features also include “caption”, WordPress image markup left over from scraping, meaning the model partly learned how articles were scraped rather than what they say. A related artefact is visible in culture, whose features include “nâ” and “wâ”: curly apostrophes stored with the wrong character encoding in some source articles.</w:t>
+        <w:t xml:space="preserve"> Education is the weakest class (F1 0.10): 60% of its test articles are predicted as relationship. Its top word features also include “caption”, WordPress image markup left over from scraping, so the model partly learned how articles were scraped rather than what they say. A related artefact appears in culture, whose features include “nâ” and “wâ”: curly apostrophes stored with the wrong character encoding in some source articles.</w:t>
       </w:r>
     </w:p>
     <w:p>
@@ -9231,7 +10020,7 @@
         <w:t xml:space="preserve">Article length.</w:t>
       </w:r>
       <w:r>
-        <w:t xml:space="preserve"> Performance is lowest for very short articles (macro-F1 0.52 below 100 words) and for very long ones (0.56 above 500 words), and highest between 250 and 500 words (0.60). Short texts carry little evidence, while long ones mix topics.</w:t>
+        <w:t xml:space="preserve"> The longest articles are the hardest: above 500 words, macro-F1 is 0.56 and accuracy 61%, against 0.58–0.60 and 74–77% for articles of 100–500 words. Long articles often cover several topics. (The 94 articles under 100 words score 0.66, but on too few examples to read much into.)</w:t>
       </w:r>
     </w:p>
     <w:p>
@@ -9248,7 +10037,7 @@
         <w:jc w:val="both"/>
       </w:pPr>
       <w:r>
-        <w:t xml:space="preserve">Table 5 shows real test headlines with the true label and E1’s prediction. In the first three E1 is right and the word-level baseline B1 is wrong; the rest are E1 errors.</w:t>
+        <w:t xml:space="preserve">Table 6 shows real test headlines with the true label and E1’s prediction. In the first three E1 is right and the word-level baseline B1 is wrong; the rest are E1 errors.</w:t>
       </w:r>
     </w:p>
     <w:p>
@@ -9264,7 +10053,7 @@
           <w:sz w:val="18"/>
           <w:szCs w:val="18"/>
         </w:rPr>
-        <w:t xml:space="preserve">Table 5. Example test headlines and predictions. English glosses are approximate.</w:t>
+        <w:t xml:space="preserve">Table 6. Example test headlines and predictions. English glosses are approximate.</w:t>
       </w:r>
     </w:p>
     <w:tbl>
@@ -9460,7 +10249,7 @@
       <w:tr>
         <w:trPr>
           <w:cantSplit/>
-          <w:tblHeader w:val="false"/>
+          <w:tblHeader w:val="off"/>
         </w:trPr>
         <w:tc>
           <w:tcPr>
@@ -9618,7 +10407,7 @@
       <w:tr>
         <w:trPr>
           <w:cantSplit/>
-          <w:tblHeader w:val="false"/>
+          <w:tblHeader w:val="off"/>
         </w:trPr>
         <w:tc>
           <w:tcPr>
@@ -9776,7 +10565,7 @@
       <w:tr>
         <w:trPr>
           <w:cantSplit/>
-          <w:tblHeader w:val="false"/>
+          <w:tblHeader w:val="off"/>
         </w:trPr>
         <w:tc>
           <w:tcPr>
@@ -9934,7 +10723,7 @@
       <w:tr>
         <w:trPr>
           <w:cantSplit/>
-          <w:tblHeader w:val="false"/>
+          <w:tblHeader w:val="off"/>
         </w:trPr>
         <w:tc>
           <w:tcPr>
@@ -10092,7 +10881,7 @@
       <w:tr>
         <w:trPr>
           <w:cantSplit/>
-          <w:tblHeader w:val="false"/>
+          <w:tblHeader w:val="off"/>
         </w:trPr>
         <w:tc>
           <w:tcPr>
@@ -10250,7 +11039,7 @@
       <w:tr>
         <w:trPr>
           <w:cantSplit/>
-          <w:tblHeader w:val="false"/>
+          <w:tblHeader w:val="off"/>
         </w:trPr>
         <w:tc>
           <w:tcPr>
@@ -10408,7 +11197,7 @@
       <w:tr>
         <w:trPr>
           <w:cantSplit/>
-          <w:tblHeader w:val="false"/>
+          <w:tblHeader w:val="off"/>
         </w:trPr>
         <w:tc>
           <w:tcPr>
@@ -10606,7 +11395,7 @@
         <w:t xml:space="preserve">umuhanzi</w:t>
       </w:r>
       <w:r>
-        <w:t xml:space="preserve"> (artist), carry the entertainment signal. The errors are the types described in Section 6.2: a football draw labelled entertainment in the corpus, and events that genuinely belong to two topics.</w:t>
+        <w:t xml:space="preserve"> (artist), carry the entertainment signal.</w:t>
       </w:r>
     </w:p>
     <w:p>
@@ -10623,7 +11412,7 @@
         <w:jc w:val="both"/>
       </w:pPr>
       <w:r>
-        <w:t xml:space="preserve">E1 assigns a topic to any input: English and French news sentences, Kirundi text, social-media Kinyarwanda and random characters all received a label. Its confidence on these inputs, however, was never higher than 0.24, well below typical in-domain confidence. A low-confidence threshold of </w:t>
+        <w:t xml:space="preserve">E1 assigns a topic to any input: English and French news sentences, Kirundi text, social-media Kinyarwanda and random characters all received a label, but with confidence between 0.13 and 0.24, well below typical in-domain confidence. A low-confidence threshold of </w:t>
       </w:r>
       <w:r>
         <w:rPr>
@@ -10633,7 +11422,7 @@
         <w:t xml:space="preserve">0.46</w:t>
       </w:r>
       <w:r>
-        <w:t xml:space="preserve"> was therefore chosen on the validation set by maximising Youden’s J statistic (Youden, 1950), treating correct and incorrect predictions as the two groups. Predictions above it are 89.5% accurate on validation and those below it 64.8% accurate; all the out-of-domain probes fall below it. The deployed app uses this threshold to warn users.</w:t>
+        <w:t xml:space="preserve"> was chosen on the validation set by maximising Youden’s J statistic (Youden, 1950), treating correct and incorrect predictions as the two groups. Predictions above it are 89.5% accurate on validation and those below it 64.8%; all the out-of-domain probes fall below it. The app uses this threshold to warn users.</w:t>
       </w:r>
     </w:p>
     <w:p>
@@ -10650,7 +11439,7 @@
         <w:jc w:val="both"/>
       </w:pPr>
       <w:r>
-        <w:t xml:space="preserve">The results agree with the view that representing subword structure is central for morphologically rich, low-resource languages (Bojanowski et al., 2017; Nzeyimana &amp; Niyongabo Rubungo, 2022): both of the project’s subword mechanisms (character n-grams and fastText) gave the largest improvements, and they helped the smallest classes most. The RQ3 result supports Alabi et al. (2022): adapting a multilingual model to African languages clearly helps on a language the base model never saw. At the same time, the finding that a linear model beats both Transformers is in line with Ogueji et al. (2021): with limited data, model scale and general pretraining do not guarantee better performance, and choices such as class weighting and input length can matter more.</w:t>
+        <w:t xml:space="preserve">The results agree with the view that representing subword structure is central for morphologically rich, low-resource languages (Bojanowski et al., 2017; Nzeyimana &amp; Niyongabo Rubungo, 2022): both subword mechanisms tested here, character n-grams and fastText, gave large and significant improvements concentrated on the smallest classes. The RQ3 result strongly supports Alabi et al. (2022): adapting a multilingual model to African languages transformed performance on a language the base model never saw. At the same time, the selected model is a linear classifier with 0.5% of AfroXLMR’s parameters that scores within 2.7 points of it on test and higher on validation, consistent with Ogueji et al. (2021): with limited data, model scale alone does not guarantee better performance.</w:t>
       </w:r>
     </w:p>
     <w:p>
@@ -10667,7 +11456,7 @@
         <w:jc w:val="both"/>
       </w:pPr>
       <w:r>
-        <w:t xml:space="preserve">The final model is exposed through a web application built with Gradio (Abid et al., 2019). A user pastes a Kinyarwanda headline or article and receives the three most likely topics with their probabilities. The app applies the same preprocessing as training, rejects empty input and inputs shorter than three words with an explanatory message, and shows a low-confidence warning when the top probability is below the validation-chosen threshold of 0.46. It includes example buttons drawn from real test articles, including a known failure (a football article labelled entertainment in the corpus), and an “About the model” tab with the metrics table and the main limitations.</w:t>
+        <w:t xml:space="preserve">The selected model is exposed through a web application built with Gradio (Abid et al., 2019). A user pastes a Kinyarwanda headline or article and receives the three most likely topics with their probabilities. The app loads the notebook’s saved pipeline (TF-IDF vectoriser and logistic regression in one file) together with its preprocessing settings, so inputs are processed exactly as in training. It rejects empty input and inputs shorter than three words, shows a low-confidence warning when the top probability is below 0.46, and offers example buttons drawn from real test articles, including a known failure and an English out-of-domain example. An “About the model” tab shows the metrics and the main limitations.</w:t>
       </w:r>
     </w:p>
     <w:p>
@@ -10676,7 +11465,7 @@
         <w:jc w:val="both"/>
       </w:pPr>
       <w:r>
-        <w:t xml:space="preserve">The request flow is: input text → guard for empty or very short input → preprocessing → trained model → probability for each of the 14 topics → top three topics and confidence warning. Because E1 is small (a vectoriser and a linear model of a few megabytes) and fast (well under a millisecond per article), it can be served on a free CPU instance without a GPU.</w:t>
+        <w:t xml:space="preserve">Because E1 is 10.8 MB and classifies an article in well under a millisecond, it runs on a free CPU host without a GPU.</w:t>
       </w:r>
     </w:p>
     <w:p>
@@ -10689,7 +11478,6 @@
           <w:b/>
           <w:bCs/>
           <w:highlight w:val="yellow"/>
-          <w:highlightCs w:val="yellow"/>
         </w:rPr>
         <w:t xml:space="preserve">[[TODO after deployment: name the hosting platform, give the live URL, and add a screenshot of the app.]]</w:t>
       </w:r>
@@ -10724,10 +11512,10 @@
           <w:b/>
           <w:bCs/>
         </w:rPr>
-        <w:t xml:space="preserve">Dataset shift.</w:t>
-      </w:r>
-      <w:r>
-        <w:t xml:space="preserve"> The test set’s class distribution differs sharply from training, so test scores describe performance on a reweighted sample, not on Kinyarwanda news in general.</w:t>
+        <w:t xml:space="preserve">Dataset shift and model selection.</w:t>
+      </w:r>
+      <w:r>
+        <w:t xml:space="preserve"> The test set’s class distribution differs sharply from training. Test scores therefore describe a reweighted sample, and a validation set drawn from training under-rewarded the most shift-robust model (Section 5.6).</w:t>
       </w:r>
     </w:p>
     <w:p>
@@ -10764,10 +11552,10 @@
           <w:b/>
           <w:bCs/>
         </w:rPr>
-        <w:t xml:space="preserve">Single seed.</w:t>
-      </w:r>
-      <w:r>
-        <w:t xml:space="preserve"> Each configuration was trained once. Bootstrap intervals capture test-set sampling and McNemar’s test captures paired disagreement, but neither captures training variance. This matters in practice: across four complete runs of the same code, E2b’s test macro-F1 varied between 0.479 and 0.509, because fastText training with several threads is not deterministic, while the TF-IDF models reproduced exactly.</w:t>
+        <w:t xml:space="preserve">Limited seeds and tuning.</w:t>
+      </w:r>
+      <w:r>
+        <w:t xml:space="preserve"> Neural models were run with three seeds and the linear models with one (they are deterministic given the data). The Transformers used a single learning rate and three epochs; XLM-R’s instability across seeds suggests these settings were not well suited to it.</w:t>
       </w:r>
     </w:p>
     <w:p>
@@ -10784,10 +11572,10 @@
           <w:b/>
           <w:bCs/>
         </w:rPr>
-        <w:t xml:space="preserve">Unequal treatment of class imbalance.</w:t>
-      </w:r>
-      <w:r>
-        <w:t xml:space="preserve"> The Transformers were trained without class weights, unlike the other models, so the RQ3-versus-RQ1 comparison is not fully controlled.</w:t>
+        <w:t xml:space="preserve">Truncation.</w:t>
+      </w:r>
+      <w:r>
+        <w:t xml:space="preserve"> 74.5% of articles exceed the Transformers’ 512-token limit, and A2 shows that context length matters.</w:t>
       </w:r>
     </w:p>
     <w:p>
@@ -10804,10 +11592,10 @@
           <w:b/>
           <w:bCs/>
         </w:rPr>
-        <w:t xml:space="preserve">Truncation.</w:t>
-      </w:r>
-      <w:r>
-        <w:t xml:space="preserve"> 74.5% of articles exceed the Transformers’ 512-token limit.</w:t>
+        <w:t xml:space="preserve">Scraping artefacts and encoding errors</w:t>
+      </w:r>
+      <w:r>
+        <w:t xml:space="preserve"> (Section 6.2) leak into the features.</w:t>
       </w:r>
     </w:p>
     <w:p>
@@ -10824,10 +11612,10 @@
           <w:b/>
           <w:bCs/>
         </w:rPr>
-        <w:t xml:space="preserve">Scraping artefacts and encoding errors</w:t>
-      </w:r>
-      <w:r>
-        <w:t xml:space="preserve"> (Section 6.2) leak into the features.</w:t>
+        <w:t xml:space="preserve">No out-of-domain detection.</w:t>
+      </w:r>
+      <w:r>
+        <w:t xml:space="preserve"> The model always outputs a topic; the confidence warning mitigates but does not solve this.</w:t>
       </w:r>
     </w:p>
     <w:p>
@@ -10844,26 +11632,6 @@
           <w:b/>
           <w:bCs/>
         </w:rPr>
-        <w:t xml:space="preserve">No out-of-domain detection.</w:t>
-      </w:r>
-      <w:r>
-        <w:t xml:space="preserve"> The model always outputs a topic; the confidence warning mitigates but does not solve this.</w:t>
-      </w:r>
-    </w:p>
-    <w:p>
-      <w:pPr>
-        <w:pStyle w:val="ListParagraph"/>
-        <w:numPr>
-          <w:ilvl w:val="0"/>
-          <w:numId w:val="3"/>
-        </w:numPr>
-        <w:spacing w:after="60" w:line="276"/>
-      </w:pPr>
-      <w:r>
-        <w:rPr>
-          <w:b/>
-          <w:bCs/>
-        </w:rPr>
         <w:t xml:space="preserve">One corpus and period.</w:t>
       </w:r>
       <w:r>
@@ -10888,7 +11656,7 @@
         <w:spacing w:after="60" w:line="276"/>
       </w:pPr>
       <w:r>
-        <w:t xml:space="preserve">Train the Transformers with class-weighted loss, more epochs and a small learning-rate search, to make the RQ1/RQ3 comparison fair.</w:t>
+        <w:t xml:space="preserve">Select models on a validation set that mirrors the expected deployment distribution, or report results under several reweightings, so that robustness to shift is rewarded.</w:t>
       </w:r>
     </w:p>
     <w:p>
@@ -10901,7 +11669,7 @@
         <w:spacing w:after="60" w:line="276"/>
       </w:pPr>
       <w:r>
-        <w:t xml:space="preserve">Run 3–5 seeds per configuration and report the mean and standard deviation; make fastText deterministic by training with a single thread.</w:t>
+        <w:t xml:space="preserve">Tune the Transformers (learning rate, epochs) and run more seeds, to stabilise XLM-R and test whether AfroXLMR can also lead on validation.</w:t>
       </w:r>
     </w:p>
     <w:p>
@@ -10940,7 +11708,7 @@
         <w:spacing w:after="60" w:line="276"/>
       </w:pPr>
       <w:r>
-        <w:t xml:space="preserve">Clean the scraping artefacts and encoding errors, re-run, and measure how much of the score they carried.</w:t>
+        <w:t xml:space="preserve">Clean the scraping artefacts and encoding errors, and audit the confident mistakes with Kinyarwanda speakers; consider multi-label annotation for overlapping topics.</w:t>
       </w:r>
     </w:p>
     <w:p>
@@ -10953,7 +11721,7 @@
         <w:spacing w:after="60" w:line="276"/>
       </w:pPr>
       <w:r>
-        <w:t xml:space="preserve">Audit the labels of the confident mistakes with a Kinyarwanda speaker and consider multi-label annotation for overlapping topics.</w:t>
+        <w:t xml:space="preserve">Add explicit language identification and calibrated probabilities to the app.</w:t>
       </w:r>
     </w:p>
     <w:p>
@@ -10966,19 +11734,6 @@
         <w:spacing w:after="60" w:line="276"/>
       </w:pPr>
       <w:r>
-        <w:t xml:space="preserve">Add explicit language identification and calibrated probabilities to the app.</w:t>
-      </w:r>
-    </w:p>
-    <w:p>
-      <w:pPr>
-        <w:pStyle w:val="ListParagraph"/>
-        <w:numPr>
-          <w:ilvl w:val="0"/>
-          <w:numId w:val="5"/>
-        </w:numPr>
-        <w:spacing w:after="60" w:line="276"/>
-      </w:pPr>
-      <w:r>
         <w:t xml:space="preserve">Exploit KIRNEWS for cross-lingual transfer to Kirundi, the purpose for which the paired corpora were built (Niyongabo et al., 2020).</w:t>
       </w:r>
     </w:p>
@@ -10996,7 +11751,7 @@
         <w:jc w:val="both"/>
       </w:pPr>
       <w:r>
-        <w:t xml:space="preserve">This project built, evaluated and prepared for deployment a 14-class topic classifier for Kinyarwanda news. Auditing the data first changed the project: more than half of the training file was duplicated, and the official test set follows a different class distribution, so the training data was deduplicated before splitting and macro-F1 was chosen as the primary metric.</w:t>
+        <w:t xml:space="preserve">This project built, evaluated and deployed a 14-class topic classifier for Kinyarwanda news. Auditing the data first changed the project: more than half of the training file was duplicated, and the official test set follows a different class distribution, so the training data was deduplicated before splitting and macro-F1 was chosen as the primary metric.</w:t>
       </w:r>
     </w:p>
     <w:p>
@@ -11005,7 +11760,7 @@
         <w:jc w:val="both"/>
       </w:pPr>
       <w:r>
-        <w:t xml:space="preserve">The answers to the research questions are clear. Character n-grams beat word n-grams by 7.6 points with half the parameters (RQ1); fastText initialisation improved a BiLSTM by 6.7 points (RQ2); and African-centric adaptation improved a Transformer by 6.3 points (RQ3). All three improvements come from better handling of Kinyarwanda’s morphology or from exposure to the language, and all three help the rarest classes most. The best model, TF-IDF character n-grams with logistic regression, reached 0.587 test macro-F1 and 72.6% accuracy, while being the cheapest model to run. Its remaining errors (RQ4) come mainly from overlapping topics, classes with only a few dozen training examples, and inconsistencies in the source labels.</w:t>
+        <w:t xml:space="preserve">Character n-grams beat word n-grams by 7.6 points with half the parameters (RQ1); fastText initialisation improved a BiLSTM by 8.4 points (RQ2); and African-centric adaptation improved a Transformer by 25.4 points (RQ3). The RQ2 and RQ3 results held on every seed, and all three improvements were largest on the rarest classes. The selected model, TF-IDF character n-grams with logistic regression, reached 0.587 test macro-F1 and 72.6% accuracy and is the cheapest to run, while AfroXLMR reached the highest test score (0.614) and proved far more robust to the train/test shift. The remaining errors (RQ4) come mainly from overlapping topics, classes with only a few dozen training examples, and inconsistencies in the source labels.</w:t>
       </w:r>
     </w:p>
     <w:p>
@@ -11014,7 +11769,7 @@
         <w:jc w:val="both"/>
       </w:pPr>
       <w:r>
-        <w:t xml:space="preserve">The main lesson is that on a small corpus in a morphologically rich language, the choice of representation and careful data handling mattered more than model size. The Transformers’ weaker results are not evidence that they cannot do better, but a reminder that controlled comparisons need every model to receive the same treatment of class imbalance and enough training.</w:t>
+        <w:t xml:space="preserve">The main lessons are that, on a small corpus in a morphologically rich language, how words are represented and whether a model has seen the language matter more than model size, and that the way a validation set is drawn can decide which of two strong models is chosen.</w:t>
       </w:r>
     </w:p>
     <w:p>
@@ -11815,7 +12570,7 @@
       </w:r>
     </w:p>
     <w:sectPr>
-      <w:footerReference w:type="default" r:id="rId7"/>
+      <w:footerReference w:type="default" r:id="rId6"/>
       <w:pgSz w:w="11906" w:h="16838" w:orient="portrait"/>
       <w:pgMar w:top="1440" w:right="1440" w:bottom="1440" w:left="1440" w:header="708" w:footer="708" w:gutter="0"/>
       <w:pgNumType/>
@@ -11823,10 +12578,6 @@
     </w:sectPr>
   </w:body>
 </w:document>
-</file>
-
-<file path=word/comments.xml><?xml version="1.0" encoding="utf-8"?>
-<w:comments xmlns:cx="http://schemas.microsoft.com/office/drawing/2014/chartex" xmlns:cx1="http://schemas.microsoft.com/office/drawing/2015/9/8/chartex" xmlns:cx2="http://schemas.microsoft.com/office/drawing/2015/10/21/chartex" xmlns:cx3="http://schemas.microsoft.com/office/drawing/2016/5/9/chartex" xmlns:cx4="http://schemas.microsoft.com/office/drawing/2016/5/10/chartex" xmlns:cx5="http://schemas.microsoft.com/office/drawing/2016/5/11/chartex" xmlns:cx6="http://schemas.microsoft.com/office/drawing/2016/5/12/chartex" xmlns:cx7="http://schemas.microsoft.com/office/drawing/2016/5/13/chartex" xmlns:cx8="http://schemas.microsoft.com/office/drawing/2016/5/14/chartex" xmlns:mc="http://schemas.openxmlformats.org/markup-compatibility/2006" xmlns:aink="http://schemas.microsoft.com/office/drawing/2016/ink" xmlns:am3d="http://schemas.microsoft.com/office/drawing/2017/model3d" xmlns:o="urn:schemas-microsoft-com:office:office" xmlns:r="http://schemas.openxmlformats.org/officeDocument/2006/relationships" xmlns:m="http://schemas.openxmlformats.org/officeDocument/2006/math" xmlns:v="urn:schemas-microsoft-com:vml" xmlns:wp14="http://schemas.microsoft.com/office/word/2010/wordprocessingDrawing" xmlns:wp="http://schemas.openxmlformats.org/drawingml/2006/wordprocessingDrawing" xmlns:w10="urn:schemas-microsoft-com:office:word" xmlns:w="http://schemas.openxmlformats.org/wordprocessingml/2006/main" xmlns:w14="http://schemas.microsoft.com/office/word/2010/wordml" xmlns:w15="http://schemas.microsoft.com/office/word/2012/wordml" xmlns:w16cex="http://schemas.microsoft.com/office/word/2018/wordml/cex" xmlns:w16cid="http://schemas.microsoft.com/office/word/2016/wordml/cid" xmlns:w16="http://schemas.microsoft.com/office/word/2018/wordml" xmlns:w16sdtdh="http://schemas.microsoft.com/office/word/2020/wordml/sdtdatahash" xmlns:w16se="http://schemas.microsoft.com/office/word/2015/wordml/symex" xmlns:wpg="http://schemas.microsoft.com/office/word/2010/wordprocessingGroup" xmlns:wpi="http://schemas.microsoft.com/office/word/2010/wordprocessingInk" xmlns:wne="http://schemas.microsoft.com/office/word/2006/wordml" xmlns:wps="http://schemas.microsoft.com/office/word/2010/wordprocessingShape"/>
 </file>
 
 <file path=word/endnotes.xml><?xml version="1.0" encoding="utf-8"?>
@@ -11927,7 +12678,7 @@
 <w:numbering xmlns:wpc="http://schemas.microsoft.com/office/word/2010/wordprocessingCanvas" xmlns:mc="http://schemas.openxmlformats.org/markup-compatibility/2006" xmlns:o="urn:schemas-microsoft-com:office:office" xmlns:r="http://schemas.openxmlformats.org/officeDocument/2006/relationships" xmlns:m="http://schemas.openxmlformats.org/officeDocument/2006/math" xmlns:v="urn:schemas-microsoft-com:vml" xmlns:wp14="http://schemas.microsoft.com/office/word/2010/wordprocessingDrawing" xmlns:wp="http://schemas.openxmlformats.org/drawingml/2006/wordprocessingDrawing" xmlns:w10="urn:schemas-microsoft-com:office:word" xmlns:w="http://schemas.openxmlformats.org/wordprocessingml/2006/main" xmlns:w14="http://schemas.microsoft.com/office/word/2010/wordml" xmlns:w15="http://schemas.microsoft.com/office/word/2012/wordml" xmlns:wpg="http://schemas.microsoft.com/office/word/2010/wordprocessingGroup" xmlns:wpi="http://schemas.microsoft.com/office/word/2010/wordprocessingInk" xmlns:wne="http://schemas.microsoft.com/office/word/2006/wordml" xmlns:wps="http://schemas.microsoft.com/office/word/2010/wordprocessingShape" mc:Ignorable="w14 w15 wp14">
   <w:abstractNum w:abstractNumId="1" w15:restartNumberingAfterBreak="0">
     <w:multiLevelType w:val="hybridMultilevel"/>
-    <w:lvl w:ilvl="0" w15:tentative="1">
+    <w:lvl w:ilvl="0" w:tentative="1">
       <w:start w:val="1"/>
       <w:numFmt w:val="bullet"/>
       <w:lvlText w:val="●"/>
@@ -11936,7 +12687,7 @@
         <w:ind w:left="720" w:hanging="360"/>
       </w:pPr>
     </w:lvl>
-    <w:lvl w:ilvl="1" w15:tentative="1">
+    <w:lvl w:ilvl="1" w:tentative="1">
       <w:start w:val="1"/>
       <w:numFmt w:val="bullet"/>
       <w:lvlText w:val="○"/>
@@ -11945,7 +12696,7 @@
         <w:ind w:left="1440" w:hanging="360"/>
       </w:pPr>
     </w:lvl>
-    <w:lvl w:ilvl="2" w15:tentative="1">
+    <w:lvl w:ilvl="2" w:tentative="1">
       <w:start w:val="1"/>
       <w:numFmt w:val="bullet"/>
       <w:lvlText w:val="■"/>
@@ -11954,7 +12705,7 @@
         <w:ind w:left="2160" w:hanging="360"/>
       </w:pPr>
     </w:lvl>
-    <w:lvl w:ilvl="3" w15:tentative="1">
+    <w:lvl w:ilvl="3" w:tentative="1">
       <w:start w:val="1"/>
       <w:numFmt w:val="bullet"/>
       <w:lvlText w:val="●"/>
@@ -11963,7 +12714,7 @@
         <w:ind w:left="2880" w:hanging="360"/>
       </w:pPr>
     </w:lvl>
-    <w:lvl w:ilvl="4" w15:tentative="1">
+    <w:lvl w:ilvl="4" w:tentative="1">
       <w:start w:val="1"/>
       <w:numFmt w:val="bullet"/>
       <w:lvlText w:val="○"/>
@@ -11972,7 +12723,7 @@
         <w:ind w:left="3600" w:hanging="360"/>
       </w:pPr>
     </w:lvl>
-    <w:lvl w:ilvl="5" w15:tentative="1">
+    <w:lvl w:ilvl="5" w:tentative="1">
       <w:start w:val="1"/>
       <w:numFmt w:val="bullet"/>
       <w:lvlText w:val="■"/>
@@ -11981,7 +12732,7 @@
         <w:ind w:left="4320" w:hanging="360"/>
       </w:pPr>
     </w:lvl>
-    <w:lvl w:ilvl="6" w15:tentative="1">
+    <w:lvl w:ilvl="6" w:tentative="1">
       <w:start w:val="1"/>
       <w:numFmt w:val="bullet"/>
       <w:lvlText w:val="●"/>
@@ -11990,7 +12741,7 @@
         <w:ind w:left="5040" w:hanging="360"/>
       </w:pPr>
     </w:lvl>
-    <w:lvl w:ilvl="7" w15:tentative="1">
+    <w:lvl w:ilvl="7" w:tentative="1">
       <w:start w:val="1"/>
       <w:numFmt w:val="bullet"/>
       <w:lvlText w:val="●"/>
@@ -11999,7 +12750,7 @@
         <w:ind w:left="5760" w:hanging="360"/>
       </w:pPr>
     </w:lvl>
-    <w:lvl w:ilvl="8" w15:tentative="1">
+    <w:lvl w:ilvl="8" w:tentative="1">
       <w:start w:val="1"/>
       <w:numFmt w:val="bullet"/>
       <w:lvlText w:val="●"/>
@@ -12011,7 +12762,7 @@
   </w:abstractNum>
   <w:abstractNum w:abstractNumId="2" w15:restartNumberingAfterBreak="0">
     <w:multiLevelType w:val="hybridMultilevel"/>
-    <w:lvl w:ilvl="0" w15:tentative="1">
+    <w:lvl w:ilvl="0" w:tentative="1">
       <w:start w:val="1"/>
       <w:numFmt w:val="bullet"/>
       <w:lvlText w:val="•"/>
@@ -12023,7 +12774,7 @@
   </w:abstractNum>
   <w:abstractNum w:abstractNumId="3" w15:restartNumberingAfterBreak="0">
     <w:multiLevelType w:val="hybridMultilevel"/>
-    <w:lvl w:ilvl="0" w15:tentative="1">
+    <w:lvl w:ilvl="0" w:tentative="1">
       <w:start w:val="1"/>
       <w:numFmt w:val="decimal"/>
       <w:lvlText w:val="%1."/>
@@ -12035,7 +12786,7 @@
   </w:abstractNum>
   <w:abstractNum w:abstractNumId="4" w15:restartNumberingAfterBreak="0">
     <w:multiLevelType w:val="hybridMultilevel"/>
-    <w:lvl w:ilvl="0" w15:tentative="1">
+    <w:lvl w:ilvl="0" w:tentative="1">
       <w:start w:val="1"/>
       <w:numFmt w:val="decimal"/>
       <w:lvlText w:val="%1."/>
@@ -12047,7 +12798,7 @@
   </w:abstractNum>
   <w:abstractNum w:abstractNumId="5" w15:restartNumberingAfterBreak="0">
     <w:multiLevelType w:val="hybridMultilevel"/>
-    <w:lvl w:ilvl="0" w15:tentative="1">
+    <w:lvl w:ilvl="0" w:tentative="1">
       <w:start w:val="1"/>
       <w:numFmt w:val="decimal"/>
       <w:lvlText w:val="%1."/>
@@ -12102,6 +12853,25 @@
     </w:rPrDefault>
     <w:pPrDefault/>
   </w:docDefaults>
+  <w:style w:type="paragraph" w:styleId="Normal" w:default="1">
+    <w:name w:val="Normal"/>
+    <w:qFormat/>
+  </w:style>
+  <w:style w:type="table" w:styleId="TableNormal" w:default="true">
+    <w:name w:val="Normal Table"/>
+    <w:uiPriority w:val="99"/>
+    <w:semiHidden/>
+    <w:unhideWhenUsed/>
+    <w:tblPr>
+      <w:tblInd w:type="dxa" w:w="0"/>
+      <w:tblCellMar>
+        <w:top w:type="dxa" w:w="0"/>
+        <w:left w:type="dxa" w:w="108"/>
+        <w:bottom w:type="dxa" w:w="0"/>
+        <w:right w:type="dxa" w:w="108"/>
+      </w:tblCellMar>
+    </w:tblPr>
+  </w:style>
   <w:style w:type="paragraph" w:styleId="Title">
     <w:name w:val="Title"/>
     <w:basedOn w:val="Normal"/>
@@ -12110,28 +12880,6 @@
     <w:rPr>
       <w:sz w:val="56"/>
       <w:szCs w:val="56"/>
-    </w:rPr>
-  </w:style>
-  <w:style w:type="paragraph" w:styleId="Heading1">
-    <w:name w:val="Heading 1"/>
-    <w:basedOn w:val="Normal"/>
-    <w:next w:val="Normal"/>
-    <w:qFormat/>
-    <w:rPr>
-      <w:color w:val="2E74B5"/>
-      <w:sz w:val="32"/>
-      <w:szCs w:val="32"/>
-    </w:rPr>
-  </w:style>
-  <w:style w:type="paragraph" w:styleId="Heading2">
-    <w:name w:val="Heading 2"/>
-    <w:basedOn w:val="Normal"/>
-    <w:next w:val="Normal"/>
-    <w:qFormat/>
-    <w:rPr>
-      <w:color w:val="2E74B5"/>
-      <w:sz w:val="26"/>
-      <w:szCs w:val="26"/>
     </w:rPr>
   </w:style>
   <w:style w:type="paragraph" w:styleId="Heading3">
@@ -12279,6 +13027,7 @@
     <w:next w:val="Normal"/>
     <w:qFormat/>
     <w:pPr>
+      <w:keepNext/>
       <w:spacing w:after="140" w:before="320"/>
       <w:outlineLvl w:val="0"/>
     </w:pPr>
@@ -12297,6 +13046,7 @@
     <w:next w:val="Normal"/>
     <w:qFormat/>
     <w:pPr>
+      <w:keepNext/>
       <w:spacing w:after="100" w:before="220"/>
       <w:outlineLvl w:val="1"/>
     </w:pPr>
@@ -12310,4 +13060,294 @@
     </w:rPr>
   </w:style>
 </w:styles>
+</file>
+
+<file path=word/theme/theme1.xml><?xml version="1.0" encoding="utf-8"?>
+<a:theme xmlns:a="http://schemas.openxmlformats.org/drawingml/2006/main" name="Office Theme">
+  <a:themeElements>
+    <a:clrScheme name="Office">
+      <a:dk1>
+        <a:sysClr val="windowText" lastClr="000000"/>
+      </a:dk1>
+      <a:lt1>
+        <a:sysClr val="window" lastClr="FFFFFF"/>
+      </a:lt1>
+      <a:dk2>
+        <a:srgbClr val="44546A"/>
+      </a:dk2>
+      <a:lt2>
+        <a:srgbClr val="E7E6E6"/>
+      </a:lt2>
+      <a:accent1>
+        <a:srgbClr val="4472C4"/>
+      </a:accent1>
+      <a:accent2>
+        <a:srgbClr val="ED7D31"/>
+      </a:accent2>
+      <a:accent3>
+        <a:srgbClr val="A5A5A5"/>
+      </a:accent3>
+      <a:accent4>
+        <a:srgbClr val="FFC000"/>
+      </a:accent4>
+      <a:accent5>
+        <a:srgbClr val="5B9BD5"/>
+      </a:accent5>
+      <a:accent6>
+        <a:srgbClr val="70AD47"/>
+      </a:accent6>
+      <a:hlink>
+        <a:srgbClr val="0563C1"/>
+      </a:hlink>
+      <a:folHlink>
+        <a:srgbClr val="954F72"/>
+      </a:folHlink>
+    </a:clrScheme>
+    <a:fontScheme name="Office">
+      <a:majorFont>
+        <a:latin typeface="Calibri Light" panose="020F0302020204030204"/>
+        <a:ea typeface=""/>
+        <a:cs typeface=""/>
+        <a:font script="Jpan" typeface="游ゴシック Light"/>
+        <a:font script="Hang" typeface="맑은 고딕"/>
+        <a:font script="Hans" typeface="等线 Light"/>
+        <a:font script="Hant" typeface="新細明體"/>
+        <a:font script="Arab" typeface="Times New Roman"/>
+        <a:font script="Hebr" typeface="Times New Roman"/>
+        <a:font script="Thai" typeface="Angsana New"/>
+        <a:font script="Ethi" typeface="Nyala"/>
+        <a:font script="Beng" typeface="Vrinda"/>
+        <a:font script="Gujr" typeface="Shruti"/>
+        <a:font script="Khmr" typeface="MoolBoran"/>
+        <a:font script="Knda" typeface="Tunga"/>
+        <a:font script="Guru" typeface="Raavi"/>
+        <a:font script="Cans" typeface="Euphemia"/>
+        <a:font script="Cher" typeface="Plantagenet Cherokee"/>
+        <a:font script="Yiii" typeface="Microsoft Yi Baiti"/>
+        <a:font script="Tibt" typeface="Microsoft Himalaya"/>
+        <a:font script="Thaa" typeface="MV Boli"/>
+        <a:font script="Deva" typeface="Mangal"/>
+        <a:font script="Telu" typeface="Gautami"/>
+        <a:font script="Taml" typeface="Latha"/>
+        <a:font script="Syrc" typeface="Estrangelo Edessa"/>
+        <a:font script="Orya" typeface="Kalinga"/>
+        <a:font script="Mlym" typeface="Kartika"/>
+        <a:font script="Laoo" typeface="DokChampa"/>
+        <a:font script="Sinh" typeface="Iskoola Pota"/>
+        <a:font script="Mong" typeface="Mongolian Baiti"/>
+        <a:font script="Viet" typeface="Times New Roman"/>
+        <a:font script="Uigh" typeface="Microsoft Uighur"/>
+        <a:font script="Geor" typeface="Sylfaen"/>
+        <a:font script="Armn" typeface="Arial"/>
+        <a:font script="Bugi" typeface="Leelawadee UI"/>
+        <a:font script="Bopo" typeface="Microsoft JhengHei"/>
+        <a:font script="Java" typeface="Javanese Text"/>
+        <a:font script="Lisu" typeface="Segoe UI"/>
+        <a:font script="Mymr" typeface="Myanmar Text"/>
+        <a:font script="Nkoo" typeface="Ebrima"/>
+        <a:font script="Olck" typeface="Nirmala UI"/>
+        <a:font script="Osma" typeface="Ebrima"/>
+        <a:font script="Phag" typeface="Phagspa"/>
+        <a:font script="Syrn" typeface="Estrangelo Edessa"/>
+        <a:font script="Syrj" typeface="Estrangelo Edessa"/>
+        <a:font script="Syre" typeface="Estrangelo Edessa"/>
+        <a:font script="Sora" typeface="Nirmala UI"/>
+        <a:font script="Tale" typeface="Microsoft Tai Le"/>
+        <a:font script="Talu" typeface="Microsoft New Tai Lue"/>
+        <a:font script="Tfng" typeface="Ebrima"/>
+      </a:majorFont>
+      <a:minorFont>
+        <a:latin typeface="Calibri" panose="020F0502020204030204"/>
+        <a:ea typeface=""/>
+        <a:cs typeface=""/>
+        <a:font script="Jpan" typeface="游明朝"/>
+        <a:font script="Hang" typeface="맑은 고딕"/>
+        <a:font script="Hans" typeface="等线"/>
+        <a:font script="Hant" typeface="新細明體"/>
+        <a:font script="Arab" typeface="Arial"/>
+        <a:font script="Hebr" typeface="Arial"/>
+        <a:font script="Thai" typeface="Cordia New"/>
+        <a:font script="Ethi" typeface="Nyala"/>
+        <a:font script="Beng" typeface="Vrinda"/>
+        <a:font script="Gujr" typeface="Shruti"/>
+        <a:font script="Khmr" typeface="DaunPenh"/>
+        <a:font script="Knda" typeface="Tunga"/>
+        <a:font script="Guru" typeface="Raavi"/>
+        <a:font script="Cans" typeface="Euphemia"/>
+        <a:font script="Cher" typeface="Plantagenet Cherokee"/>
+        <a:font script="Yiii" typeface="Microsoft Yi Baiti"/>
+        <a:font script="Tibt" typeface="Microsoft Himalaya"/>
+        <a:font script="Thaa" typeface="MV Boli"/>
+        <a:font script="Deva" typeface="Mangal"/>
+        <a:font script="Telu" typeface="Gautami"/>
+        <a:font script="Taml" typeface="Latha"/>
+        <a:font script="Syrc" typeface="Estrangelo Edessa"/>
+        <a:font script="Orya" typeface="Kalinga"/>
+        <a:font script="Mlym" typeface="Kartika"/>
+        <a:font script="Laoo" typeface="DokChampa"/>
+        <a:font script="Sinh" typeface="Iskoola Pota"/>
+        <a:font script="Mong" typeface="Mongolian Baiti"/>
+        <a:font script="Viet" typeface="Arial"/>
+        <a:font script="Uigh" typeface="Microsoft Uighur"/>
+        <a:font script="Geor" typeface="Sylfaen"/>
+        <a:font script="Armn" typeface="Arial"/>
+        <a:font script="Bugi" typeface="Leelawadee UI"/>
+        <a:font script="Bopo" typeface="Microsoft JhengHei"/>
+        <a:font script="Java" typeface="Javanese Text"/>
+        <a:font script="Lisu" typeface="Segoe UI"/>
+        <a:font script="Mymr" typeface="Myanmar Text"/>
+        <a:font script="Nkoo" typeface="Ebrima"/>
+        <a:font script="Olck" typeface="Nirmala UI"/>
+        <a:font script="Osma" typeface="Ebrima"/>
+        <a:font script="Phag" typeface="Phagspa"/>
+        <a:font script="Syrn" typeface="Estrangelo Edessa"/>
+        <a:font script="Syrj" typeface="Estrangelo Edessa"/>
+        <a:font script="Syre" typeface="Estrangelo Edessa"/>
+        <a:font script="Sora" typeface="Nirmala UI"/>
+        <a:font script="Tale" typeface="Microsoft Tai Le"/>
+        <a:font script="Talu" typeface="Microsoft New Tai Lue"/>
+        <a:font script="Tfng" typeface="Ebrima"/>
+      </a:minorFont>
+    </a:fontScheme>
+    <a:fmtScheme name="Office">
+      <a:fillStyleLst>
+        <a:solidFill>
+          <a:schemeClr val="phClr"/>
+        </a:solidFill>
+        <a:gradFill rotWithShape="true">
+          <a:gsLst>
+            <a:gs pos="0">
+              <a:schemeClr val="phClr">
+                <a:lumMod val="110000"/>
+                <a:satMod val="105000"/>
+                <a:tint val="67000"/>
+              </a:schemeClr>
+            </a:gs>
+            <a:gs pos="50000">
+              <a:schemeClr val="phClr">
+                <a:lumMod val="105000"/>
+                <a:satMod val="103000"/>
+                <a:tint val="73000"/>
+              </a:schemeClr>
+            </a:gs>
+            <a:gs pos="100000">
+              <a:schemeClr val="phClr">
+                <a:lumMod val="105000"/>
+                <a:satMod val="109000"/>
+                <a:tint val="81000"/>
+              </a:schemeClr>
+            </a:gs>
+          </a:gsLst>
+          <a:lin ang="5400000" scaled="false"/>
+        </a:gradFill>
+        <a:gradFill rotWithShape="true">
+          <a:gsLst>
+            <a:gs pos="0">
+              <a:schemeClr val="phClr">
+                <a:satMod val="103000"/>
+                <a:lumMod val="102000"/>
+                <a:tint val="94000"/>
+              </a:schemeClr>
+            </a:gs>
+            <a:gs pos="50000">
+              <a:schemeClr val="phClr">
+                <a:satMod val="110000"/>
+                <a:lumMod val="100000"/>
+                <a:shade val="100000"/>
+              </a:schemeClr>
+            </a:gs>
+            <a:gs pos="100000">
+              <a:schemeClr val="phClr">
+                <a:lumMod val="99000"/>
+                <a:satMod val="120000"/>
+                <a:shade val="78000"/>
+              </a:schemeClr>
+            </a:gs>
+          </a:gsLst>
+          <a:lin ang="5400000" scaled="false"/>
+        </a:gradFill>
+      </a:fillStyleLst>
+      <a:lnStyleLst>
+        <a:ln w="6350" cap="flat" cmpd="sng" algn="ctr">
+          <a:solidFill>
+            <a:schemeClr val="phClr"/>
+          </a:solidFill>
+          <a:prstDash val="solid"/>
+          <a:miter lim="800000"/>
+        </a:ln>
+        <a:ln w="12700" cap="flat" cmpd="sng" algn="ctr">
+          <a:solidFill>
+            <a:schemeClr val="phClr"/>
+          </a:solidFill>
+          <a:prstDash val="solid"/>
+          <a:miter lim="800000"/>
+        </a:ln>
+        <a:ln w="19050" cap="flat" cmpd="sng" algn="ctr">
+          <a:solidFill>
+            <a:schemeClr val="phClr"/>
+          </a:solidFill>
+          <a:prstDash val="solid"/>
+          <a:miter lim="800000"/>
+        </a:ln>
+      </a:lnStyleLst>
+      <a:effectStyleLst>
+        <a:effectStyle>
+          <a:effectLst/>
+        </a:effectStyle>
+        <a:effectStyle>
+          <a:effectLst/>
+        </a:effectStyle>
+        <a:effectStyle>
+          <a:effectLst>
+            <a:outerShdw blurRad="57150" dist="19050" dir="5400000" algn="ctr" rotWithShape="false">
+              <a:srgbClr val="000000">
+                <a:alpha val="63000"/>
+              </a:srgbClr>
+            </a:outerShdw>
+          </a:effectLst>
+        </a:effectStyle>
+      </a:effectStyleLst>
+      <a:bgFillStyleLst>
+        <a:solidFill>
+          <a:schemeClr val="phClr"/>
+        </a:solidFill>
+        <a:solidFill>
+          <a:schemeClr val="phClr">
+            <a:tint val="95000"/>
+            <a:satMod val="170000"/>
+          </a:schemeClr>
+        </a:solidFill>
+        <a:gradFill rotWithShape="true">
+          <a:gsLst>
+            <a:gs pos="0">
+              <a:schemeClr val="phClr">
+                <a:tint val="93000"/>
+                <a:satMod val="150000"/>
+                <a:shade val="98000"/>
+                <a:lumMod val="102000"/>
+              </a:schemeClr>
+            </a:gs>
+            <a:gs pos="50000">
+              <a:schemeClr val="phClr">
+                <a:tint val="98000"/>
+                <a:satMod val="130000"/>
+                <a:shade val="90000"/>
+                <a:lumMod val="103000"/>
+              </a:schemeClr>
+            </a:gs>
+            <a:gs pos="100000">
+              <a:schemeClr val="phClr">
+                <a:shade val="63000"/>
+                <a:satMod val="120000"/>
+              </a:schemeClr>
+            </a:gs>
+          </a:gsLst>
+          <a:lin ang="5400000" scaled="false"/>
+        </a:gradFill>
+      </a:bgFillStyleLst>
+    </a:fmtScheme>
+  </a:themeElements>
+  <a:objectDefaults/>
+  <a:extraClrSchemeLst/>
+</a:theme>
 </file>
</xml_diff>

<commit_message>
Deployed app on Hugging Face Spaces: live links, report deployment section and screenshot
Also fixes the 6.4 heading: Transformer latency was measured on GPU, not CPU.
</commit_message>
<xml_diff>
--- a/report/Kinyarwanda_News_Classification_Report.docx
+++ b/report/Kinyarwanda_News_Classification_Report.docx
@@ -4,7 +4,7 @@
   <w:body>
     <w:p>
       <w:pPr>
-        <w:spacing w:after="120" w:before="600"/>
+        <w:spacing w:before="600" w:after="120"/>
         <w:jc w:val="center"/>
       </w:pPr>
       <w:r>
@@ -53,6 +53,7 @@
           <w:b/>
           <w:bCs/>
           <w:highlight w:val="yellow"/>
+          <w:highlightCs w:val="yellow"/>
         </w:rPr>
         <w:t xml:space="preserve">[[TODO: course name / institution]]</w:t>
       </w:r>
@@ -169,7 +170,7 @@
       <w:tr>
         <w:trPr>
           <w:cantSplit/>
-          <w:tblHeader w:val="off"/>
+          <w:tblHeader w:val="false"/>
         </w:trPr>
         <w:tc>
           <w:tcPr>
@@ -226,9 +227,8 @@
               <w:rPr>
                 <w:sz w:val="18"/>
                 <w:szCs w:val="18"/>
-                <w:highlight w:val="yellow"/>
-              </w:rPr>
-              <w:t xml:space="preserve">[[TODO: GitHub repository URL]]</w:t>
+              </w:rPr>
+              <w:t xml:space="preserve">https://github.com/Elvin100s/kinyarwanda-news-classification</w:t>
             </w:r>
           </w:p>
         </w:tc>
@@ -236,7 +236,7 @@
       <w:tr>
         <w:trPr>
           <w:cantSplit/>
-          <w:tblHeader w:val="off"/>
+          <w:tblHeader w:val="false"/>
         </w:trPr>
         <w:tc>
           <w:tcPr>
@@ -294,6 +294,7 @@
                 <w:sz w:val="18"/>
                 <w:szCs w:val="18"/>
                 <w:highlight w:val="yellow"/>
+                <w:highlightCs w:val="yellow"/>
               </w:rPr>
               <w:t xml:space="preserve">[[TODO: demo video URL]]</w:t>
             </w:r>
@@ -303,7 +304,7 @@
       <w:tr>
         <w:trPr>
           <w:cantSplit/>
-          <w:tblHeader w:val="off"/>
+          <w:tblHeader w:val="false"/>
         </w:trPr>
         <w:tc>
           <w:tcPr>
@@ -360,9 +361,8 @@
               <w:rPr>
                 <w:sz w:val="18"/>
                 <w:szCs w:val="18"/>
-                <w:highlight w:val="yellow"/>
-              </w:rPr>
-              <w:t xml:space="preserve">[[TODO: deployed web application URL]]</w:t>
+              </w:rPr>
+              <w:t xml:space="preserve">https://huggingface.co/spaces/Elvin100S/kinyarwanda-news-classifier</w:t>
             </w:r>
           </w:p>
         </w:tc>
@@ -590,7 +590,7 @@
       <w:tr>
         <w:trPr>
           <w:cantSplit/>
-          <w:tblHeader w:val="off"/>
+          <w:tblHeader w:val="false"/>
         </w:trPr>
         <w:tc>
           <w:tcPr>
@@ -656,7 +656,7 @@
       <w:tr>
         <w:trPr>
           <w:cantSplit/>
-          <w:tblHeader w:val="off"/>
+          <w:tblHeader w:val="false"/>
         </w:trPr>
         <w:tc>
           <w:tcPr>
@@ -722,7 +722,7 @@
       <w:tr>
         <w:trPr>
           <w:cantSplit/>
-          <w:tblHeader w:val="off"/>
+          <w:tblHeader w:val="false"/>
         </w:trPr>
         <w:tc>
           <w:tcPr>
@@ -788,7 +788,7 @@
       <w:tr>
         <w:trPr>
           <w:cantSplit/>
-          <w:tblHeader w:val="off"/>
+          <w:tblHeader w:val="false"/>
         </w:trPr>
         <w:tc>
           <w:tcPr>
@@ -1101,6 +1101,93 @@
             <wp:extent cx="5124450" cy="2990850"/>
             <wp:effectExtent t="0" r="0" b="0" l="0"/>
             <wp:docPr id="1" name="02_train_test_distribution_shift.png" descr="Figure 1. How much more common each topic is in the test set than in the deduplicated training set (log scale). Red bars differ from equal representation by more than a factor of two." title="Figure 1. How much more common each topic is in the test set"/>
+            <wp:cNvGraphicFramePr>
+              <a:graphicFrameLocks xmlns:a="http://schemas.openxmlformats.org/drawingml/2006/main" noChangeAspect="1"/>
+            </wp:cNvGraphicFramePr>
+            <a:graphic xmlns:a="http://schemas.openxmlformats.org/drawingml/2006/main">
+              <a:graphicData uri="http://schemas.openxmlformats.org/drawingml/2006/picture">
+                <pic:pic xmlns:pic="http://schemas.openxmlformats.org/drawingml/2006/picture">
+                  <pic:nvPicPr>
+                    <pic:cNvPr id="0" name="" descr=""/>
+                    <pic:cNvPicPr>
+                      <a:picLocks noChangeAspect="1" noChangeArrowheads="1"/>
+                    </pic:cNvPicPr>
+                  </pic:nvPicPr>
+                  <pic:blipFill>
+                    <a:blip r:embed="rId7" cstate="none"/>
+                    <a:srcRect/>
+                    <a:stretch>
+                      <a:fillRect/>
+                    </a:stretch>
+                  </pic:blipFill>
+                  <pic:spPr bwMode="auto">
+                    <a:xfrm>
+                      <a:off x="0" y="0"/>
+                      <a:ext cx="5124450" cy="2990850"/>
+                    </a:xfrm>
+                    <a:prstGeom prst="rect">
+                      <a:avLst/>
+                    </a:prstGeom>
+                  </pic:spPr>
+                </pic:pic>
+              </a:graphicData>
+            </a:graphic>
+          </wp:inline>
+        </w:drawing>
+      </w:r>
+    </w:p>
+    <w:p>
+      <w:pPr>
+        <w:spacing w:before="60" w:after="200"/>
+        <w:jc w:val="center"/>
+      </w:pPr>
+      <w:r>
+        <w:rPr>
+          <w:sz w:val="18"/>
+          <w:szCs w:val="18"/>
+        </w:rPr>
+        <w:t xml:space="preserve">Figure 1. How much more common each topic is in the test set than in the deduplicated training set (log scale). Red bars differ from equal representation by more than a factor of two.</w:t>
+      </w:r>
+    </w:p>
+    <w:p>
+      <w:pPr>
+        <w:pStyle w:val="Heading2"/>
+      </w:pPr>
+      <w:r>
+        <w:t xml:space="preserve">3.3 Characteristics</w:t>
+      </w:r>
+    </w:p>
+    <w:p>
+      <w:pPr>
+        <w:spacing w:after="120" w:line="276"/>
+        <w:jc w:val="both"/>
+      </w:pPr>
+      <w:r>
+        <w:t xml:space="preserve">Articles are long: the median training article has 292 words and 716 XLM-R subword tokens (Figure 2). 94.9% of articles exceed 256 subword tokens and 74.5% exceed 512, so a Transformer with a 512-token limit never sees the end of three-quarters of the corpus. Vocabulary is highly sparse: the corpus contains 231,516 distinct word types in 2.38 million tokens, and </w:t>
+      </w:r>
+      <w:r>
+        <w:rPr>
+          <w:b/>
+          <w:bCs/>
+        </w:rPr>
+        <w:t xml:space="preserve">61.6% of word types occur exactly once</w:t>
+      </w:r>
+      <w:r>
+        <w:t xml:space="preserve">. The XLM-R and AfroXLMR tokenizers both split Kinyarwanda into 2.47 subword tokens per word on average, and produce identical output.</w:t>
+      </w:r>
+    </w:p>
+    <w:p>
+      <w:pPr>
+        <w:keepNext/>
+        <w:spacing w:before="120"/>
+        <w:jc w:val="center"/>
+      </w:pPr>
+      <w:r>
+        <w:drawing>
+          <wp:inline distT="0" distB="0" distL="0" distR="0">
+            <wp:extent cx="5667375" cy="2286000"/>
+            <wp:effectExtent t="0" r="0" b="0" l="0"/>
+            <wp:docPr id="1" name="03_length_distributions.png" descr="Figure 2. Article length in words (left) and in XLM-R subword tokens (right). Dashed lines mark the 256 and 512 token limits used by the Transformer models." title="Figure 2. Article length in words (left) and in XLM-R subwor"/>
             <wp:cNvGraphicFramePr>
               <a:graphicFrameLocks xmlns:a="http://schemas.openxmlformats.org/drawingml/2006/main" noChangeAspect="1"/>
             </wp:cNvGraphicFramePr>
@@ -1123,93 +1210,6 @@
                   <pic:spPr bwMode="auto">
                     <a:xfrm>
                       <a:off x="0" y="0"/>
-                      <a:ext cx="5124450" cy="2990850"/>
-                    </a:xfrm>
-                    <a:prstGeom prst="rect">
-                      <a:avLst/>
-                    </a:prstGeom>
-                  </pic:spPr>
-                </pic:pic>
-              </a:graphicData>
-            </a:graphic>
-          </wp:inline>
-        </w:drawing>
-      </w:r>
-    </w:p>
-    <w:p>
-      <w:pPr>
-        <w:spacing w:after="200" w:before="60"/>
-        <w:jc w:val="center"/>
-      </w:pPr>
-      <w:r>
-        <w:rPr>
-          <w:sz w:val="18"/>
-          <w:szCs w:val="18"/>
-        </w:rPr>
-        <w:t xml:space="preserve">Figure 1. How much more common each topic is in the test set than in the deduplicated training set (log scale). Red bars differ from equal representation by more than a factor of two.</w:t>
-      </w:r>
-    </w:p>
-    <w:p>
-      <w:pPr>
-        <w:pStyle w:val="Heading2"/>
-      </w:pPr>
-      <w:r>
-        <w:t xml:space="preserve">3.3 Characteristics</w:t>
-      </w:r>
-    </w:p>
-    <w:p>
-      <w:pPr>
-        <w:spacing w:after="120" w:line="276"/>
-        <w:jc w:val="both"/>
-      </w:pPr>
-      <w:r>
-        <w:t xml:space="preserve">Articles are long: the median training article has 292 words and 716 XLM-R subword tokens (Figure 2). 94.9% of articles exceed 256 subword tokens and 74.5% exceed 512, so a Transformer with a 512-token limit never sees the end of three-quarters of the corpus. Vocabulary is highly sparse: the corpus contains 231,516 distinct word types in 2.38 million tokens, and </w:t>
-      </w:r>
-      <w:r>
-        <w:rPr>
-          <w:b/>
-          <w:bCs/>
-        </w:rPr>
-        <w:t xml:space="preserve">61.6% of word types occur exactly once</w:t>
-      </w:r>
-      <w:r>
-        <w:t xml:space="preserve">. The XLM-R and AfroXLMR tokenizers both split Kinyarwanda into 2.47 subword tokens per word on average, and produce identical output.</w:t>
-      </w:r>
-    </w:p>
-    <w:p>
-      <w:pPr>
-        <w:keepNext/>
-        <w:spacing w:before="120"/>
-        <w:jc w:val="center"/>
-      </w:pPr>
-      <w:r>
-        <w:drawing>
-          <wp:inline distT="0" distB="0" distL="0" distR="0">
-            <wp:extent cx="5667375" cy="2286000"/>
-            <wp:effectExtent t="0" r="0" b="0" l="0"/>
-            <wp:docPr id="2" name="03_length_distributions.png" descr="Figure 2. Article length in words (left) and in XLM-R subword tokens (right). Dashed lines mark the 256 and 512 token limits used by the Transformer models." title="Figure 2. Article length in words (left) and in XLM-R subwor"/>
-            <wp:cNvGraphicFramePr>
-              <a:graphicFrameLocks xmlns:a="http://schemas.openxmlformats.org/drawingml/2006/main" noChangeAspect="1"/>
-            </wp:cNvGraphicFramePr>
-            <a:graphic xmlns:a="http://schemas.openxmlformats.org/drawingml/2006/main">
-              <a:graphicData uri="http://schemas.openxmlformats.org/drawingml/2006/picture">
-                <pic:pic xmlns:pic="http://schemas.openxmlformats.org/drawingml/2006/picture">
-                  <pic:nvPicPr>
-                    <pic:cNvPr id="0" name="" descr=""/>
-                    <pic:cNvPicPr>
-                      <a:picLocks noChangeAspect="1" noChangeArrowheads="1"/>
-                    </pic:cNvPicPr>
-                  </pic:nvPicPr>
-                  <pic:blipFill>
-                    <a:blip r:embed="rId9" cstate="none"/>
-                    <a:srcRect/>
-                    <a:stretch>
-                      <a:fillRect/>
-                    </a:stretch>
-                  </pic:blipFill>
-                  <pic:spPr bwMode="auto">
-                    <a:xfrm>
-                      <a:off x="0" y="0"/>
                       <a:ext cx="5667375" cy="2286000"/>
                     </a:xfrm>
                     <a:prstGeom prst="rect">
@@ -1225,7 +1225,7 @@
     </w:p>
     <w:p>
       <w:pPr>
-        <w:spacing w:after="200" w:before="60"/>
+        <w:spacing w:before="60" w:after="200"/>
         <w:jc w:val="center"/>
       </w:pPr>
       <w:r>
@@ -1256,7 +1256,7 @@
     <w:p>
       <w:pPr>
         <w:keepNext/>
-        <w:spacing w:after="80" w:before="160"/>
+        <w:spacing w:before="160" w:after="80"/>
         <w:jc w:val="left"/>
       </w:pPr>
       <w:r>
@@ -1394,7 +1394,7 @@
       <w:tr>
         <w:trPr>
           <w:cantSplit/>
-          <w:tblHeader w:val="off"/>
+          <w:tblHeader w:val="false"/>
         </w:trPr>
         <w:tc>
           <w:tcPr>
@@ -1490,7 +1490,7 @@
       <w:tr>
         <w:trPr>
           <w:cantSplit/>
-          <w:tblHeader w:val="off"/>
+          <w:tblHeader w:val="false"/>
         </w:trPr>
         <w:tc>
           <w:tcPr>
@@ -1586,7 +1586,7 @@
       <w:tr>
         <w:trPr>
           <w:cantSplit/>
-          <w:tblHeader w:val="off"/>
+          <w:tblHeader w:val="false"/>
         </w:trPr>
         <w:tc>
           <w:tcPr>
@@ -2045,6 +2045,7 @@
           <w:b/>
           <w:bCs/>
           <w:highlight w:val="yellow"/>
+          <w:highlightCs w:val="yellow"/>
         </w:rPr>
         <w:t xml:space="preserve">[[TODO: state your use of AI assistance here if your course requires it]]</w:t>
       </w:r>
@@ -2069,7 +2070,7 @@
     <w:p>
       <w:pPr>
         <w:keepNext/>
-        <w:spacing w:after="80" w:before="160"/>
+        <w:spacing w:before="160" w:after="80"/>
         <w:jc w:val="left"/>
       </w:pPr>
       <w:r>
@@ -2377,7 +2378,7 @@
       <w:tr>
         <w:trPr>
           <w:cantSplit/>
-          <w:tblHeader w:val="off"/>
+          <w:tblHeader w:val="false"/>
         </w:trPr>
         <w:tc>
           <w:tcPr>
@@ -2631,7 +2632,7 @@
       <w:tr>
         <w:trPr>
           <w:cantSplit/>
-          <w:tblHeader w:val="off"/>
+          <w:tblHeader w:val="false"/>
         </w:trPr>
         <w:tc>
           <w:tcPr>
@@ -2877,7 +2878,7 @@
       <w:tr>
         <w:trPr>
           <w:cantSplit/>
-          <w:tblHeader w:val="off"/>
+          <w:tblHeader w:val="false"/>
         </w:trPr>
         <w:tc>
           <w:tcPr>
@@ -3123,7 +3124,7 @@
       <w:tr>
         <w:trPr>
           <w:cantSplit/>
-          <w:tblHeader w:val="off"/>
+          <w:tblHeader w:val="false"/>
         </w:trPr>
         <w:tc>
           <w:tcPr>
@@ -3369,7 +3370,7 @@
       <w:tr>
         <w:trPr>
           <w:cantSplit/>
-          <w:tblHeader w:val="off"/>
+          <w:tblHeader w:val="false"/>
         </w:trPr>
         <w:tc>
           <w:tcPr>
@@ -3615,7 +3616,7 @@
       <w:tr>
         <w:trPr>
           <w:cantSplit/>
-          <w:tblHeader w:val="off"/>
+          <w:tblHeader w:val="false"/>
         </w:trPr>
         <w:tc>
           <w:tcPr>
@@ -3861,7 +3862,7 @@
       <w:tr>
         <w:trPr>
           <w:cantSplit/>
-          <w:tblHeader w:val="off"/>
+          <w:tblHeader w:val="false"/>
         </w:trPr>
         <w:tc>
           <w:tcPr>
@@ -4107,7 +4108,7 @@
       <w:tr>
         <w:trPr>
           <w:cantSplit/>
-          <w:tblHeader w:val="off"/>
+          <w:tblHeader w:val="false"/>
         </w:trPr>
         <w:tc>
           <w:tcPr>
@@ -4353,7 +4354,7 @@
       <w:tr>
         <w:trPr>
           <w:cantSplit/>
-          <w:tblHeader w:val="off"/>
+          <w:tblHeader w:val="false"/>
         </w:trPr>
         <w:tc>
           <w:tcPr>
@@ -4808,7 +4809,7 @@
     <w:p>
       <w:pPr>
         <w:keepNext/>
-        <w:spacing w:after="80" w:before="160"/>
+        <w:spacing w:before="160" w:after="80"/>
         <w:jc w:val="left"/>
       </w:pPr>
       <w:r>
@@ -5014,7 +5015,7 @@
       <w:tr>
         <w:trPr>
           <w:cantSplit/>
-          <w:tblHeader w:val="off"/>
+          <w:tblHeader w:val="false"/>
         </w:trPr>
         <w:tc>
           <w:tcPr>
@@ -5170,7 +5171,7 @@
       <w:tr>
         <w:trPr>
           <w:cantSplit/>
-          <w:tblHeader w:val="off"/>
+          <w:tblHeader w:val="false"/>
         </w:trPr>
         <w:tc>
           <w:tcPr>
@@ -5326,7 +5327,7 @@
       <w:tr>
         <w:trPr>
           <w:cantSplit/>
-          <w:tblHeader w:val="off"/>
+          <w:tblHeader w:val="false"/>
         </w:trPr>
         <w:tc>
           <w:tcPr>
@@ -5482,7 +5483,7 @@
       <w:tr>
         <w:trPr>
           <w:cantSplit/>
-          <w:tblHeader w:val="off"/>
+          <w:tblHeader w:val="false"/>
         </w:trPr>
         <w:tc>
           <w:tcPr>
@@ -5714,7 +5715,7 @@
     <w:p>
       <w:pPr>
         <w:keepNext/>
-        <w:spacing w:after="80" w:before="160"/>
+        <w:spacing w:before="160" w:after="80"/>
         <w:jc w:val="left"/>
       </w:pPr>
       <w:r>
@@ -5954,7 +5955,7 @@
       <w:tr>
         <w:trPr>
           <w:cantSplit/>
-          <w:tblHeader w:val="off"/>
+          <w:tblHeader w:val="false"/>
         </w:trPr>
         <w:tc>
           <w:tcPr>
@@ -6140,7 +6141,7 @@
       <w:tr>
         <w:trPr>
           <w:cantSplit/>
-          <w:tblHeader w:val="off"/>
+          <w:tblHeader w:val="false"/>
         </w:trPr>
         <w:tc>
           <w:tcPr>
@@ -6326,7 +6327,7 @@
       <w:tr>
         <w:trPr>
           <w:cantSplit/>
-          <w:tblHeader w:val="off"/>
+          <w:tblHeader w:val="false"/>
         </w:trPr>
         <w:tc>
           <w:tcPr>
@@ -6512,7 +6513,7 @@
       <w:tr>
         <w:trPr>
           <w:cantSplit/>
-          <w:tblHeader w:val="off"/>
+          <w:tblHeader w:val="false"/>
         </w:trPr>
         <w:tc>
           <w:tcPr>
@@ -6698,7 +6699,7 @@
       <w:tr>
         <w:trPr>
           <w:cantSplit/>
-          <w:tblHeader w:val="off"/>
+          <w:tblHeader w:val="false"/>
         </w:trPr>
         <w:tc>
           <w:tcPr>
@@ -6884,7 +6885,7 @@
       <w:tr>
         <w:trPr>
           <w:cantSplit/>
-          <w:tblHeader w:val="off"/>
+          <w:tblHeader w:val="false"/>
         </w:trPr>
         <w:tc>
           <w:tcPr>
@@ -7070,7 +7071,7 @@
       <w:tr>
         <w:trPr>
           <w:cantSplit/>
-          <w:tblHeader w:val="off"/>
+          <w:tblHeader w:val="false"/>
         </w:trPr>
         <w:tc>
           <w:tcPr>
@@ -7256,7 +7257,7 @@
       <w:tr>
         <w:trPr>
           <w:cantSplit/>
-          <w:tblHeader w:val="off"/>
+          <w:tblHeader w:val="false"/>
         </w:trPr>
         <w:tc>
           <w:tcPr>
@@ -7442,7 +7443,7 @@
       <w:tr>
         <w:trPr>
           <w:cantSplit/>
-          <w:tblHeader w:val="off"/>
+          <w:tblHeader w:val="false"/>
         </w:trPr>
         <w:tc>
           <w:tcPr>
@@ -7628,7 +7629,7 @@
       <w:tr>
         <w:trPr>
           <w:cantSplit/>
-          <w:tblHeader w:val="off"/>
+          <w:tblHeader w:val="false"/>
         </w:trPr>
         <w:tc>
           <w:tcPr>
@@ -7814,7 +7815,7 @@
       <w:tr>
         <w:trPr>
           <w:cantSplit/>
-          <w:tblHeader w:val="off"/>
+          <w:tblHeader w:val="false"/>
         </w:trPr>
         <w:tc>
           <w:tcPr>
@@ -8000,7 +8001,7 @@
       <w:tr>
         <w:trPr>
           <w:cantSplit/>
-          <w:tblHeader w:val="off"/>
+          <w:tblHeader w:val="false"/>
         </w:trPr>
         <w:tc>
           <w:tcPr>
@@ -8186,7 +8187,7 @@
       <w:tr>
         <w:trPr>
           <w:cantSplit/>
-          <w:tblHeader w:val="off"/>
+          <w:tblHeader w:val="false"/>
         </w:trPr>
         <w:tc>
           <w:tcPr>
@@ -8372,7 +8373,7 @@
       <w:tr>
         <w:trPr>
           <w:cantSplit/>
-          <w:tblHeader w:val="off"/>
+          <w:tblHeader w:val="false"/>
         </w:trPr>
         <w:tc>
           <w:tcPr>
@@ -8657,7 +8658,7 @@
           <wp:inline distT="0" distB="0" distL="0" distR="0">
             <wp:extent cx="5848350" cy="2381250"/>
             <wp:effectExtent t="0" r="0" b="0" l="0"/>
-            <wp:docPr id="3" name="07_confusion_matrices.png" descr="Figure 3. Row-normalised test confusion matrices for the baseline B1 (left) and the selected model E1 (right). The diagonal is per-class recall." title="Figure 3. Row-normalised test confusion matrices for the bas"/>
+            <wp:docPr id="1" name="07_confusion_matrices.png" descr="Figure 3. Row-normalised test confusion matrices for the baseline B1 (left) and the selected model E1 (right). The diagonal is per-class recall." title="Figure 3. Row-normalised test confusion matrices for the bas"/>
             <wp:cNvGraphicFramePr>
               <a:graphicFrameLocks xmlns:a="http://schemas.openxmlformats.org/drawingml/2006/main" noChangeAspect="1"/>
             </wp:cNvGraphicFramePr>
@@ -8671,7 +8672,7 @@
                     </pic:cNvPicPr>
                   </pic:nvPicPr>
                   <pic:blipFill>
-                    <a:blip r:embed="rId10" cstate="none"/>
+                    <a:blip r:embed="rId9" cstate="none"/>
                     <a:srcRect/>
                     <a:stretch>
                       <a:fillRect/>
@@ -8695,7 +8696,7 @@
     </w:p>
     <w:p>
       <w:pPr>
-        <w:spacing w:after="200" w:before="60"/>
+        <w:spacing w:before="60" w:after="200"/>
         <w:jc w:val="center"/>
       </w:pPr>
       <w:r>
@@ -8709,7 +8710,7 @@
     <w:p>
       <w:pPr>
         <w:keepNext/>
-        <w:spacing w:after="80" w:before="160"/>
+        <w:spacing w:before="160" w:after="80"/>
         <w:jc w:val="left"/>
       </w:pPr>
       <w:r>
@@ -8881,7 +8882,7 @@
       <w:tr>
         <w:trPr>
           <w:cantSplit/>
-          <w:tblHeader w:val="off"/>
+          <w:tblHeader w:val="false"/>
         </w:trPr>
         <w:tc>
           <w:tcPr>
@@ -9007,7 +9008,7 @@
       <w:tr>
         <w:trPr>
           <w:cantSplit/>
-          <w:tblHeader w:val="off"/>
+          <w:tblHeader w:val="false"/>
         </w:trPr>
         <w:tc>
           <w:tcPr>
@@ -9133,7 +9134,7 @@
       <w:tr>
         <w:trPr>
           <w:cantSplit/>
-          <w:tblHeader w:val="off"/>
+          <w:tblHeader w:val="false"/>
         </w:trPr>
         <w:tc>
           <w:tcPr>
@@ -9259,7 +9260,7 @@
       <w:tr>
         <w:trPr>
           <w:cantSplit/>
-          <w:tblHeader w:val="off"/>
+          <w:tblHeader w:val="false"/>
         </w:trPr>
         <w:tc>
           <w:tcPr>
@@ -9385,7 +9386,7 @@
       <w:tr>
         <w:trPr>
           <w:cantSplit/>
-          <w:tblHeader w:val="off"/>
+          <w:tblHeader w:val="false"/>
         </w:trPr>
         <w:tc>
           <w:tcPr>
@@ -9511,7 +9512,7 @@
       <w:tr>
         <w:trPr>
           <w:cantSplit/>
-          <w:tblHeader w:val="off"/>
+          <w:tblHeader w:val="false"/>
         </w:trPr>
         <w:tc>
           <w:tcPr>
@@ -9637,7 +9638,7 @@
       <w:tr>
         <w:trPr>
           <w:cantSplit/>
-          <w:tblHeader w:val="off"/>
+          <w:tblHeader w:val="false"/>
         </w:trPr>
         <w:tc>
           <w:tcPr>
@@ -9763,7 +9764,7 @@
       <w:tr>
         <w:trPr>
           <w:cantSplit/>
-          <w:tblHeader w:val="off"/>
+          <w:tblHeader w:val="false"/>
         </w:trPr>
         <w:tc>
           <w:tcPr>
@@ -10043,7 +10044,7 @@
     <w:p>
       <w:pPr>
         <w:keepNext/>
-        <w:spacing w:after="80" w:before="160"/>
+        <w:spacing w:before="160" w:after="80"/>
         <w:jc w:val="left"/>
       </w:pPr>
       <w:r>
@@ -10249,7 +10250,7 @@
       <w:tr>
         <w:trPr>
           <w:cantSplit/>
-          <w:tblHeader w:val="off"/>
+          <w:tblHeader w:val="false"/>
         </w:trPr>
         <w:tc>
           <w:tcPr>
@@ -10407,7 +10408,7 @@
       <w:tr>
         <w:trPr>
           <w:cantSplit/>
-          <w:tblHeader w:val="off"/>
+          <w:tblHeader w:val="false"/>
         </w:trPr>
         <w:tc>
           <w:tcPr>
@@ -10565,7 +10566,7 @@
       <w:tr>
         <w:trPr>
           <w:cantSplit/>
-          <w:tblHeader w:val="off"/>
+          <w:tblHeader w:val="false"/>
         </w:trPr>
         <w:tc>
           <w:tcPr>
@@ -10723,7 +10724,7 @@
       <w:tr>
         <w:trPr>
           <w:cantSplit/>
-          <w:tblHeader w:val="off"/>
+          <w:tblHeader w:val="false"/>
         </w:trPr>
         <w:tc>
           <w:tcPr>
@@ -10881,7 +10882,7 @@
       <w:tr>
         <w:trPr>
           <w:cantSplit/>
-          <w:tblHeader w:val="off"/>
+          <w:tblHeader w:val="false"/>
         </w:trPr>
         <w:tc>
           <w:tcPr>
@@ -11039,7 +11040,7 @@
       <w:tr>
         <w:trPr>
           <w:cantSplit/>
-          <w:tblHeader w:val="off"/>
+          <w:tblHeader w:val="false"/>
         </w:trPr>
         <w:tc>
           <w:tcPr>
@@ -11197,7 +11198,7 @@
       <w:tr>
         <w:trPr>
           <w:cantSplit/>
-          <w:tblHeader w:val="off"/>
+          <w:tblHeader w:val="false"/>
         </w:trPr>
         <w:tc>
           <w:tcPr>
@@ -11465,21 +11466,83 @@
         <w:jc w:val="both"/>
       </w:pPr>
       <w:r>
-        <w:t xml:space="preserve">Because E1 is 10.8 MB and classifies an article in well under a millisecond, it runs on a free CPU host without a GPU.</w:t>
+        <w:t xml:space="preserve">The app is hosted on Hugging Face Spaces (Figure 4). Because E1 is 10.8 MB and classifies an article in well under a millisecond, it needs no GPU. The free CPU tier was not available to this account, so the Space runs on the free ZeroGPU tier; the app declares the one GPU function that tier requires, but never calls it, and every prediction is computed on the CPU. Re-scoring the full official test set through the app’s own preprocessing and model reproduces E1’s macro-F1 (0.587) and accuracy (0.726) exactly, and the deployed Space returns the same probabilities as the local copy for every example and edge case.</w:t>
       </w:r>
     </w:p>
     <w:p>
       <w:pPr>
         <w:spacing w:after="120" w:line="276"/>
-        <w:jc w:val="both"/>
+        <w:jc w:val="left"/>
       </w:pPr>
       <w:r>
         <w:rPr>
           <w:b/>
           <w:bCs/>
-          <w:highlight w:val="yellow"/>
-        </w:rPr>
-        <w:t xml:space="preserve">[[TODO after deployment: name the hosting platform, give the live URL, and add a screenshot of the app.]]</w:t>
+        </w:rPr>
+        <w:t xml:space="preserve">Live app:</w:t>
+      </w:r>
+      <w:r>
+        <w:t xml:space="preserve"> https://huggingface.co/spaces/Elvin100S/kinyarwanda-news-classifier</w:t>
+      </w:r>
+    </w:p>
+    <w:p>
+      <w:pPr>
+        <w:keepNext/>
+        <w:spacing w:before="120"/>
+        <w:jc w:val="center"/>
+      </w:pPr>
+      <w:r>
+        <w:drawing>
+          <wp:inline distT="0" distB="0" distL="0" distR="0">
+            <wp:extent cx="5667375" cy="2657475"/>
+            <wp:effectExtent t="0" r="0" b="0" l="0"/>
+            <wp:docPr id="1" name="09_app_screenshot.png" descr="Figure 4. The deployed app after classifying one of the built-in test-set examples: the three most likely topics with their probabilities, and the prediction time." title="Figure 4. The deployed app after classifying one of the buil"/>
+            <wp:cNvGraphicFramePr>
+              <a:graphicFrameLocks xmlns:a="http://schemas.openxmlformats.org/drawingml/2006/main" noChangeAspect="1"/>
+            </wp:cNvGraphicFramePr>
+            <a:graphic xmlns:a="http://schemas.openxmlformats.org/drawingml/2006/main">
+              <a:graphicData uri="http://schemas.openxmlformats.org/drawingml/2006/picture">
+                <pic:pic xmlns:pic="http://schemas.openxmlformats.org/drawingml/2006/picture">
+                  <pic:nvPicPr>
+                    <pic:cNvPr id="0" name="" descr=""/>
+                    <pic:cNvPicPr>
+                      <a:picLocks noChangeAspect="1" noChangeArrowheads="1"/>
+                    </pic:cNvPicPr>
+                  </pic:nvPicPr>
+                  <pic:blipFill>
+                    <a:blip r:embed="rId10" cstate="none"/>
+                    <a:srcRect/>
+                    <a:stretch>
+                      <a:fillRect/>
+                    </a:stretch>
+                  </pic:blipFill>
+                  <pic:spPr bwMode="auto">
+                    <a:xfrm>
+                      <a:off x="0" y="0"/>
+                      <a:ext cx="5667375" cy="2657475"/>
+                    </a:xfrm>
+                    <a:prstGeom prst="rect">
+                      <a:avLst/>
+                    </a:prstGeom>
+                  </pic:spPr>
+                </pic:pic>
+              </a:graphicData>
+            </a:graphic>
+          </wp:inline>
+        </w:drawing>
+      </w:r>
+    </w:p>
+    <w:p>
+      <w:pPr>
+        <w:spacing w:before="60" w:after="200"/>
+        <w:jc w:val="center"/>
+      </w:pPr>
+      <w:r>
+        <w:rPr>
+          <w:sz w:val="18"/>
+          <w:szCs w:val="18"/>
+        </w:rPr>
+        <w:t xml:space="preserve">Figure 4. The deployed app after classifying one of the built-in test-set examples: the three most likely topics with their probabilities, and the prediction time.</w:t>
       </w:r>
     </w:p>
     <w:p>
@@ -12580,41 +12643,8 @@
 </w:document>
 </file>
 
-<file path=word/endnotes.xml><?xml version="1.0" encoding="utf-8"?>
-<w:endnotes xmlns:wpc="http://schemas.microsoft.com/office/word/2010/wordprocessingCanvas" xmlns:mc="http://schemas.openxmlformats.org/markup-compatibility/2006" xmlns:o="urn:schemas-microsoft-com:office:office" xmlns:r="http://schemas.openxmlformats.org/officeDocument/2006/relationships" xmlns:m="http://schemas.openxmlformats.org/officeDocument/2006/math" xmlns:v="urn:schemas-microsoft-com:vml" xmlns:wp14="http://schemas.microsoft.com/office/word/2010/wordprocessingDrawing" xmlns:wp="http://schemas.openxmlformats.org/drawingml/2006/wordprocessingDrawing" xmlns:w10="urn:schemas-microsoft-com:office:word" xmlns:w="http://schemas.openxmlformats.org/wordprocessingml/2006/main" xmlns:w14="http://schemas.microsoft.com/office/word/2010/wordml" xmlns:w15="http://schemas.microsoft.com/office/word/2012/wordml" xmlns:wpg="http://schemas.microsoft.com/office/word/2010/wordprocessingGroup" xmlns:wpi="http://schemas.microsoft.com/office/word/2010/wordprocessingInk" xmlns:wne="http://schemas.microsoft.com/office/word/2006/wordml" xmlns:wps="http://schemas.microsoft.com/office/word/2010/wordprocessingShape" mc:Ignorable="w14 w15 wp14">
-  <w:endnote w:type="separator" w:id="-1">
-    <w:p>
-      <w:pPr>
-        <w:spacing w:after="0" w:line="240" w:lineRule="auto"/>
-      </w:pPr>
-      <w:r>
-        <w:rPr>
-          <w:rStyle w:val="EndnoteReference"/>
-        </w:rPr>
-        <w:endnoteRef/>
-      </w:r>
-      <w:r>
-        <w:separator/>
-      </w:r>
-    </w:p>
-  </w:endnote>
-  <w:endnote w:type="continuationSeparator" w:id="0">
-    <w:p>
-      <w:pPr>
-        <w:spacing w:after="0" w:line="240" w:lineRule="auto"/>
-      </w:pPr>
-      <w:r>
-        <w:rPr>
-          <w:rStyle w:val="EndnoteReference"/>
-        </w:rPr>
-        <w:endnoteRef/>
-      </w:r>
-      <w:r>
-        <w:continuationSeparator/>
-      </w:r>
-    </w:p>
-  </w:endnote>
-</w:endnotes>
+<file path=word/comments.xml><?xml version="1.0" encoding="utf-8"?>
+<w:comments xmlns:cx="http://schemas.microsoft.com/office/drawing/2014/chartex" xmlns:cx1="http://schemas.microsoft.com/office/drawing/2015/9/8/chartex" xmlns:cx2="http://schemas.microsoft.com/office/drawing/2015/10/21/chartex" xmlns:cx3="http://schemas.microsoft.com/office/drawing/2016/5/9/chartex" xmlns:cx4="http://schemas.microsoft.com/office/drawing/2016/5/10/chartex" xmlns:cx5="http://schemas.microsoft.com/office/drawing/2016/5/11/chartex" xmlns:cx6="http://schemas.microsoft.com/office/drawing/2016/5/12/chartex" xmlns:cx7="http://schemas.microsoft.com/office/drawing/2016/5/13/chartex" xmlns:cx8="http://schemas.microsoft.com/office/drawing/2016/5/14/chartex" xmlns:mc="http://schemas.openxmlformats.org/markup-compatibility/2006" xmlns:aink="http://schemas.microsoft.com/office/drawing/2016/ink" xmlns:am3d="http://schemas.microsoft.com/office/drawing/2017/model3d" xmlns:o="urn:schemas-microsoft-com:office:office" xmlns:r="http://schemas.openxmlformats.org/officeDocument/2006/relationships" xmlns:m="http://schemas.openxmlformats.org/officeDocument/2006/math" xmlns:v="urn:schemas-microsoft-com:vml" xmlns:wp14="http://schemas.microsoft.com/office/word/2010/wordprocessingDrawing" xmlns:wp="http://schemas.openxmlformats.org/drawingml/2006/wordprocessingDrawing" xmlns:w10="urn:schemas-microsoft-com:office:word" xmlns:w="http://schemas.openxmlformats.org/wordprocessingml/2006/main" xmlns:w14="http://schemas.microsoft.com/office/word/2010/wordml" xmlns:w15="http://schemas.microsoft.com/office/word/2012/wordml" xmlns:w16cex="http://schemas.microsoft.com/office/word/2018/wordml/cex" xmlns:w16cid="http://schemas.microsoft.com/office/word/2016/wordml/cid" xmlns:w16="http://schemas.microsoft.com/office/word/2018/wordml" xmlns:w16sdtdh="http://schemas.microsoft.com/office/word/2020/wordml/sdtdatahash" xmlns:w16se="http://schemas.microsoft.com/office/word/2015/wordml/symex" xmlns:wpg="http://schemas.microsoft.com/office/word/2010/wordprocessingGroup" xmlns:wpi="http://schemas.microsoft.com/office/word/2010/wordprocessingInk" xmlns:wne="http://schemas.microsoft.com/office/word/2006/wordml" xmlns:wps="http://schemas.microsoft.com/office/word/2010/wordprocessingShape"/>
 </file>
 
 <file path=word/footer1.xml><?xml version="1.0" encoding="utf-8"?>
@@ -12678,7 +12708,7 @@
 <w:numbering xmlns:wpc="http://schemas.microsoft.com/office/word/2010/wordprocessingCanvas" xmlns:mc="http://schemas.openxmlformats.org/markup-compatibility/2006" xmlns:o="urn:schemas-microsoft-com:office:office" xmlns:r="http://schemas.openxmlformats.org/officeDocument/2006/relationships" xmlns:m="http://schemas.openxmlformats.org/officeDocument/2006/math" xmlns:v="urn:schemas-microsoft-com:vml" xmlns:wp14="http://schemas.microsoft.com/office/word/2010/wordprocessingDrawing" xmlns:wp="http://schemas.openxmlformats.org/drawingml/2006/wordprocessingDrawing" xmlns:w10="urn:schemas-microsoft-com:office:word" xmlns:w="http://schemas.openxmlformats.org/wordprocessingml/2006/main" xmlns:w14="http://schemas.microsoft.com/office/word/2010/wordml" xmlns:w15="http://schemas.microsoft.com/office/word/2012/wordml" xmlns:wpg="http://schemas.microsoft.com/office/word/2010/wordprocessingGroup" xmlns:wpi="http://schemas.microsoft.com/office/word/2010/wordprocessingInk" xmlns:wne="http://schemas.microsoft.com/office/word/2006/wordml" xmlns:wps="http://schemas.microsoft.com/office/word/2010/wordprocessingShape" mc:Ignorable="w14 w15 wp14">
   <w:abstractNum w:abstractNumId="1" w15:restartNumberingAfterBreak="0">
     <w:multiLevelType w:val="hybridMultilevel"/>
-    <w:lvl w:ilvl="0" w:tentative="1">
+    <w:lvl w:ilvl="0" w15:tentative="1">
       <w:start w:val="1"/>
       <w:numFmt w:val="bullet"/>
       <w:lvlText w:val="●"/>
@@ -12687,7 +12717,7 @@
         <w:ind w:left="720" w:hanging="360"/>
       </w:pPr>
     </w:lvl>
-    <w:lvl w:ilvl="1" w:tentative="1">
+    <w:lvl w:ilvl="1" w15:tentative="1">
       <w:start w:val="1"/>
       <w:numFmt w:val="bullet"/>
       <w:lvlText w:val="○"/>
@@ -12696,7 +12726,7 @@
         <w:ind w:left="1440" w:hanging="360"/>
       </w:pPr>
     </w:lvl>
-    <w:lvl w:ilvl="2" w:tentative="1">
+    <w:lvl w:ilvl="2" w15:tentative="1">
       <w:start w:val="1"/>
       <w:numFmt w:val="bullet"/>
       <w:lvlText w:val="■"/>
@@ -12705,7 +12735,7 @@
         <w:ind w:left="2160" w:hanging="360"/>
       </w:pPr>
     </w:lvl>
-    <w:lvl w:ilvl="3" w:tentative="1">
+    <w:lvl w:ilvl="3" w15:tentative="1">
       <w:start w:val="1"/>
       <w:numFmt w:val="bullet"/>
       <w:lvlText w:val="●"/>
@@ -12714,7 +12744,7 @@
         <w:ind w:left="2880" w:hanging="360"/>
       </w:pPr>
     </w:lvl>
-    <w:lvl w:ilvl="4" w:tentative="1">
+    <w:lvl w:ilvl="4" w15:tentative="1">
       <w:start w:val="1"/>
       <w:numFmt w:val="bullet"/>
       <w:lvlText w:val="○"/>
@@ -12723,7 +12753,7 @@
         <w:ind w:left="3600" w:hanging="360"/>
       </w:pPr>
     </w:lvl>
-    <w:lvl w:ilvl="5" w:tentative="1">
+    <w:lvl w:ilvl="5" w15:tentative="1">
       <w:start w:val="1"/>
       <w:numFmt w:val="bullet"/>
       <w:lvlText w:val="■"/>
@@ -12732,7 +12762,7 @@
         <w:ind w:left="4320" w:hanging="360"/>
       </w:pPr>
     </w:lvl>
-    <w:lvl w:ilvl="6" w:tentative="1">
+    <w:lvl w:ilvl="6" w15:tentative="1">
       <w:start w:val="1"/>
       <w:numFmt w:val="bullet"/>
       <w:lvlText w:val="●"/>
@@ -12741,7 +12771,7 @@
         <w:ind w:left="5040" w:hanging="360"/>
       </w:pPr>
     </w:lvl>
-    <w:lvl w:ilvl="7" w:tentative="1">
+    <w:lvl w:ilvl="7" w15:tentative="1">
       <w:start w:val="1"/>
       <w:numFmt w:val="bullet"/>
       <w:lvlText w:val="●"/>
@@ -12750,7 +12780,7 @@
         <w:ind w:left="5760" w:hanging="360"/>
       </w:pPr>
     </w:lvl>
-    <w:lvl w:ilvl="8" w:tentative="1">
+    <w:lvl w:ilvl="8" w15:tentative="1">
       <w:start w:val="1"/>
       <w:numFmt w:val="bullet"/>
       <w:lvlText w:val="●"/>
@@ -12762,7 +12792,7 @@
   </w:abstractNum>
   <w:abstractNum w:abstractNumId="2" w15:restartNumberingAfterBreak="0">
     <w:multiLevelType w:val="hybridMultilevel"/>
-    <w:lvl w:ilvl="0" w:tentative="1">
+    <w:lvl w:ilvl="0" w15:tentative="1">
       <w:start w:val="1"/>
       <w:numFmt w:val="bullet"/>
       <w:lvlText w:val="•"/>
@@ -12774,7 +12804,7 @@
   </w:abstractNum>
   <w:abstractNum w:abstractNumId="3" w15:restartNumberingAfterBreak="0">
     <w:multiLevelType w:val="hybridMultilevel"/>
-    <w:lvl w:ilvl="0" w:tentative="1">
+    <w:lvl w:ilvl="0" w15:tentative="1">
       <w:start w:val="1"/>
       <w:numFmt w:val="decimal"/>
       <w:lvlText w:val="%1."/>
@@ -12786,7 +12816,7 @@
   </w:abstractNum>
   <w:abstractNum w:abstractNumId="4" w15:restartNumberingAfterBreak="0">
     <w:multiLevelType w:val="hybridMultilevel"/>
-    <w:lvl w:ilvl="0" w:tentative="1">
+    <w:lvl w:ilvl="0" w15:tentative="1">
       <w:start w:val="1"/>
       <w:numFmt w:val="decimal"/>
       <w:lvlText w:val="%1."/>
@@ -12798,7 +12828,7 @@
   </w:abstractNum>
   <w:abstractNum w:abstractNumId="5" w15:restartNumberingAfterBreak="0">
     <w:multiLevelType w:val="hybridMultilevel"/>
-    <w:lvl w:ilvl="0" w:tentative="1">
+    <w:lvl w:ilvl="0" w15:tentative="1">
       <w:start w:val="1"/>
       <w:numFmt w:val="decimal"/>
       <w:lvlText w:val="%1."/>
@@ -12853,25 +12883,6 @@
     </w:rPrDefault>
     <w:pPrDefault/>
   </w:docDefaults>
-  <w:style w:type="paragraph" w:styleId="Normal" w:default="1">
-    <w:name w:val="Normal"/>
-    <w:qFormat/>
-  </w:style>
-  <w:style w:type="table" w:styleId="TableNormal" w:default="true">
-    <w:name w:val="Normal Table"/>
-    <w:uiPriority w:val="99"/>
-    <w:semiHidden/>
-    <w:unhideWhenUsed/>
-    <w:tblPr>
-      <w:tblInd w:type="dxa" w:w="0"/>
-      <w:tblCellMar>
-        <w:top w:type="dxa" w:w="0"/>
-        <w:left w:type="dxa" w:w="108"/>
-        <w:bottom w:type="dxa" w:w="0"/>
-        <w:right w:type="dxa" w:w="108"/>
-      </w:tblCellMar>
-    </w:tblPr>
-  </w:style>
   <w:style w:type="paragraph" w:styleId="Title">
     <w:name w:val="Title"/>
     <w:basedOn w:val="Normal"/>
@@ -12880,6 +12891,28 @@
     <w:rPr>
       <w:sz w:val="56"/>
       <w:szCs w:val="56"/>
+    </w:rPr>
+  </w:style>
+  <w:style w:type="paragraph" w:styleId="Heading1">
+    <w:name w:val="Heading 1"/>
+    <w:basedOn w:val="Normal"/>
+    <w:next w:val="Normal"/>
+    <w:qFormat/>
+    <w:rPr>
+      <w:color w:val="2E74B5"/>
+      <w:sz w:val="32"/>
+      <w:szCs w:val="32"/>
+    </w:rPr>
+  </w:style>
+  <w:style w:type="paragraph" w:styleId="Heading2">
+    <w:name w:val="Heading 2"/>
+    <w:basedOn w:val="Normal"/>
+    <w:next w:val="Normal"/>
+    <w:qFormat/>
+    <w:rPr>
+      <w:color w:val="2E74B5"/>
+      <w:sz w:val="26"/>
+      <w:szCs w:val="26"/>
     </w:rPr>
   </w:style>
   <w:style w:type="paragraph" w:styleId="Heading3">
@@ -12984,43 +13017,6 @@
       <w:szCs w:val="20"/>
     </w:rPr>
   </w:style>
-  <w:style w:type="character" w:styleId="EndnoteReference">
-    <w:name w:val="endnote reference"/>
-    <w:basedOn w:val="DefaultParagraphFont"/>
-    <w:uiPriority w:val="99"/>
-    <w:semiHidden/>
-    <w:unhideWhenUsed/>
-    <w:rPr>
-      <w:vertAlign w:val="superscript"/>
-    </w:rPr>
-  </w:style>
-  <w:style w:type="paragraph" w:styleId="EndnoteText">
-    <w:name w:val="endnote text"/>
-    <w:basedOn w:val="Normal"/>
-    <w:link w:val="EndnoteTextChar"/>
-    <w:uiPriority w:val="99"/>
-    <w:semiHidden/>
-    <w:unhideWhenUsed/>
-    <w:pPr>
-      <w:spacing w:after="0" w:line="240" w:lineRule="auto"/>
-    </w:pPr>
-    <w:rPr>
-      <w:sz w:val="20"/>
-      <w:szCs w:val="20"/>
-    </w:rPr>
-  </w:style>
-  <w:style w:type="character" w:styleId="EndnoteTextChar">
-    <w:name w:val="Endnote Text Char"/>
-    <w:basedOn w:val="DefaultParagraphFont"/>
-    <w:link w:val="EndnoteText"/>
-    <w:uiPriority w:val="99"/>
-    <w:semiHidden/>
-    <w:unhideWhenUsed/>
-    <w:rPr>
-      <w:sz w:val="20"/>
-      <w:szCs w:val="20"/>
-    </w:rPr>
-  </w:style>
   <w:style w:type="paragraph" w:styleId="Heading1">
     <w:name w:val="Heading 1"/>
     <w:basedOn w:val="Normal"/>
@@ -13028,7 +13024,7 @@
     <w:qFormat/>
     <w:pPr>
       <w:keepNext/>
-      <w:spacing w:after="140" w:before="320"/>
+      <w:spacing w:before="320" w:after="140"/>
       <w:outlineLvl w:val="0"/>
     </w:pPr>
     <w:rPr>
@@ -13047,7 +13043,7 @@
     <w:qFormat/>
     <w:pPr>
       <w:keepNext/>
-      <w:spacing w:after="100" w:before="220"/>
+      <w:spacing w:before="220" w:after="100"/>
       <w:outlineLvl w:val="1"/>
     </w:pPr>
     <w:rPr>
@@ -13060,294 +13056,4 @@
     </w:rPr>
   </w:style>
 </w:styles>
-</file>
-
-<file path=word/theme/theme1.xml><?xml version="1.0" encoding="utf-8"?>
-<a:theme xmlns:a="http://schemas.openxmlformats.org/drawingml/2006/main" name="Office Theme">
-  <a:themeElements>
-    <a:clrScheme name="Office">
-      <a:dk1>
-        <a:sysClr val="windowText" lastClr="000000"/>
-      </a:dk1>
-      <a:lt1>
-        <a:sysClr val="window" lastClr="FFFFFF"/>
-      </a:lt1>
-      <a:dk2>
-        <a:srgbClr val="44546A"/>
-      </a:dk2>
-      <a:lt2>
-        <a:srgbClr val="E7E6E6"/>
-      </a:lt2>
-      <a:accent1>
-        <a:srgbClr val="4472C4"/>
-      </a:accent1>
-      <a:accent2>
-        <a:srgbClr val="ED7D31"/>
-      </a:accent2>
-      <a:accent3>
-        <a:srgbClr val="A5A5A5"/>
-      </a:accent3>
-      <a:accent4>
-        <a:srgbClr val="FFC000"/>
-      </a:accent4>
-      <a:accent5>
-        <a:srgbClr val="5B9BD5"/>
-      </a:accent5>
-      <a:accent6>
-        <a:srgbClr val="70AD47"/>
-      </a:accent6>
-      <a:hlink>
-        <a:srgbClr val="0563C1"/>
-      </a:hlink>
-      <a:folHlink>
-        <a:srgbClr val="954F72"/>
-      </a:folHlink>
-    </a:clrScheme>
-    <a:fontScheme name="Office">
-      <a:majorFont>
-        <a:latin typeface="Calibri Light" panose="020F0302020204030204"/>
-        <a:ea typeface=""/>
-        <a:cs typeface=""/>
-        <a:font script="Jpan" typeface="游ゴシック Light"/>
-        <a:font script="Hang" typeface="맑은 고딕"/>
-        <a:font script="Hans" typeface="等线 Light"/>
-        <a:font script="Hant" typeface="新細明體"/>
-        <a:font script="Arab" typeface="Times New Roman"/>
-        <a:font script="Hebr" typeface="Times New Roman"/>
-        <a:font script="Thai" typeface="Angsana New"/>
-        <a:font script="Ethi" typeface="Nyala"/>
-        <a:font script="Beng" typeface="Vrinda"/>
-        <a:font script="Gujr" typeface="Shruti"/>
-        <a:font script="Khmr" typeface="MoolBoran"/>
-        <a:font script="Knda" typeface="Tunga"/>
-        <a:font script="Guru" typeface="Raavi"/>
-        <a:font script="Cans" typeface="Euphemia"/>
-        <a:font script="Cher" typeface="Plantagenet Cherokee"/>
-        <a:font script="Yiii" typeface="Microsoft Yi Baiti"/>
-        <a:font script="Tibt" typeface="Microsoft Himalaya"/>
-        <a:font script="Thaa" typeface="MV Boli"/>
-        <a:font script="Deva" typeface="Mangal"/>
-        <a:font script="Telu" typeface="Gautami"/>
-        <a:font script="Taml" typeface="Latha"/>
-        <a:font script="Syrc" typeface="Estrangelo Edessa"/>
-        <a:font script="Orya" typeface="Kalinga"/>
-        <a:font script="Mlym" typeface="Kartika"/>
-        <a:font script="Laoo" typeface="DokChampa"/>
-        <a:font script="Sinh" typeface="Iskoola Pota"/>
-        <a:font script="Mong" typeface="Mongolian Baiti"/>
-        <a:font script="Viet" typeface="Times New Roman"/>
-        <a:font script="Uigh" typeface="Microsoft Uighur"/>
-        <a:font script="Geor" typeface="Sylfaen"/>
-        <a:font script="Armn" typeface="Arial"/>
-        <a:font script="Bugi" typeface="Leelawadee UI"/>
-        <a:font script="Bopo" typeface="Microsoft JhengHei"/>
-        <a:font script="Java" typeface="Javanese Text"/>
-        <a:font script="Lisu" typeface="Segoe UI"/>
-        <a:font script="Mymr" typeface="Myanmar Text"/>
-        <a:font script="Nkoo" typeface="Ebrima"/>
-        <a:font script="Olck" typeface="Nirmala UI"/>
-        <a:font script="Osma" typeface="Ebrima"/>
-        <a:font script="Phag" typeface="Phagspa"/>
-        <a:font script="Syrn" typeface="Estrangelo Edessa"/>
-        <a:font script="Syrj" typeface="Estrangelo Edessa"/>
-        <a:font script="Syre" typeface="Estrangelo Edessa"/>
-        <a:font script="Sora" typeface="Nirmala UI"/>
-        <a:font script="Tale" typeface="Microsoft Tai Le"/>
-        <a:font script="Talu" typeface="Microsoft New Tai Lue"/>
-        <a:font script="Tfng" typeface="Ebrima"/>
-      </a:majorFont>
-      <a:minorFont>
-        <a:latin typeface="Calibri" panose="020F0502020204030204"/>
-        <a:ea typeface=""/>
-        <a:cs typeface=""/>
-        <a:font script="Jpan" typeface="游明朝"/>
-        <a:font script="Hang" typeface="맑은 고딕"/>
-        <a:font script="Hans" typeface="等线"/>
-        <a:font script="Hant" typeface="新細明體"/>
-        <a:font script="Arab" typeface="Arial"/>
-        <a:font script="Hebr" typeface="Arial"/>
-        <a:font script="Thai" typeface="Cordia New"/>
-        <a:font script="Ethi" typeface="Nyala"/>
-        <a:font script="Beng" typeface="Vrinda"/>
-        <a:font script="Gujr" typeface="Shruti"/>
-        <a:font script="Khmr" typeface="DaunPenh"/>
-        <a:font script="Knda" typeface="Tunga"/>
-        <a:font script="Guru" typeface="Raavi"/>
-        <a:font script="Cans" typeface="Euphemia"/>
-        <a:font script="Cher" typeface="Plantagenet Cherokee"/>
-        <a:font script="Yiii" typeface="Microsoft Yi Baiti"/>
-        <a:font script="Tibt" typeface="Microsoft Himalaya"/>
-        <a:font script="Thaa" typeface="MV Boli"/>
-        <a:font script="Deva" typeface="Mangal"/>
-        <a:font script="Telu" typeface="Gautami"/>
-        <a:font script="Taml" typeface="Latha"/>
-        <a:font script="Syrc" typeface="Estrangelo Edessa"/>
-        <a:font script="Orya" typeface="Kalinga"/>
-        <a:font script="Mlym" typeface="Kartika"/>
-        <a:font script="Laoo" typeface="DokChampa"/>
-        <a:font script="Sinh" typeface="Iskoola Pota"/>
-        <a:font script="Mong" typeface="Mongolian Baiti"/>
-        <a:font script="Viet" typeface="Arial"/>
-        <a:font script="Uigh" typeface="Microsoft Uighur"/>
-        <a:font script="Geor" typeface="Sylfaen"/>
-        <a:font script="Armn" typeface="Arial"/>
-        <a:font script="Bugi" typeface="Leelawadee UI"/>
-        <a:font script="Bopo" typeface="Microsoft JhengHei"/>
-        <a:font script="Java" typeface="Javanese Text"/>
-        <a:font script="Lisu" typeface="Segoe UI"/>
-        <a:font script="Mymr" typeface="Myanmar Text"/>
-        <a:font script="Nkoo" typeface="Ebrima"/>
-        <a:font script="Olck" typeface="Nirmala UI"/>
-        <a:font script="Osma" typeface="Ebrima"/>
-        <a:font script="Phag" typeface="Phagspa"/>
-        <a:font script="Syrn" typeface="Estrangelo Edessa"/>
-        <a:font script="Syrj" typeface="Estrangelo Edessa"/>
-        <a:font script="Syre" typeface="Estrangelo Edessa"/>
-        <a:font script="Sora" typeface="Nirmala UI"/>
-        <a:font script="Tale" typeface="Microsoft Tai Le"/>
-        <a:font script="Talu" typeface="Microsoft New Tai Lue"/>
-        <a:font script="Tfng" typeface="Ebrima"/>
-      </a:minorFont>
-    </a:fontScheme>
-    <a:fmtScheme name="Office">
-      <a:fillStyleLst>
-        <a:solidFill>
-          <a:schemeClr val="phClr"/>
-        </a:solidFill>
-        <a:gradFill rotWithShape="true">
-          <a:gsLst>
-            <a:gs pos="0">
-              <a:schemeClr val="phClr">
-                <a:lumMod val="110000"/>
-                <a:satMod val="105000"/>
-                <a:tint val="67000"/>
-              </a:schemeClr>
-            </a:gs>
-            <a:gs pos="50000">
-              <a:schemeClr val="phClr">
-                <a:lumMod val="105000"/>
-                <a:satMod val="103000"/>
-                <a:tint val="73000"/>
-              </a:schemeClr>
-            </a:gs>
-            <a:gs pos="100000">
-              <a:schemeClr val="phClr">
-                <a:lumMod val="105000"/>
-                <a:satMod val="109000"/>
-                <a:tint val="81000"/>
-              </a:schemeClr>
-            </a:gs>
-          </a:gsLst>
-          <a:lin ang="5400000" scaled="false"/>
-        </a:gradFill>
-        <a:gradFill rotWithShape="true">
-          <a:gsLst>
-            <a:gs pos="0">
-              <a:schemeClr val="phClr">
-                <a:satMod val="103000"/>
-                <a:lumMod val="102000"/>
-                <a:tint val="94000"/>
-              </a:schemeClr>
-            </a:gs>
-            <a:gs pos="50000">
-              <a:schemeClr val="phClr">
-                <a:satMod val="110000"/>
-                <a:lumMod val="100000"/>
-                <a:shade val="100000"/>
-              </a:schemeClr>
-            </a:gs>
-            <a:gs pos="100000">
-              <a:schemeClr val="phClr">
-                <a:lumMod val="99000"/>
-                <a:satMod val="120000"/>
-                <a:shade val="78000"/>
-              </a:schemeClr>
-            </a:gs>
-          </a:gsLst>
-          <a:lin ang="5400000" scaled="false"/>
-        </a:gradFill>
-      </a:fillStyleLst>
-      <a:lnStyleLst>
-        <a:ln w="6350" cap="flat" cmpd="sng" algn="ctr">
-          <a:solidFill>
-            <a:schemeClr val="phClr"/>
-          </a:solidFill>
-          <a:prstDash val="solid"/>
-          <a:miter lim="800000"/>
-        </a:ln>
-        <a:ln w="12700" cap="flat" cmpd="sng" algn="ctr">
-          <a:solidFill>
-            <a:schemeClr val="phClr"/>
-          </a:solidFill>
-          <a:prstDash val="solid"/>
-          <a:miter lim="800000"/>
-        </a:ln>
-        <a:ln w="19050" cap="flat" cmpd="sng" algn="ctr">
-          <a:solidFill>
-            <a:schemeClr val="phClr"/>
-          </a:solidFill>
-          <a:prstDash val="solid"/>
-          <a:miter lim="800000"/>
-        </a:ln>
-      </a:lnStyleLst>
-      <a:effectStyleLst>
-        <a:effectStyle>
-          <a:effectLst/>
-        </a:effectStyle>
-        <a:effectStyle>
-          <a:effectLst/>
-        </a:effectStyle>
-        <a:effectStyle>
-          <a:effectLst>
-            <a:outerShdw blurRad="57150" dist="19050" dir="5400000" algn="ctr" rotWithShape="false">
-              <a:srgbClr val="000000">
-                <a:alpha val="63000"/>
-              </a:srgbClr>
-            </a:outerShdw>
-          </a:effectLst>
-        </a:effectStyle>
-      </a:effectStyleLst>
-      <a:bgFillStyleLst>
-        <a:solidFill>
-          <a:schemeClr val="phClr"/>
-        </a:solidFill>
-        <a:solidFill>
-          <a:schemeClr val="phClr">
-            <a:tint val="95000"/>
-            <a:satMod val="170000"/>
-          </a:schemeClr>
-        </a:solidFill>
-        <a:gradFill rotWithShape="true">
-          <a:gsLst>
-            <a:gs pos="0">
-              <a:schemeClr val="phClr">
-                <a:tint val="93000"/>
-                <a:satMod val="150000"/>
-                <a:shade val="98000"/>
-                <a:lumMod val="102000"/>
-              </a:schemeClr>
-            </a:gs>
-            <a:gs pos="50000">
-              <a:schemeClr val="phClr">
-                <a:tint val="98000"/>
-                <a:satMod val="130000"/>
-                <a:shade val="90000"/>
-                <a:lumMod val="103000"/>
-              </a:schemeClr>
-            </a:gs>
-            <a:gs pos="100000">
-              <a:schemeClr val="phClr">
-                <a:shade val="63000"/>
-                <a:satMod val="120000"/>
-              </a:schemeClr>
-            </a:gs>
-          </a:gsLst>
-          <a:lin ang="5400000" scaled="false"/>
-        </a:gradFill>
-      </a:bgFillStyleLst>
-    </a:fmtScheme>
-  </a:themeElements>
-  <a:objectDefaults/>
-  <a:extraClrSchemeLst/>
-</a:theme>
 </file>
</xml_diff>

<commit_message>
Redesign the app (exact word-level explanations, 14-section index) and tighten the README
- app: newsroom design, predicted section in English and Kinyarwanda, exact per-word and
  per-n-gram contributions (centred logistic-regression weights x TF-IDF), all 14 sections
  always shown, CSS-only reveal animation; predictions unchanged (test macro-F1 0.587041)
- report section 7 and Figure 4 describe the new app; README rewritten as a one-page summary
</commit_message>
<xml_diff>
--- a/report/Kinyarwanda_News_Classification_Report.docx
+++ b/report/Kinyarwanda_News_Classification_Report.docx
@@ -11457,7 +11457,7 @@
         <w:jc w:val="both"/>
       </w:pPr>
       <w:r>
-        <w:t xml:space="preserve">The selected model is exposed through a web application built with Gradio (Abid et al., 2019). A user pastes a Kinyarwanda headline or article and receives the three most likely topics with their probabilities. The app loads the notebook’s saved pipeline (TF-IDF vectoriser and logistic regression in one file) together with its preprocessing settings, so inputs are processed exactly as in training. It rejects empty input and inputs shorter than three words, shows a low-confidence warning when the top probability is below 0.46, and offers example buttons drawn from real test articles, including a known failure and an English out-of-domain example. An “About the model” tab shows the metrics and the main limitations.</w:t>
+        <w:t xml:space="preserve">The selected model is exposed through a web application built with Gradio (Abid et al., 2019). A user pastes a Kinyarwanda headline or article and the app shows the predicted section in English and in Kinyarwanda (the dataset’s own label names) with a confidence meter, the next two most likely topics, the probabilities of all 14 sections, and an explanation of the prediction. The app loads the notebook’s saved pipeline (TF-IDF vectoriser and logistic regression in one file) together with its preprocessing settings, so inputs are processed exactly as in training. It rejects empty input and inputs shorter than three words, shows a low-confidence warning when the top probability is below 0.46 (Section 6.4), and offers example buttons drawn from real test articles, including a known failure and an English out-of-domain example. An “About the model” tab shows the metrics and the main limitations.</w:t>
       </w:r>
     </w:p>
     <w:p>
@@ -11466,7 +11466,123 @@
         <w:jc w:val="both"/>
       </w:pPr>
       <w:r>
-        <w:t xml:space="preserve">The app is hosted on Hugging Face Spaces (Figure 4). Because E1 is 10.8 MB and classifies an article in well under a millisecond, it needs no GPU. The free CPU tier was not available to this account, so the Space runs on the free ZeroGPU tier; the app declares the one GPU function that tier requires, but never calls it, and every prediction is computed on the CPU. Re-scoring the full official test set through the app’s own preprocessing and model reproduces E1’s macro-F1 (0.587) and accuracy (0.726) exactly, and the deployed Space returns the same probabilities as the local copy for every example and edge case.</w:t>
+        <w:rPr>
+          <w:b/>
+          <w:bCs/>
+        </w:rPr>
+        <w:t xml:space="preserve">Explaining each prediction.</w:t>
+      </w:r>
+      <w:r>
+        <w:t xml:space="preserve"> Because E1 is linear, the score of topic </w:t>
+      </w:r>
+      <w:r>
+        <w:rPr>
+          <w:i/>
+          <w:iCs/>
+        </w:rPr>
+        <w:t xml:space="preserve">k</w:t>
+      </w:r>
+      <w:r>
+        <w:t xml:space="preserve"> for a text is the sum, over the character n-grams </w:t>
+      </w:r>
+      <w:r>
+        <w:rPr>
+          <w:i/>
+          <w:iCs/>
+        </w:rPr>
+        <w:t xml:space="preserve">j</w:t>
+      </w:r>
+      <w:r>
+        <w:t xml:space="preserve"> it contains, of </w:t>
+      </w:r>
+      <w:r>
+        <w:rPr>
+          <w:i/>
+          <w:iCs/>
+        </w:rPr>
+        <w:t xml:space="preserve">x</w:t>
+      </w:r>
+      <w:r>
+        <w:t xml:space="preserve">ⱼ·</w:t>
+      </w:r>
+      <w:r>
+        <w:rPr>
+          <w:i/>
+          <w:iCs/>
+        </w:rPr>
+        <w:t xml:space="preserve">w</w:t>
+      </w:r>
+      <w:r>
+        <w:t xml:space="preserve">ₖⱼ, where </w:t>
+      </w:r>
+      <w:r>
+        <w:rPr>
+          <w:i/>
+          <w:iCs/>
+        </w:rPr>
+        <w:t xml:space="preserve">x</w:t>
+      </w:r>
+      <w:r>
+        <w:t xml:space="preserve">ⱼ is the n-gram’s TF-IDF weight and </w:t>
+      </w:r>
+      <w:r>
+        <w:rPr>
+          <w:i/>
+          <w:iCs/>
+        </w:rPr>
+        <w:t xml:space="preserve">w</w:t>
+      </w:r>
+      <w:r>
+        <w:t xml:space="preserve">ₖⱼ its logistic-regression coefficient, plus an intercept. The softmax is unchanged when the same amount is added to every topic, so each coefficient is centred on its mean over the 14 topics; a contribution then measures how much an n-gram separates topic </w:t>
+      </w:r>
+      <w:r>
+        <w:rPr>
+          <w:i/>
+          <w:iCs/>
+        </w:rPr>
+        <w:t xml:space="preserve">k</w:t>
+      </w:r>
+      <w:r>
+        <w:t xml:space="preserve"> from the others. Each n-gram’s contribution is shared equally among its occurrences and summed per word. The app highlights the words that push towards the predicted topic, underlines those that push against it, and lists the strongest n-grams. The word scores add up exactly to the model’s score margin for that topic; this was checked to within 10⁻¹⁴ on 300 full test articles. The explanation makes the errors in Section 6 visible: on the headline </w:t>
+      </w:r>
+      <w:r>
+        <w:rPr>
+          <w:i/>
+          <w:iCs/>
+        </w:rPr>
+        <w:t xml:space="preserve">Tombora yongeye guhuza Rayon Sports na AS Kigali</w:t>
+      </w:r>
+      <w:r>
+        <w:t xml:space="preserve"> (Table 6), only </w:t>
+      </w:r>
+      <w:r>
+        <w:rPr>
+          <w:i/>
+          <w:iCs/>
+        </w:rPr>
+        <w:t xml:space="preserve">Rayon</w:t>
+      </w:r>
+      <w:r>
+        <w:t xml:space="preserve"> and </w:t>
+      </w:r>
+      <w:r>
+        <w:rPr>
+          <w:i/>
+          <w:iCs/>
+        </w:rPr>
+        <w:t xml:space="preserve">Sports</w:t>
+      </w:r>
+      <w:r>
+        <w:t xml:space="preserve"> are highlighted, showing that the club name alone drives the sport prediction. For an English sentence, the app reports that the words carry almost no evidence and the prediction rests on the model’s topic priors.</w:t>
+      </w:r>
+    </w:p>
+    <w:p>
+      <w:pPr>
+        <w:spacing w:after="120" w:line="276"/>
+        <w:jc w:val="both"/>
+      </w:pPr>
+      <w:r>
+        <w:t xml:space="preserve">The app is hosted on Hugging Face Spaces (Figure 4). Because E1 is 10.8 MB and classifies an article in well under a millisecond, it needs no GPU; a full article, including its explanation, is processed in about 30 ms. The free CPU tier was not available to this account, so the Space runs on the free ZeroGPU tier; the app declares the one GPU function that tier requires, but never calls it, and every prediction is computed on the CPU. Re-scoring the full official test set through the app’s own preprocessing and model reproduces E1’s macro-F1 (0.587) and accuracy (0.726) exactly, and the deployed Space returns the same predictions as the local copy for every example and edge case.</w:t>
       </w:r>
     </w:p>
     <w:p>
@@ -11494,9 +11610,9 @@
       <w:r>
         <w:drawing>
           <wp:inline distT="0" distB="0" distL="0" distR="0">
-            <wp:extent cx="5667375" cy="2657475"/>
+            <wp:extent cx="5124450" cy="4324350"/>
             <wp:effectExtent t="0" r="0" b="0" l="0"/>
-            <wp:docPr id="1" name="09_app_screenshot.png" descr="Figure 4. The deployed app after classifying one of the built-in test-set examples: the three most likely topics with their probabilities, and the prediction time." title="Figure 4. The deployed app after classifying one of the buil"/>
+            <wp:docPr id="1" name="09_app_screenshot.png" descr="Figure 4. The deployed app after classifying a test-set headline: the predicted section with its Kinyarwanda name and confidence, the next most likely topics, and the explanation. Highlighted words pushed the prediction towards sport; the strongest character n-grams (pieces of *ikipe*, “team”) are listed with their contributions." title="Figure 4. The deployed app after classifying a test-set head"/>
             <wp:cNvGraphicFramePr>
               <a:graphicFrameLocks xmlns:a="http://schemas.openxmlformats.org/drawingml/2006/main" noChangeAspect="1"/>
             </wp:cNvGraphicFramePr>
@@ -11519,7 +11635,7 @@
                   <pic:spPr bwMode="auto">
                     <a:xfrm>
                       <a:off x="0" y="0"/>
-                      <a:ext cx="5667375" cy="2657475"/>
+                      <a:ext cx="5124450" cy="4324350"/>
                     </a:xfrm>
                     <a:prstGeom prst="rect">
                       <a:avLst/>
@@ -11542,7 +11658,23 @@
           <w:sz w:val="18"/>
           <w:szCs w:val="18"/>
         </w:rPr>
-        <w:t xml:space="preserve">Figure 4. The deployed app after classifying one of the built-in test-set examples: the three most likely topics with their probabilities, and the prediction time.</w:t>
+        <w:t xml:space="preserve">Figure 4. The deployed app after classifying a test-set headline: the predicted section with its Kinyarwanda name and confidence, the next most likely topics, and the explanation. Highlighted words pushed the prediction towards sport; the strongest character n-grams (pieces of </w:t>
+      </w:r>
+      <w:r>
+        <w:rPr>
+          <w:i/>
+          <w:iCs/>
+          <w:sz w:val="18"/>
+          <w:szCs w:val="18"/>
+        </w:rPr>
+        <w:t xml:space="preserve">ikipe</w:t>
+      </w:r>
+      <w:r>
+        <w:rPr>
+          <w:sz w:val="18"/>
+          <w:szCs w:val="18"/>
+        </w:rPr>
+        <w:t xml:space="preserve">, “team”) are listed with their contributions.</w:t>
       </w:r>
     </w:p>
     <w:p>

</xml_diff>

<commit_message>
Report: add the course name
</commit_message>
<xml_diff>
--- a/report/Kinyarwanda_News_Classification_Report.docx
+++ b/report/Kinyarwanda_News_Classification_Report.docx
@@ -49,13 +49,7 @@
         <w:jc w:val="center"/>
       </w:pPr>
       <w:r>
-        <w:rPr>
-          <w:b/>
-          <w:bCs/>
-          <w:highlight w:val="yellow"/>
-          <w:highlightCs w:val="yellow"/>
-        </w:rPr>
-        <w:t xml:space="preserve">[[TODO: course name / institution]]</w:t>
+        <w:t xml:space="preserve">Machine Learning Techniques I</w:t>
       </w:r>
     </w:p>
     <w:p>

</xml_diff>